<commit_message>
Added a changes in contract master data and termination template
</commit_message>
<xml_diff>
--- a/UmmAlQuwainContract.docx
+++ b/UmmAlQuwainContract.docx
@@ -300,6 +300,7 @@
       <w:r>
         <w:t xml:space="preserve">                                                                                                   (</w:t>
       </w:r>
+      <w:proofErr w:type="spellStart"/>
       <w:r>
         <w:rPr>
           <w:rStyle w:val="normaltextrun"/>
@@ -309,7 +310,43 @@
           <w:color w:val="000000"/>
           <w:shd w:val="clear" w:color="auto" w:fill="FFFFFF"/>
         </w:rPr>
-        <w:t>وﺣدة ﻋﻘﺎرﯾﺔ)</w:t>
+        <w:t>وﺣدة</w:t>
+      </w:r>
+      <w:proofErr w:type="spellEnd"/>
+      <w:r>
+        <w:rPr>
+          <w:rStyle w:val="normaltextrun"/>
+          <w:rFonts w:ascii="Arial" w:hAnsi="Arial" w:cs="Arial"/>
+          <w:b/>
+          <w:bCs/>
+          <w:color w:val="000000"/>
+          <w:shd w:val="clear" w:color="auto" w:fill="FFFFFF"/>
+        </w:rPr>
+        <w:t xml:space="preserve"> </w:t>
+      </w:r>
+      <w:proofErr w:type="spellStart"/>
+      <w:r>
+        <w:rPr>
+          <w:rStyle w:val="normaltextrun"/>
+          <w:rFonts w:ascii="Arial" w:hAnsi="Arial" w:cs="Arial"/>
+          <w:b/>
+          <w:bCs/>
+          <w:color w:val="000000"/>
+          <w:shd w:val="clear" w:color="auto" w:fill="FFFFFF"/>
+        </w:rPr>
+        <w:t>ﻋﻘﺎرﯾﺔ</w:t>
+      </w:r>
+      <w:proofErr w:type="spellEnd"/>
+      <w:r>
+        <w:rPr>
+          <w:rStyle w:val="normaltextrun"/>
+          <w:rFonts w:ascii="Arial" w:hAnsi="Arial" w:cs="Arial"/>
+          <w:b/>
+          <w:bCs/>
+          <w:color w:val="000000"/>
+          <w:shd w:val="clear" w:color="auto" w:fill="FFFFFF"/>
+        </w:rPr>
+        <w:t>)</w:t>
       </w:r>
     </w:p>
     <w:p>
@@ -395,6 +432,7 @@
               </w:rPr>
               <w:t xml:space="preserve"> </w:t>
             </w:r>
+            <w:proofErr w:type="spellStart"/>
             <w:r>
               <w:rPr>
                 <w:rFonts w:ascii="Arial" w:hAnsi="Arial" w:cs="Arial"/>
@@ -403,8 +441,31 @@
                 <w:sz w:val="24"/>
                 <w:szCs w:val="24"/>
               </w:rPr>
-              <w:t>بيانات المستأجر</w:t>
-            </w:r>
+              <w:t>بيانات</w:t>
+            </w:r>
+            <w:proofErr w:type="spellEnd"/>
+            <w:r>
+              <w:rPr>
+                <w:rFonts w:ascii="Arial" w:hAnsi="Arial" w:cs="Arial"/>
+                <w:b/>
+                <w:color w:val="2F5496" w:themeColor="accent1" w:themeShade="BF"/>
+                <w:sz w:val="24"/>
+                <w:szCs w:val="24"/>
+              </w:rPr>
+              <w:t xml:space="preserve"> </w:t>
+            </w:r>
+            <w:proofErr w:type="spellStart"/>
+            <w:r>
+              <w:rPr>
+                <w:rFonts w:ascii="Arial" w:hAnsi="Arial" w:cs="Arial"/>
+                <w:b/>
+                <w:color w:val="2F5496" w:themeColor="accent1" w:themeShade="BF"/>
+                <w:sz w:val="24"/>
+                <w:szCs w:val="24"/>
+              </w:rPr>
+              <w:t>المستأجر</w:t>
+            </w:r>
+            <w:proofErr w:type="spellEnd"/>
           </w:p>
         </w:tc>
       </w:tr>
@@ -430,14 +491,14 @@
         </w:tc>
         <w:sdt>
           <w:sdtPr>
-            <w:id w:val="-1419013929"/>
+            <w:alias w:val="#Nav: /TenancyContract/Customer_Name"/>
+            <w:tag w:val="#Nav: UmmAlQuwainContract/50115"/>
+            <w:id w:val="1859542993"/>
             <w:placeholder>
               <w:docPart w:val="DefaultPlaceholder_-1854013440"/>
             </w:placeholder>
             <w:dataBinding w:prefixMappings="xmlns:ns0='urn:microsoft-dynamics-nav/reports/UmmAlQuwainContract/50115/'" w:xpath="/ns0:NavWordReportXmlPart[1]/ns0:TenancyContract[1]/ns0:Customer_Name[1]" w:storeItemID="{DA66A6BB-3798-4A63-88A2-FBA3BC09A85B}"/>
             <w:text/>
-            <w:alias w:val="#Nav: /TenancyContract/Customer_Name"/>
-            <w:tag w:val="#Nav: UmmAlQuwainContract/50115"/>
           </w:sdtPr>
           <w:sdtContent>
             <w:tc>
@@ -475,9 +536,19 @@
             <w:pPr>
               <w:jc w:val="right"/>
             </w:pPr>
-            <w:r>
-              <w:t>اسم المستأجر</w:t>
-            </w:r>
+            <w:proofErr w:type="spellStart"/>
+            <w:r>
+              <w:t>اسم</w:t>
+            </w:r>
+            <w:proofErr w:type="spellEnd"/>
+            <w:r>
+              <w:t xml:space="preserve"> </w:t>
+            </w:r>
+            <w:proofErr w:type="spellStart"/>
+            <w:r>
+              <w:t>المستأجر</w:t>
+            </w:r>
+            <w:proofErr w:type="spellEnd"/>
           </w:p>
         </w:tc>
       </w:tr>
@@ -501,19 +572,37 @@
             </w:r>
           </w:p>
         </w:tc>
-        <w:tc>
-          <w:tcPr>
-            <w:tcW w:w="2835" w:type="dxa"/>
-            <w:tcBorders>
-              <w:top w:val="thinThickSmallGap" w:color="FFFFFF" w:themeColor="background1" w:sz="24" w:space="0"/>
-              <w:left w:val="thinThickSmallGap" w:color="FFFFFF" w:themeColor="background1" w:sz="24" w:space="0"/>
-              <w:bottom w:val="thinThickSmallGap" w:color="FFFFFF" w:themeColor="background1" w:sz="24" w:space="0"/>
-              <w:right w:val="thinThickSmallGap" w:color="FFFFFF" w:themeColor="background1" w:sz="24" w:space="0"/>
-            </w:tcBorders>
-            <w:shd w:val="clear" w:color="auto" w:fill="BCDDF6"/>
-          </w:tcPr>
-          <w:p/>
-        </w:tc>
+        <w:sdt>
+          <w:sdtPr>
+            <w:alias w:val="#Nav: /TenancyContract/Customer/Nationality"/>
+            <w:tag w:val="#Nav: UmmAlQuwainContract/50115"/>
+            <w:id w:val="456379698"/>
+            <w:placeholder>
+              <w:docPart w:val="DefaultPlaceholder_-1854013440"/>
+            </w:placeholder>
+            <w:dataBinding w:prefixMappings="xmlns:ns0='urn:microsoft-dynamics-nav/reports/UmmAlQuwainContract/50115/'" w:xpath="/ns0:NavWordReportXmlPart[1]/ns0:TenancyContract[1]/ns0:Customer[1]/ns0:Nationality[1]" w:storeItemID="{DA66A6BB-3798-4A63-88A2-FBA3BC09A85B}"/>
+            <w:text/>
+          </w:sdtPr>
+          <w:sdtContent>
+            <w:tc>
+              <w:tcPr>
+                <w:tcW w:w="2835" w:type="dxa"/>
+                <w:tcBorders>
+                  <w:top w:val="thinThickSmallGap" w:color="FFFFFF" w:themeColor="background1" w:sz="24" w:space="0"/>
+                  <w:left w:val="thinThickSmallGap" w:color="FFFFFF" w:themeColor="background1" w:sz="24" w:space="0"/>
+                  <w:bottom w:val="thinThickSmallGap" w:color="FFFFFF" w:themeColor="background1" w:sz="24" w:space="0"/>
+                  <w:right w:val="thinThickSmallGap" w:color="FFFFFF" w:themeColor="background1" w:sz="24" w:space="0"/>
+                </w:tcBorders>
+                <w:shd w:val="clear" w:color="auto" w:fill="BCDDF6"/>
+              </w:tcPr>
+              <w:p>
+                <w:r>
+                  <w:t>Nationality</w:t>
+                </w:r>
+              </w:p>
+            </w:tc>
+          </w:sdtContent>
+        </w:sdt>
         <w:tc>
           <w:tcPr>
             <w:tcW w:w="1304" w:type="dxa"/>
@@ -528,9 +617,11 @@
             <w:pPr>
               <w:jc w:val="right"/>
             </w:pPr>
+            <w:proofErr w:type="spellStart"/>
             <w:r>
               <w:t>الجنسية</w:t>
             </w:r>
+            <w:proofErr w:type="spellEnd"/>
           </w:p>
         </w:tc>
       </w:tr>
@@ -556,14 +647,14 @@
         </w:tc>
         <w:sdt>
           <w:sdtPr>
-            <w:id w:val="1049890377"/>
+            <w:alias w:val="#Nav: /TenancyContract/Emirates_ID"/>
+            <w:tag w:val="#Nav: UmmAlQuwainContract/50115"/>
+            <w:id w:val="-1461104627"/>
             <w:placeholder>
               <w:docPart w:val="DefaultPlaceholder_-1854013440"/>
             </w:placeholder>
             <w:dataBinding w:prefixMappings="xmlns:ns0='urn:microsoft-dynamics-nav/reports/UmmAlQuwainContract/50115/'" w:xpath="/ns0:NavWordReportXmlPart[1]/ns0:TenancyContract[1]/ns0:Emirates_ID[1]" w:storeItemID="{DA66A6BB-3798-4A63-88A2-FBA3BC09A85B}"/>
             <w:text/>
-            <w:alias w:val="#Nav: /TenancyContract/Emirates_ID"/>
-            <w:tag w:val="#Nav: UmmAlQuwainContract/50115"/>
           </w:sdtPr>
           <w:sdtContent>
             <w:tc>
@@ -601,9 +692,27 @@
             <w:pPr>
               <w:jc w:val="right"/>
             </w:pPr>
-            <w:r>
-              <w:t>رقم بطاقة الهوية</w:t>
-            </w:r>
+            <w:proofErr w:type="spellStart"/>
+            <w:r>
+              <w:t>رقم</w:t>
+            </w:r>
+            <w:proofErr w:type="spellEnd"/>
+            <w:r>
+              <w:t xml:space="preserve"> </w:t>
+            </w:r>
+            <w:proofErr w:type="spellStart"/>
+            <w:r>
+              <w:t>بطاقة</w:t>
+            </w:r>
+            <w:proofErr w:type="spellEnd"/>
+            <w:r>
+              <w:t xml:space="preserve"> </w:t>
+            </w:r>
+            <w:proofErr w:type="spellStart"/>
+            <w:r>
+              <w:t>الهوية</w:t>
+            </w:r>
+            <w:proofErr w:type="spellEnd"/>
           </w:p>
         </w:tc>
       </w:tr>
@@ -629,14 +738,14 @@
         </w:tc>
         <w:sdt>
           <w:sdtPr>
-            <w:id w:val="-596941277"/>
+            <w:alias w:val="#Nav: /TenancyContract/Contact_Number"/>
+            <w:tag w:val="#Nav: UmmAlQuwainContract/50115"/>
+            <w:id w:val="1984047282"/>
             <w:placeholder>
               <w:docPart w:val="DefaultPlaceholder_-1854013440"/>
             </w:placeholder>
             <w:dataBinding w:prefixMappings="xmlns:ns0='urn:microsoft-dynamics-nav/reports/UmmAlQuwainContract/50115/'" w:xpath="/ns0:NavWordReportXmlPart[1]/ns0:TenancyContract[1]/ns0:Contact_Number[1]" w:storeItemID="{DA66A6BB-3798-4A63-88A2-FBA3BC09A85B}"/>
             <w:text/>
-            <w:alias w:val="#Nav: /TenancyContract/Contact_Number"/>
-            <w:tag w:val="#Nav: UmmAlQuwainContract/50115"/>
           </w:sdtPr>
           <w:sdtContent>
             <w:tc>
@@ -674,9 +783,11 @@
             <w:pPr>
               <w:jc w:val="right"/>
             </w:pPr>
+            <w:proofErr w:type="spellStart"/>
             <w:r>
               <w:t>الهاتف</w:t>
             </w:r>
+            <w:proofErr w:type="spellEnd"/>
           </w:p>
         </w:tc>
       </w:tr>
@@ -727,9 +838,19 @@
             <w:pPr>
               <w:jc w:val="right"/>
             </w:pPr>
-            <w:r>
-              <w:t>صندوق البريد</w:t>
-            </w:r>
+            <w:proofErr w:type="spellStart"/>
+            <w:r>
+              <w:t>صندوق</w:t>
+            </w:r>
+            <w:proofErr w:type="spellEnd"/>
+            <w:r>
+              <w:t xml:space="preserve"> </w:t>
+            </w:r>
+            <w:proofErr w:type="spellStart"/>
+            <w:r>
+              <w:t>البريد</w:t>
+            </w:r>
+            <w:proofErr w:type="spellEnd"/>
           </w:p>
         </w:tc>
       </w:tr>
@@ -755,14 +876,14 @@
         </w:tc>
         <w:sdt>
           <w:sdtPr>
-            <w:id w:val="712708521"/>
+            <w:alias w:val="#Nav: /TenancyContract/Email_Address"/>
+            <w:tag w:val="#Nav: UmmAlQuwainContract/50115"/>
+            <w:id w:val="-501807719"/>
             <w:placeholder>
               <w:docPart w:val="DefaultPlaceholder_-1854013440"/>
             </w:placeholder>
             <w:dataBinding w:prefixMappings="xmlns:ns0='urn:microsoft-dynamics-nav/reports/UmmAlQuwainContract/50115/'" w:xpath="/ns0:NavWordReportXmlPart[1]/ns0:TenancyContract[1]/ns0:Email_Address[1]" w:storeItemID="{DA66A6BB-3798-4A63-88A2-FBA3BC09A85B}"/>
             <w:text/>
-            <w:alias w:val="#Nav: /TenancyContract/Email_Address"/>
-            <w:tag w:val="#Nav: UmmAlQuwainContract/50115"/>
           </w:sdtPr>
           <w:sdtContent>
             <w:tc>
@@ -800,9 +921,19 @@
             <w:pPr>
               <w:jc w:val="right"/>
             </w:pPr>
-            <w:r>
-              <w:t>البريد الإلكتروني</w:t>
-            </w:r>
+            <w:proofErr w:type="spellStart"/>
+            <w:r>
+              <w:t>البريد</w:t>
+            </w:r>
+            <w:proofErr w:type="spellEnd"/>
+            <w:r>
+              <w:t xml:space="preserve"> </w:t>
+            </w:r>
+            <w:proofErr w:type="spellStart"/>
+            <w:r>
+              <w:t>الإلكتروني</w:t>
+            </w:r>
+            <w:proofErr w:type="spellEnd"/>
           </w:p>
         </w:tc>
       </w:tr>
@@ -873,6 +1004,7 @@
               </w:rPr>
               <w:t xml:space="preserve"> </w:t>
             </w:r>
+            <w:proofErr w:type="spellStart"/>
             <w:r>
               <w:rPr>
                 <w:b/>
@@ -880,8 +1012,29 @@
                 <w:sz w:val="24"/>
                 <w:szCs w:val="24"/>
               </w:rPr>
-              <w:t>بيانات المؤجر</w:t>
-            </w:r>
+              <w:t>بيانات</w:t>
+            </w:r>
+            <w:proofErr w:type="spellEnd"/>
+            <w:r>
+              <w:rPr>
+                <w:b/>
+                <w:color w:val="2F5496" w:themeColor="accent1" w:themeShade="BF"/>
+                <w:sz w:val="24"/>
+                <w:szCs w:val="24"/>
+              </w:rPr>
+              <w:t xml:space="preserve"> </w:t>
+            </w:r>
+            <w:proofErr w:type="spellStart"/>
+            <w:r>
+              <w:rPr>
+                <w:b/>
+                <w:color w:val="2F5496" w:themeColor="accent1" w:themeShade="BF"/>
+                <w:sz w:val="24"/>
+                <w:szCs w:val="24"/>
+              </w:rPr>
+              <w:t>المؤجر</w:t>
+            </w:r>
+            <w:proofErr w:type="spellEnd"/>
           </w:p>
         </w:tc>
       </w:tr>
@@ -907,14 +1060,14 @@
         </w:tc>
         <w:sdt>
           <w:sdtPr>
-            <w:id w:val="-1697776564"/>
+            <w:alias w:val="#Nav: /TenancyContract/Owner_s_Name"/>
+            <w:tag w:val="#Nav: UmmAlQuwainContract/50115"/>
+            <w:id w:val="232986397"/>
             <w:placeholder>
               <w:docPart w:val="DefaultPlaceholder_-1854013440"/>
             </w:placeholder>
             <w:dataBinding w:prefixMappings="xmlns:ns0='urn:microsoft-dynamics-nav/reports/UmmAlQuwainContract/50115/'" w:xpath="/ns0:NavWordReportXmlPart[1]/ns0:TenancyContract[1]/ns0:Owner_s_Name[1]" w:storeItemID="{DA66A6BB-3798-4A63-88A2-FBA3BC09A85B}"/>
             <w:text/>
-            <w:alias w:val="#Nav: /TenancyContract/Owner_s_Name"/>
-            <w:tag w:val="#Nav: UmmAlQuwainContract/50115"/>
           </w:sdtPr>
           <w:sdtContent>
             <w:tc>
@@ -952,9 +1105,19 @@
             <w:pPr>
               <w:jc w:val="right"/>
             </w:pPr>
-            <w:r>
-              <w:t>اسم المالك</w:t>
-            </w:r>
+            <w:proofErr w:type="spellStart"/>
+            <w:r>
+              <w:t>اسم</w:t>
+            </w:r>
+            <w:proofErr w:type="spellEnd"/>
+            <w:r>
+              <w:t xml:space="preserve"> </w:t>
+            </w:r>
+            <w:proofErr w:type="spellStart"/>
+            <w:r>
+              <w:t>المالك</w:t>
+            </w:r>
+            <w:proofErr w:type="spellEnd"/>
           </w:p>
         </w:tc>
       </w:tr>
@@ -980,14 +1143,14 @@
         </w:tc>
         <w:sdt>
           <w:sdtPr>
-            <w:id w:val="-40208751"/>
+            <w:alias w:val="#Nav: /TenancyContract/Lessor_s_Phone"/>
+            <w:tag w:val="#Nav: UmmAlQuwainContract/50115"/>
+            <w:id w:val="1391452398"/>
             <w:placeholder>
               <w:docPart w:val="DefaultPlaceholder_-1854013440"/>
             </w:placeholder>
-            <w:dataBinding w:prefixMappings="xmlns:ns0='urn:microsoft-dynamics-nav/reports/UmmAlQuwainContract/50115/'" w:xpath="/ns0:NavWordReportXmlPart[1]/ns0:TenancyContract[1]/ns0:Lessor_s_Name[1]" w:storeItemID="{DA66A6BB-3798-4A63-88A2-FBA3BC09A85B}"/>
+            <w:dataBinding w:prefixMappings="xmlns:ns0='urn:microsoft-dynamics-nav/reports/UmmAlQuwainContract/50115/'" w:xpath="/ns0:NavWordReportXmlPart[1]/ns0:TenancyContract[1]/ns0:Lessor_s_Phone[1]" w:storeItemID="{DA66A6BB-3798-4A63-88A2-FBA3BC09A85B}"/>
             <w:text/>
-            <w:alias w:val="#Nav: /TenancyContract/Lessor_s_Name"/>
-            <w:tag w:val="#Nav: UmmAlQuwainContract/50115"/>
           </w:sdtPr>
           <w:sdtContent>
             <w:tc>
@@ -1004,7 +1167,7 @@
               <w:p>
                 <w:proofErr w:type="spellStart"/>
                 <w:r>
-                  <w:t>Lessor_s_Name</w:t>
+                  <w:t>Lessor_s_Phone</w:t>
                 </w:r>
                 <w:proofErr w:type="spellEnd"/>
               </w:p>
@@ -1025,9 +1188,19 @@
             <w:pPr>
               <w:jc w:val="right"/>
             </w:pPr>
-            <w:r>
-              <w:t>اسم المؤجر</w:t>
-            </w:r>
+            <w:proofErr w:type="spellStart"/>
+            <w:r>
+              <w:t>اسم</w:t>
+            </w:r>
+            <w:proofErr w:type="spellEnd"/>
+            <w:r>
+              <w:t xml:space="preserve"> </w:t>
+            </w:r>
+            <w:proofErr w:type="spellStart"/>
+            <w:r>
+              <w:t>المؤجر</w:t>
+            </w:r>
+            <w:proofErr w:type="spellEnd"/>
           </w:p>
         </w:tc>
       </w:tr>
@@ -1051,19 +1224,39 @@
             </w:r>
           </w:p>
         </w:tc>
-        <w:tc>
-          <w:tcPr>
-            <w:tcW w:w="3685" w:type="dxa"/>
-            <w:tcBorders>
-              <w:top w:val="single" w:color="FFFFFF" w:themeColor="background1" w:sz="24" w:space="0"/>
-              <w:left w:val="single" w:color="FFFFFF" w:themeColor="background1" w:sz="24" w:space="0"/>
-              <w:bottom w:val="single" w:color="FFFFFF" w:themeColor="background1" w:sz="24" w:space="0"/>
-              <w:right w:val="single" w:color="FFFFFF" w:themeColor="background1" w:sz="24" w:space="0"/>
-            </w:tcBorders>
-            <w:shd w:val="clear" w:color="auto" w:fill="BCDDF6"/>
-          </w:tcPr>
-          <w:p/>
-        </w:tc>
+        <w:sdt>
+          <w:sdtPr>
+            <w:alias w:val="#Nav: /TenancyContract/Lessor_s_Nationality"/>
+            <w:tag w:val="#Nav: UmmAlQuwainContract/50115"/>
+            <w:id w:val="-386720495"/>
+            <w:placeholder>
+              <w:docPart w:val="DefaultPlaceholder_-1854013440"/>
+            </w:placeholder>
+            <w:dataBinding w:prefixMappings="xmlns:ns0='urn:microsoft-dynamics-nav/reports/UmmAlQuwainContract/50115/'" w:xpath="/ns0:NavWordReportXmlPart[1]/ns0:TenancyContract[1]/ns0:Lessor_s_Nationality[1]" w:storeItemID="{DA66A6BB-3798-4A63-88A2-FBA3BC09A85B}"/>
+            <w:text/>
+          </w:sdtPr>
+          <w:sdtContent>
+            <w:tc>
+              <w:tcPr>
+                <w:tcW w:w="3685" w:type="dxa"/>
+                <w:tcBorders>
+                  <w:top w:val="single" w:color="FFFFFF" w:themeColor="background1" w:sz="24" w:space="0"/>
+                  <w:left w:val="single" w:color="FFFFFF" w:themeColor="background1" w:sz="24" w:space="0"/>
+                  <w:bottom w:val="single" w:color="FFFFFF" w:themeColor="background1" w:sz="24" w:space="0"/>
+                  <w:right w:val="single" w:color="FFFFFF" w:themeColor="background1" w:sz="24" w:space="0"/>
+                </w:tcBorders>
+                <w:shd w:val="clear" w:color="auto" w:fill="BCDDF6"/>
+              </w:tcPr>
+              <w:p>
+                <w:proofErr w:type="spellStart"/>
+                <w:r>
+                  <w:t>Lessor_s_Nationality</w:t>
+                </w:r>
+                <w:proofErr w:type="spellEnd"/>
+              </w:p>
+            </w:tc>
+          </w:sdtContent>
+        </w:sdt>
         <w:tc>
           <w:tcPr>
             <w:tcW w:w="1351" w:type="dxa"/>
@@ -1078,9 +1271,11 @@
             <w:pPr>
               <w:jc w:val="right"/>
             </w:pPr>
+            <w:proofErr w:type="spellStart"/>
             <w:r>
               <w:t>الجنسية</w:t>
             </w:r>
+            <w:proofErr w:type="spellEnd"/>
           </w:p>
         </w:tc>
       </w:tr>
@@ -1106,14 +1301,14 @@
         </w:tc>
         <w:sdt>
           <w:sdtPr>
-            <w:id w:val="-72819274"/>
+            <w:alias w:val="#Nav: /TenancyContract/Lessor_s_Emirates_ID"/>
+            <w:tag w:val="#Nav: UmmAlQuwainContract/50115"/>
+            <w:id w:val="1267118260"/>
             <w:placeholder>
               <w:docPart w:val="DefaultPlaceholder_-1854013440"/>
             </w:placeholder>
             <w:dataBinding w:prefixMappings="xmlns:ns0='urn:microsoft-dynamics-nav/reports/UmmAlQuwainContract/50115/'" w:xpath="/ns0:NavWordReportXmlPart[1]/ns0:TenancyContract[1]/ns0:Lessor_s_Emirates_ID[1]" w:storeItemID="{DA66A6BB-3798-4A63-88A2-FBA3BC09A85B}"/>
             <w:text/>
-            <w:alias w:val="#Nav: /TenancyContract/Lessor_s_Emirates_ID"/>
-            <w:tag w:val="#Nav: UmmAlQuwainContract/50115"/>
           </w:sdtPr>
           <w:sdtContent>
             <w:tc>
@@ -1151,9 +1346,27 @@
             <w:pPr>
               <w:jc w:val="right"/>
             </w:pPr>
-            <w:r>
-              <w:t>رقم بطاقة الهوية</w:t>
-            </w:r>
+            <w:proofErr w:type="spellStart"/>
+            <w:r>
+              <w:t>رقم</w:t>
+            </w:r>
+            <w:proofErr w:type="spellEnd"/>
+            <w:r>
+              <w:t xml:space="preserve"> </w:t>
+            </w:r>
+            <w:proofErr w:type="spellStart"/>
+            <w:r>
+              <w:t>بطاقة</w:t>
+            </w:r>
+            <w:proofErr w:type="spellEnd"/>
+            <w:r>
+              <w:t xml:space="preserve"> </w:t>
+            </w:r>
+            <w:proofErr w:type="spellStart"/>
+            <w:r>
+              <w:t>الهوية</w:t>
+            </w:r>
+            <w:proofErr w:type="spellEnd"/>
           </w:p>
         </w:tc>
       </w:tr>
@@ -1177,19 +1390,39 @@
             </w:r>
           </w:p>
         </w:tc>
-        <w:tc>
-          <w:tcPr>
-            <w:tcW w:w="3685" w:type="dxa"/>
-            <w:tcBorders>
-              <w:top w:val="single" w:color="FFFFFF" w:themeColor="background1" w:sz="24" w:space="0"/>
-              <w:left w:val="single" w:color="FFFFFF" w:themeColor="background1" w:sz="24" w:space="0"/>
-              <w:bottom w:val="single" w:color="FFFFFF" w:themeColor="background1" w:sz="24" w:space="0"/>
-              <w:right w:val="single" w:color="FFFFFF" w:themeColor="background1" w:sz="24" w:space="0"/>
-            </w:tcBorders>
-            <w:shd w:val="clear" w:color="auto" w:fill="BCDDF6"/>
-          </w:tcPr>
-          <w:p/>
-        </w:tc>
+        <w:sdt>
+          <w:sdtPr>
+            <w:alias w:val="#Nav: /TenancyContract/Lessor_s_Address"/>
+            <w:tag w:val="#Nav: UmmAlQuwainContract/50115"/>
+            <w:id w:val="-906068676"/>
+            <w:placeholder>
+              <w:docPart w:val="DefaultPlaceholder_-1854013440"/>
+            </w:placeholder>
+            <w:dataBinding w:prefixMappings="xmlns:ns0='urn:microsoft-dynamics-nav/reports/UmmAlQuwainContract/50115/'" w:xpath="/ns0:NavWordReportXmlPart[1]/ns0:TenancyContract[1]/ns0:Lessor_s_Address[1]" w:storeItemID="{DA66A6BB-3798-4A63-88A2-FBA3BC09A85B}"/>
+            <w:text/>
+          </w:sdtPr>
+          <w:sdtContent>
+            <w:tc>
+              <w:tcPr>
+                <w:tcW w:w="3685" w:type="dxa"/>
+                <w:tcBorders>
+                  <w:top w:val="single" w:color="FFFFFF" w:themeColor="background1" w:sz="24" w:space="0"/>
+                  <w:left w:val="single" w:color="FFFFFF" w:themeColor="background1" w:sz="24" w:space="0"/>
+                  <w:bottom w:val="single" w:color="FFFFFF" w:themeColor="background1" w:sz="24" w:space="0"/>
+                  <w:right w:val="single" w:color="FFFFFF" w:themeColor="background1" w:sz="24" w:space="0"/>
+                </w:tcBorders>
+                <w:shd w:val="clear" w:color="auto" w:fill="BCDDF6"/>
+              </w:tcPr>
+              <w:p>
+                <w:proofErr w:type="spellStart"/>
+                <w:r>
+                  <w:t>Lessor_s_Address</w:t>
+                </w:r>
+                <w:proofErr w:type="spellEnd"/>
+              </w:p>
+            </w:tc>
+          </w:sdtContent>
+        </w:sdt>
         <w:tc>
           <w:tcPr>
             <w:tcW w:w="1351" w:type="dxa"/>
@@ -1204,9 +1437,11 @@
             <w:pPr>
               <w:jc w:val="right"/>
             </w:pPr>
+            <w:proofErr w:type="spellStart"/>
             <w:r>
               <w:t>العنوان</w:t>
             </w:r>
+            <w:proofErr w:type="spellEnd"/>
           </w:p>
         </w:tc>
       </w:tr>
@@ -1232,14 +1467,14 @@
         </w:tc>
         <w:sdt>
           <w:sdtPr>
-            <w:id w:val="-1858735654"/>
+            <w:alias w:val="#Nav: /TenancyContract/Lessor_s_Phone"/>
+            <w:tag w:val="#Nav: UmmAlQuwainContract/50115"/>
+            <w:id w:val="-185676075"/>
             <w:placeholder>
               <w:docPart w:val="DefaultPlaceholder_-1854013440"/>
             </w:placeholder>
             <w:dataBinding w:prefixMappings="xmlns:ns0='urn:microsoft-dynamics-nav/reports/UmmAlQuwainContract/50115/'" w:xpath="/ns0:NavWordReportXmlPart[1]/ns0:TenancyContract[1]/ns0:Lessor_s_Phone[1]" w:storeItemID="{DA66A6BB-3798-4A63-88A2-FBA3BC09A85B}"/>
             <w:text/>
-            <w:alias w:val="#Nav: /TenancyContract/Lessor_s_Phone"/>
-            <w:tag w:val="#Nav: UmmAlQuwainContract/50115"/>
           </w:sdtPr>
           <w:sdtContent>
             <w:tc>
@@ -1277,9 +1512,11 @@
             <w:pPr>
               <w:jc w:val="right"/>
             </w:pPr>
+            <w:proofErr w:type="spellStart"/>
             <w:r>
               <w:t>الهاتف</w:t>
             </w:r>
+            <w:proofErr w:type="spellEnd"/>
           </w:p>
         </w:tc>
       </w:tr>
@@ -1298,6 +1535,7 @@
             </w:tcBorders>
           </w:tcPr>
           <w:p>
+            <w:proofErr w:type="spellStart"/>
             <w:r>
               <w:t>P.</w:t>
             </w:r>
@@ -1305,6 +1543,7 @@
             <w:r>
               <w:t>O.Box</w:t>
             </w:r>
+            <w:proofErr w:type="spellEnd"/>
             <w:proofErr w:type="gramEnd"/>
           </w:p>
         </w:tc>
@@ -1335,9 +1574,19 @@
             <w:pPr>
               <w:jc w:val="right"/>
             </w:pPr>
-            <w:r>
-              <w:t>صندوق البريد</w:t>
-            </w:r>
+            <w:proofErr w:type="spellStart"/>
+            <w:r>
+              <w:t>صندوق</w:t>
+            </w:r>
+            <w:proofErr w:type="spellEnd"/>
+            <w:r>
+              <w:t xml:space="preserve"> </w:t>
+            </w:r>
+            <w:proofErr w:type="spellStart"/>
+            <w:r>
+              <w:t>البريد</w:t>
+            </w:r>
+            <w:proofErr w:type="spellEnd"/>
           </w:p>
         </w:tc>
       </w:tr>
@@ -1363,14 +1612,14 @@
         </w:tc>
         <w:sdt>
           <w:sdtPr>
-            <w:id w:val="-826363116"/>
+            <w:alias w:val="#Nav: /TenancyContract/Lessor_s_Email"/>
+            <w:tag w:val="#Nav: UmmAlQuwainContract/50115"/>
+            <w:id w:val="-1197229218"/>
             <w:placeholder>
               <w:docPart w:val="DefaultPlaceholder_-1854013440"/>
             </w:placeholder>
             <w:dataBinding w:prefixMappings="xmlns:ns0='urn:microsoft-dynamics-nav/reports/UmmAlQuwainContract/50115/'" w:xpath="/ns0:NavWordReportXmlPart[1]/ns0:TenancyContract[1]/ns0:Lessor_s_Email[1]" w:storeItemID="{DA66A6BB-3798-4A63-88A2-FBA3BC09A85B}"/>
             <w:text/>
-            <w:alias w:val="#Nav: /TenancyContract/Lessor_s_Email"/>
-            <w:tag w:val="#Nav: UmmAlQuwainContract/50115"/>
           </w:sdtPr>
           <w:sdtContent>
             <w:tc>
@@ -1408,9 +1657,19 @@
             <w:pPr>
               <w:jc w:val="right"/>
             </w:pPr>
-            <w:r>
-              <w:t>البريد الإلكتروني</w:t>
-            </w:r>
+            <w:proofErr w:type="spellStart"/>
+            <w:r>
+              <w:t>البريد</w:t>
+            </w:r>
+            <w:proofErr w:type="spellEnd"/>
+            <w:r>
+              <w:t xml:space="preserve"> </w:t>
+            </w:r>
+            <w:proofErr w:type="spellStart"/>
+            <w:r>
+              <w:t>الإلكتروني</w:t>
+            </w:r>
+            <w:proofErr w:type="spellEnd"/>
           </w:p>
         </w:tc>
       </w:tr>
@@ -1540,14 +1799,34 @@
                 <w:highlight w:val="cyan"/>
               </w:rPr>
             </w:pPr>
+            <w:proofErr w:type="spellStart"/>
             <w:r>
               <w:rPr>
                 <w:b/>
                 <w:bCs/>
                 <w:color w:val="002060"/>
               </w:rPr>
-              <w:t>بيانات الإيجار</w:t>
-            </w:r>
+              <w:t>بيانات</w:t>
+            </w:r>
+            <w:proofErr w:type="spellEnd"/>
+            <w:r>
+              <w:rPr>
+                <w:b/>
+                <w:bCs/>
+                <w:color w:val="002060"/>
+              </w:rPr>
+              <w:t xml:space="preserve"> </w:t>
+            </w:r>
+            <w:proofErr w:type="spellStart"/>
+            <w:r>
+              <w:rPr>
+                <w:b/>
+                <w:bCs/>
+                <w:color w:val="002060"/>
+              </w:rPr>
+              <w:t>الإيجار</w:t>
+            </w:r>
+            <w:proofErr w:type="spellEnd"/>
           </w:p>
         </w:tc>
       </w:tr>
@@ -1571,19 +1850,39 @@
             </w:r>
           </w:p>
         </w:tc>
-        <w:tc>
-          <w:tcPr>
-            <w:tcW w:w="2835" w:type="dxa"/>
-            <w:tcBorders>
-              <w:top w:val="thinThickSmallGap" w:color="FFFFFF" w:themeColor="background1" w:sz="24" w:space="0"/>
-              <w:left w:val="thinThickSmallGap" w:color="FFFFFF" w:themeColor="background1" w:sz="24" w:space="0"/>
-              <w:bottom w:val="thinThickSmallGap" w:color="FFFFFF" w:themeColor="background1" w:sz="24" w:space="0"/>
-              <w:right w:val="thinThickSmallGap" w:color="FFFFFF" w:themeColor="background1" w:sz="24" w:space="0"/>
-            </w:tcBorders>
-            <w:shd w:val="clear" w:color="auto" w:fill="BCDDF6"/>
-          </w:tcPr>
-          <w:p/>
-        </w:tc>
+        <w:sdt>
+          <w:sdtPr>
+            <w:alias w:val="#Nav: /TenancyContract/Property_Classification"/>
+            <w:tag w:val="#Nav: UmmAlQuwainContract/50115"/>
+            <w:id w:val="-1387709460"/>
+            <w:placeholder>
+              <w:docPart w:val="DefaultPlaceholder_-1854013440"/>
+            </w:placeholder>
+            <w:dataBinding w:prefixMappings="xmlns:ns0='urn:microsoft-dynamics-nav/reports/UmmAlQuwainContract/50115/'" w:xpath="/ns0:NavWordReportXmlPart[1]/ns0:TenancyContract[1]/ns0:Property_Classification[1]" w:storeItemID="{DA66A6BB-3798-4A63-88A2-FBA3BC09A85B}"/>
+            <w:text/>
+          </w:sdtPr>
+          <w:sdtContent>
+            <w:tc>
+              <w:tcPr>
+                <w:tcW w:w="2835" w:type="dxa"/>
+                <w:tcBorders>
+                  <w:top w:val="thinThickSmallGap" w:color="FFFFFF" w:themeColor="background1" w:sz="24" w:space="0"/>
+                  <w:left w:val="thinThickSmallGap" w:color="FFFFFF" w:themeColor="background1" w:sz="24" w:space="0"/>
+                  <w:bottom w:val="thinThickSmallGap" w:color="FFFFFF" w:themeColor="background1" w:sz="24" w:space="0"/>
+                  <w:right w:val="thinThickSmallGap" w:color="FFFFFF" w:themeColor="background1" w:sz="24" w:space="0"/>
+                </w:tcBorders>
+                <w:shd w:val="clear" w:color="auto" w:fill="BCDDF6"/>
+              </w:tcPr>
+              <w:p>
+                <w:proofErr w:type="spellStart"/>
+                <w:r>
+                  <w:t>Property_Classification</w:t>
+                </w:r>
+                <w:proofErr w:type="spellEnd"/>
+              </w:p>
+            </w:tc>
+          </w:sdtContent>
+        </w:sdt>
         <w:tc>
           <w:tcPr>
             <w:tcW w:w="1276" w:type="dxa"/>
@@ -1598,9 +1897,27 @@
             <w:pPr>
               <w:jc w:val="right"/>
             </w:pPr>
-            <w:r>
-              <w:t>الغرض من الإيجار</w:t>
-            </w:r>
+            <w:proofErr w:type="spellStart"/>
+            <w:r>
+              <w:t>الغرض</w:t>
+            </w:r>
+            <w:proofErr w:type="spellEnd"/>
+            <w:r>
+              <w:t xml:space="preserve"> </w:t>
+            </w:r>
+            <w:proofErr w:type="spellStart"/>
+            <w:r>
+              <w:t>من</w:t>
+            </w:r>
+            <w:proofErr w:type="spellEnd"/>
+            <w:r>
+              <w:t xml:space="preserve"> </w:t>
+            </w:r>
+            <w:proofErr w:type="spellStart"/>
+            <w:r>
+              <w:t>الإيجار</w:t>
+            </w:r>
+            <w:proofErr w:type="spellEnd"/>
           </w:p>
         </w:tc>
       </w:tr>
@@ -1624,19 +1941,39 @@
             </w:r>
           </w:p>
         </w:tc>
-        <w:tc>
-          <w:tcPr>
-            <w:tcW w:w="2835" w:type="dxa"/>
-            <w:tcBorders>
-              <w:top w:val="thinThickSmallGap" w:color="FFFFFF" w:themeColor="background1" w:sz="24" w:space="0"/>
-              <w:left w:val="thinThickSmallGap" w:color="FFFFFF" w:themeColor="background1" w:sz="24" w:space="0"/>
-              <w:bottom w:val="thinThickSmallGap" w:color="FFFFFF" w:themeColor="background1" w:sz="24" w:space="0"/>
-              <w:right w:val="thinThickSmallGap" w:color="FFFFFF" w:themeColor="background1" w:sz="24" w:space="0"/>
-            </w:tcBorders>
-            <w:shd w:val="clear" w:color="auto" w:fill="BCDDF6"/>
-          </w:tcPr>
-          <w:p/>
-        </w:tc>
+        <w:sdt>
+          <w:sdtPr>
+            <w:alias w:val="#Nav: /TenancyContract/Contract_Tenor"/>
+            <w:tag w:val="#Nav: UmmAlQuwainContract/50115"/>
+            <w:id w:val="1805660624"/>
+            <w:placeholder>
+              <w:docPart w:val="DefaultPlaceholder_-1854013440"/>
+            </w:placeholder>
+            <w:dataBinding w:prefixMappings="xmlns:ns0='urn:microsoft-dynamics-nav/reports/UmmAlQuwainContract/50115/'" w:xpath="/ns0:NavWordReportXmlPart[1]/ns0:TenancyContract[1]/ns0:Contract_Tenor[1]" w:storeItemID="{DA66A6BB-3798-4A63-88A2-FBA3BC09A85B}"/>
+            <w:text/>
+          </w:sdtPr>
+          <w:sdtContent>
+            <w:tc>
+              <w:tcPr>
+                <w:tcW w:w="2835" w:type="dxa"/>
+                <w:tcBorders>
+                  <w:top w:val="thinThickSmallGap" w:color="FFFFFF" w:themeColor="background1" w:sz="24" w:space="0"/>
+                  <w:left w:val="thinThickSmallGap" w:color="FFFFFF" w:themeColor="background1" w:sz="24" w:space="0"/>
+                  <w:bottom w:val="thinThickSmallGap" w:color="FFFFFF" w:themeColor="background1" w:sz="24" w:space="0"/>
+                  <w:right w:val="thinThickSmallGap" w:color="FFFFFF" w:themeColor="background1" w:sz="24" w:space="0"/>
+                </w:tcBorders>
+                <w:shd w:val="clear" w:color="auto" w:fill="BCDDF6"/>
+              </w:tcPr>
+              <w:p>
+                <w:proofErr w:type="spellStart"/>
+                <w:r>
+                  <w:t>Contract_Tenor</w:t>
+                </w:r>
+                <w:proofErr w:type="spellEnd"/>
+              </w:p>
+            </w:tc>
+          </w:sdtContent>
+        </w:sdt>
         <w:tc>
           <w:tcPr>
             <w:tcW w:w="1276" w:type="dxa"/>
@@ -1651,9 +1988,19 @@
             <w:pPr>
               <w:jc w:val="right"/>
             </w:pPr>
-            <w:r>
-              <w:t>مدة الإيجار</w:t>
-            </w:r>
+            <w:proofErr w:type="spellStart"/>
+            <w:r>
+              <w:t>مدة</w:t>
+            </w:r>
+            <w:proofErr w:type="spellEnd"/>
+            <w:r>
+              <w:t xml:space="preserve"> </w:t>
+            </w:r>
+            <w:proofErr w:type="spellStart"/>
+            <w:r>
+              <w:t>الإيجار</w:t>
+            </w:r>
+            <w:proofErr w:type="spellEnd"/>
           </w:p>
         </w:tc>
       </w:tr>
@@ -1679,14 +2026,14 @@
         </w:tc>
         <w:sdt>
           <w:sdtPr>
-            <w:id w:val="126286690"/>
+            <w:alias w:val="#Nav: /TenancyContract/Contract_Start_Date"/>
+            <w:tag w:val="#Nav: UmmAlQuwainContract/50115"/>
+            <w:id w:val="1188957024"/>
             <w:placeholder>
               <w:docPart w:val="DefaultPlaceholder_-1854013440"/>
             </w:placeholder>
             <w:dataBinding w:prefixMappings="xmlns:ns0='urn:microsoft-dynamics-nav/reports/UmmAlQuwainContract/50115/'" w:xpath="/ns0:NavWordReportXmlPart[1]/ns0:TenancyContract[1]/ns0:Contract_Start_Date[1]" w:storeItemID="{DA66A6BB-3798-4A63-88A2-FBA3BC09A85B}"/>
             <w:text/>
-            <w:alias w:val="#Nav: /TenancyContract/Contract_Start_Date"/>
-            <w:tag w:val="#Nav: UmmAlQuwainContract/50115"/>
           </w:sdtPr>
           <w:sdtContent>
             <w:tc>
@@ -1724,9 +2071,35 @@
             <w:pPr>
               <w:jc w:val="right"/>
             </w:pPr>
-            <w:r>
-              <w:t>بداية تاريخ عقد الإيجار</w:t>
-            </w:r>
+            <w:proofErr w:type="spellStart"/>
+            <w:r>
+              <w:t>بداية</w:t>
+            </w:r>
+            <w:proofErr w:type="spellEnd"/>
+            <w:r>
+              <w:t xml:space="preserve"> </w:t>
+            </w:r>
+            <w:proofErr w:type="spellStart"/>
+            <w:r>
+              <w:t>تاريخ</w:t>
+            </w:r>
+            <w:proofErr w:type="spellEnd"/>
+            <w:r>
+              <w:t xml:space="preserve"> </w:t>
+            </w:r>
+            <w:proofErr w:type="spellStart"/>
+            <w:r>
+              <w:t>عقد</w:t>
+            </w:r>
+            <w:proofErr w:type="spellEnd"/>
+            <w:r>
+              <w:t xml:space="preserve"> </w:t>
+            </w:r>
+            <w:proofErr w:type="spellStart"/>
+            <w:r>
+              <w:t>الإيجار</w:t>
+            </w:r>
+            <w:proofErr w:type="spellEnd"/>
           </w:p>
         </w:tc>
       </w:tr>
@@ -1752,14 +2125,14 @@
         </w:tc>
         <w:sdt>
           <w:sdtPr>
-            <w:id w:val="-1426270689"/>
+            <w:alias w:val="#Nav: /TenancyContract/Contract_End_Date"/>
+            <w:tag w:val="#Nav: UmmAlQuwainContract/50115"/>
+            <w:id w:val="1535149266"/>
             <w:placeholder>
               <w:docPart w:val="DefaultPlaceholder_-1854013440"/>
             </w:placeholder>
             <w:dataBinding w:prefixMappings="xmlns:ns0='urn:microsoft-dynamics-nav/reports/UmmAlQuwainContract/50115/'" w:xpath="/ns0:NavWordReportXmlPart[1]/ns0:TenancyContract[1]/ns0:Contract_End_Date[1]" w:storeItemID="{DA66A6BB-3798-4A63-88A2-FBA3BC09A85B}"/>
             <w:text/>
-            <w:alias w:val="#Nav: /TenancyContract/Contract_End_Date"/>
-            <w:tag w:val="#Nav: UmmAlQuwainContract/50115"/>
           </w:sdtPr>
           <w:sdtContent>
             <w:tc>
@@ -1797,9 +2170,35 @@
             <w:pPr>
               <w:jc w:val="right"/>
             </w:pPr>
-            <w:r>
-              <w:t>نهاية تاريخ عقد الإيجار</w:t>
-            </w:r>
+            <w:proofErr w:type="spellStart"/>
+            <w:r>
+              <w:t>نهاية</w:t>
+            </w:r>
+            <w:proofErr w:type="spellEnd"/>
+            <w:r>
+              <w:t xml:space="preserve"> </w:t>
+            </w:r>
+            <w:proofErr w:type="spellStart"/>
+            <w:r>
+              <w:t>تاريخ</w:t>
+            </w:r>
+            <w:proofErr w:type="spellEnd"/>
+            <w:r>
+              <w:t xml:space="preserve"> </w:t>
+            </w:r>
+            <w:proofErr w:type="spellStart"/>
+            <w:r>
+              <w:t>عقد</w:t>
+            </w:r>
+            <w:proofErr w:type="spellEnd"/>
+            <w:r>
+              <w:t xml:space="preserve"> </w:t>
+            </w:r>
+            <w:proofErr w:type="spellStart"/>
+            <w:r>
+              <w:t>الإيجار</w:t>
+            </w:r>
+            <w:proofErr w:type="spellEnd"/>
           </w:p>
         </w:tc>
       </w:tr>
@@ -1820,6 +2219,97 @@
           <w:p>
             <w:r>
               <w:t>Rent Amount</w:t>
+            </w:r>
+          </w:p>
+        </w:tc>
+        <w:sdt>
+          <w:sdtPr>
+            <w:alias w:val="#Nav: /TenancyContract/Rent_Amount"/>
+            <w:tag w:val="#Nav: UmmAlQuwainContract/50115"/>
+            <w:id w:val="242147023"/>
+            <w:placeholder>
+              <w:docPart w:val="DefaultPlaceholder_-1854013440"/>
+            </w:placeholder>
+            <w:dataBinding w:prefixMappings="xmlns:ns0='urn:microsoft-dynamics-nav/reports/UmmAlQuwainContract/50115/'" w:xpath="/ns0:NavWordReportXmlPart[1]/ns0:TenancyContract[1]/ns0:Rent_Amount[1]" w:storeItemID="{DA66A6BB-3798-4A63-88A2-FBA3BC09A85B}"/>
+            <w:text/>
+          </w:sdtPr>
+          <w:sdtContent>
+            <w:tc>
+              <w:tcPr>
+                <w:tcW w:w="2835" w:type="dxa"/>
+                <w:tcBorders>
+                  <w:top w:val="thinThickSmallGap" w:color="FFFFFF" w:themeColor="background1" w:sz="24" w:space="0"/>
+                  <w:left w:val="thinThickSmallGap" w:color="FFFFFF" w:themeColor="background1" w:sz="24" w:space="0"/>
+                  <w:bottom w:val="thinThickSmallGap" w:color="FFFFFF" w:themeColor="background1" w:sz="24" w:space="0"/>
+                  <w:right w:val="thinThickSmallGap" w:color="FFFFFF" w:themeColor="background1" w:sz="24" w:space="0"/>
+                </w:tcBorders>
+                <w:shd w:val="clear" w:color="auto" w:fill="BCDDF6"/>
+              </w:tcPr>
+              <w:p>
+                <w:proofErr w:type="spellStart"/>
+                <w:r>
+                  <w:t>Rent_Amount</w:t>
+                </w:r>
+                <w:proofErr w:type="spellEnd"/>
+              </w:p>
+            </w:tc>
+          </w:sdtContent>
+        </w:sdt>
+        <w:tc>
+          <w:tcPr>
+            <w:tcW w:w="1276" w:type="dxa"/>
+            <w:tcBorders>
+              <w:top w:val="thinThickSmallGap" w:color="FFFFFF" w:themeColor="background1" w:sz="24" w:space="0"/>
+              <w:left w:val="thinThickSmallGap" w:color="FFFFFF" w:themeColor="background1" w:sz="24" w:space="0"/>
+              <w:bottom w:val="thinThickSmallGap" w:color="FFFFFF" w:themeColor="background1" w:sz="24" w:space="0"/>
+              <w:right w:val="thinThickSmallGap" w:color="FFFFFF" w:themeColor="background1" w:sz="24" w:space="0"/>
+            </w:tcBorders>
+          </w:tcPr>
+          <w:p>
+            <w:pPr>
+              <w:jc w:val="right"/>
+            </w:pPr>
+            <w:proofErr w:type="spellStart"/>
+            <w:r>
+              <w:t>قيمة</w:t>
+            </w:r>
+            <w:proofErr w:type="spellEnd"/>
+            <w:r>
+              <w:t xml:space="preserve"> </w:t>
+            </w:r>
+            <w:proofErr w:type="spellStart"/>
+            <w:r>
+              <w:t>عقد</w:t>
+            </w:r>
+            <w:proofErr w:type="spellEnd"/>
+            <w:r>
+              <w:t xml:space="preserve"> </w:t>
+            </w:r>
+            <w:proofErr w:type="spellStart"/>
+            <w:r>
+              <w:t>الإيجار</w:t>
+            </w:r>
+            <w:proofErr w:type="spellEnd"/>
+          </w:p>
+        </w:tc>
+      </w:tr>
+      <w:tr>
+        <w:trPr>
+          <w:trHeight w:val="124"/>
+        </w:trPr>
+        <w:tc>
+          <w:tcPr>
+            <w:tcW w:w="1418" w:type="dxa"/>
+            <w:tcBorders>
+              <w:top w:val="thinThickSmallGap" w:color="FFFFFF" w:themeColor="background1" w:sz="24" w:space="0"/>
+              <w:left w:val="thinThickSmallGap" w:color="FFFFFF" w:themeColor="background1" w:sz="24" w:space="0"/>
+              <w:bottom w:val="thinThickSmallGap" w:color="FFFFFF" w:themeColor="background1" w:sz="24" w:space="0"/>
+              <w:right w:val="thinThickSmallGap" w:color="FFFFFF" w:themeColor="background1" w:sz="24" w:space="0"/>
+            </w:tcBorders>
+          </w:tcPr>
+          <w:p>
+            <w:r>
+              <w:t>Insurance Amount</w:t>
             </w:r>
           </w:p>
         </w:tc>
@@ -1850,9 +2340,19 @@
             <w:pPr>
               <w:jc w:val="right"/>
             </w:pPr>
-            <w:r>
-              <w:t>قيمة عقد الإيجار</w:t>
-            </w:r>
+            <w:proofErr w:type="spellStart"/>
+            <w:r>
+              <w:t>مبلغ</w:t>
+            </w:r>
+            <w:proofErr w:type="spellEnd"/>
+            <w:r>
+              <w:t xml:space="preserve"> </w:t>
+            </w:r>
+            <w:proofErr w:type="spellStart"/>
+            <w:r>
+              <w:t>التأمين</w:t>
+            </w:r>
+            <w:proofErr w:type="spellEnd"/>
           </w:p>
         </w:tc>
       </w:tr>
@@ -1872,8 +2372,13 @@
           </w:tcPr>
           <w:p>
             <w:r>
-              <w:t>Insurance Amount</w:t>
-            </w:r>
+              <w:t xml:space="preserve">Property Area </w:t>
+            </w:r>
+            <w:proofErr w:type="spellStart"/>
+            <w:r>
+              <w:t>Sq.M</w:t>
+            </w:r>
+            <w:proofErr w:type="spellEnd"/>
           </w:p>
         </w:tc>
         <w:tc>
@@ -1887,7 +2392,49 @@
             </w:tcBorders>
             <w:shd w:val="clear" w:color="auto" w:fill="BCDDF6"/>
           </w:tcPr>
-          <w:p/>
+          <w:p>
+            <w:sdt>
+              <w:sdtPr>
+                <w:alias w:val="#Nav: /TenancyContract/Property_Size"/>
+                <w:tag w:val="#Nav: UmmAlQuwainContract/50115"/>
+                <w:id w:val="717096362"/>
+                <w:placeholder>
+                  <w:docPart w:val="DefaultPlaceholder_-1854013440"/>
+                </w:placeholder>
+                <w:dataBinding w:prefixMappings="xmlns:ns0='urn:microsoft-dynamics-nav/reports/UmmAlQuwainContract/50115/'" w:xpath="/ns0:NavWordReportXmlPart[1]/ns0:TenancyContract[1]/ns0:Property_Size[1]" w:storeItemID="{DA66A6BB-3798-4A63-88A2-FBA3BC09A85B}"/>
+                <w:text/>
+              </w:sdtPr>
+              <w:sdtContent>
+                <w:proofErr w:type="spellStart"/>
+                <w:r>
+                  <w:t>Property_Size</w:t>
+                </w:r>
+                <w:proofErr w:type="spellEnd"/>
+              </w:sdtContent>
+            </w:sdt>
+            <w:r>
+              <w:t xml:space="preserve"> </w:t>
+            </w:r>
+            <w:sdt>
+              <w:sdtPr>
+                <w:id w:val="1168525753"/>
+                <w:placeholder>
+                  <w:docPart w:val="DefaultPlaceholder_-1854013440"/>
+                </w:placeholder>
+                <w:dataBinding w:prefixMappings="xmlns:ns0='urn:microsoft-dynamics-nav/reports/UmmAlQuwainContract/50115/'" w:xpath="/ns0:NavWordReportXmlPart[1]/ns0:TenancyContract[1]/ns0:B_U_o_M[1]" w:storeItemID="{DA66A6BB-3798-4A63-88A2-FBA3BC09A85B}"/>
+                <w:text/>
+                <w:alias w:val="#Nav: /TenancyContract/B_U_o_M"/>
+                <w:tag w:val="#Nav: UmmAlQuwainContract/50115"/>
+              </w:sdtPr>
+              <w:sdtContent>
+                <w:proofErr w:type="spellStart"/>
+                <w:r>
+                  <w:t>B_U_o_M</w:t>
+                </w:r>
+                <w:proofErr w:type="spellEnd"/>
+              </w:sdtContent>
+            </w:sdt>
+          </w:p>
         </w:tc>
         <w:tc>
           <w:tcPr>
@@ -1903,62 +2450,19 @@
             <w:pPr>
               <w:jc w:val="right"/>
             </w:pPr>
-            <w:r>
-              <w:t>مبلغ التأمين</w:t>
-            </w:r>
-          </w:p>
-        </w:tc>
-      </w:tr>
-      <w:tr>
-        <w:trPr>
-          <w:trHeight w:val="124"/>
-        </w:trPr>
-        <w:tc>
-          <w:tcPr>
-            <w:tcW w:w="1418" w:type="dxa"/>
-            <w:tcBorders>
-              <w:top w:val="thinThickSmallGap" w:color="FFFFFF" w:themeColor="background1" w:sz="24" w:space="0"/>
-              <w:left w:val="thinThickSmallGap" w:color="FFFFFF" w:themeColor="background1" w:sz="24" w:space="0"/>
-              <w:bottom w:val="thinThickSmallGap" w:color="FFFFFF" w:themeColor="background1" w:sz="24" w:space="0"/>
-              <w:right w:val="thinThickSmallGap" w:color="FFFFFF" w:themeColor="background1" w:sz="24" w:space="0"/>
-            </w:tcBorders>
-          </w:tcPr>
-          <w:p>
-            <w:r>
-              <w:t>Property Area Sq.M</w:t>
-            </w:r>
-          </w:p>
-        </w:tc>
-        <w:tc>
-          <w:tcPr>
-            <w:tcW w:w="2835" w:type="dxa"/>
-            <w:tcBorders>
-              <w:top w:val="thinThickSmallGap" w:color="FFFFFF" w:themeColor="background1" w:sz="24" w:space="0"/>
-              <w:left w:val="thinThickSmallGap" w:color="FFFFFF" w:themeColor="background1" w:sz="24" w:space="0"/>
-              <w:bottom w:val="thinThickSmallGap" w:color="FFFFFF" w:themeColor="background1" w:sz="24" w:space="0"/>
-              <w:right w:val="thinThickSmallGap" w:color="FFFFFF" w:themeColor="background1" w:sz="24" w:space="0"/>
-            </w:tcBorders>
-            <w:shd w:val="clear" w:color="auto" w:fill="BCDDF6"/>
-          </w:tcPr>
-          <w:p/>
-        </w:tc>
-        <w:tc>
-          <w:tcPr>
-            <w:tcW w:w="1276" w:type="dxa"/>
-            <w:tcBorders>
-              <w:top w:val="thinThickSmallGap" w:color="FFFFFF" w:themeColor="background1" w:sz="24" w:space="0"/>
-              <w:left w:val="thinThickSmallGap" w:color="FFFFFF" w:themeColor="background1" w:sz="24" w:space="0"/>
-              <w:bottom w:val="thinThickSmallGap" w:color="FFFFFF" w:themeColor="background1" w:sz="24" w:space="0"/>
-              <w:right w:val="thinThickSmallGap" w:color="FFFFFF" w:themeColor="background1" w:sz="24" w:space="0"/>
-            </w:tcBorders>
-          </w:tcPr>
-          <w:p>
-            <w:pPr>
-              <w:jc w:val="right"/>
-            </w:pPr>
-            <w:r>
-              <w:t>مساحة العقار</w:t>
-            </w:r>
+            <w:proofErr w:type="spellStart"/>
+            <w:r>
+              <w:t>مساحة</w:t>
+            </w:r>
+            <w:proofErr w:type="spellEnd"/>
+            <w:r>
+              <w:t xml:space="preserve"> </w:t>
+            </w:r>
+            <w:proofErr w:type="spellStart"/>
+            <w:r>
+              <w:t>العقار</w:t>
+            </w:r>
+            <w:proofErr w:type="spellEnd"/>
           </w:p>
         </w:tc>
       </w:tr>
@@ -2050,14 +2554,52 @@
                 <w:szCs w:val="24"/>
               </w:rPr>
             </w:pPr>
+            <w:proofErr w:type="spellStart"/>
             <w:r>
               <w:rPr>
                 <w:b/>
                 <w:bCs/>
                 <w:color w:val="002060"/>
               </w:rPr>
-              <w:t>بيانات العين المؤجرة</w:t>
-            </w:r>
+              <w:t>بيانات</w:t>
+            </w:r>
+            <w:proofErr w:type="spellEnd"/>
+            <w:r>
+              <w:rPr>
+                <w:b/>
+                <w:bCs/>
+                <w:color w:val="002060"/>
+              </w:rPr>
+              <w:t xml:space="preserve"> </w:t>
+            </w:r>
+            <w:proofErr w:type="spellStart"/>
+            <w:r>
+              <w:rPr>
+                <w:b/>
+                <w:bCs/>
+                <w:color w:val="002060"/>
+              </w:rPr>
+              <w:t>العين</w:t>
+            </w:r>
+            <w:proofErr w:type="spellEnd"/>
+            <w:r>
+              <w:rPr>
+                <w:b/>
+                <w:bCs/>
+                <w:color w:val="002060"/>
+              </w:rPr>
+              <w:t xml:space="preserve"> </w:t>
+            </w:r>
+            <w:proofErr w:type="spellStart"/>
+            <w:r>
+              <w:rPr>
+                <w:b/>
+                <w:bCs/>
+                <w:color w:val="002060"/>
+              </w:rPr>
+              <w:t>المؤجرة</w:t>
+            </w:r>
+            <w:proofErr w:type="spellEnd"/>
           </w:p>
         </w:tc>
       </w:tr>
@@ -2076,6 +2618,9 @@
             </w:tcBorders>
           </w:tcPr>
           <w:p>
+            <w:r>
+              <w:t xml:space="preserve">Property </w:t>
+            </w:r>
             <w:r>
               <w:t>Area</w:t>
             </w:r>
@@ -2136,8 +2681,121 @@
           </w:tcPr>
           <w:p>
             <w:r>
-              <w:t>Property Unit No.</w:t>
-            </w:r>
+              <w:t>Unit No.</w:t>
+            </w:r>
+          </w:p>
+        </w:tc>
+        <w:sdt>
+          <w:sdtPr>
+            <w:alias w:val="#Nav: /TenancyContract/Unit_Number"/>
+            <w:tag w:val="#Nav: UmmAlQuwainContract/50115"/>
+            <w:id w:val="-799615887"/>
+            <w:placeholder>
+              <w:docPart w:val="DefaultPlaceholder_-1854013440"/>
+            </w:placeholder>
+            <w:dataBinding w:prefixMappings="xmlns:ns0='urn:microsoft-dynamics-nav/reports/UmmAlQuwainContract/50115/'" w:xpath="/ns0:NavWordReportXmlPart[1]/ns0:TenancyContract[1]/ns0:Unit_Number[1]" w:storeItemID="{DA66A6BB-3798-4A63-88A2-FBA3BC09A85B}"/>
+            <w:text/>
+          </w:sdtPr>
+          <w:sdtContent>
+            <w:tc>
+              <w:tcPr>
+                <w:tcW w:w="3686" w:type="dxa"/>
+                <w:gridSpan w:val="2"/>
+                <w:tcBorders>
+                  <w:top w:val="single" w:color="FFFFFF" w:themeColor="background1" w:sz="24" w:space="0"/>
+                  <w:left w:val="single" w:color="FFFFFF" w:themeColor="background1" w:sz="24" w:space="0"/>
+                  <w:bottom w:val="single" w:color="FFFFFF" w:themeColor="background1" w:sz="24" w:space="0"/>
+                  <w:right w:val="single" w:color="FFFFFF" w:themeColor="background1" w:sz="24" w:space="0"/>
+                </w:tcBorders>
+                <w:shd w:val="clear" w:color="auto" w:fill="BCDDF6"/>
+              </w:tcPr>
+              <w:p>
+                <w:proofErr w:type="spellStart"/>
+                <w:r>
+                  <w:t>Unit_Number</w:t>
+                </w:r>
+                <w:proofErr w:type="spellEnd"/>
+              </w:p>
+            </w:tc>
+          </w:sdtContent>
+        </w:sdt>
+        <w:tc>
+          <w:tcPr>
+            <w:tcW w:w="1417" w:type="dxa"/>
+            <w:tcBorders>
+              <w:top w:val="single" w:color="FFFFFF" w:themeColor="background1" w:sz="24" w:space="0"/>
+              <w:left w:val="single" w:color="FFFFFF" w:themeColor="background1" w:sz="24" w:space="0"/>
+              <w:bottom w:val="single" w:color="FFFFFF" w:themeColor="background1" w:sz="24" w:space="0"/>
+              <w:right w:val="single" w:color="FFFFFF" w:themeColor="background1" w:sz="24" w:space="0"/>
+            </w:tcBorders>
+          </w:tcPr>
+          <w:p>
+            <w:pPr>
+              <w:jc w:val="right"/>
+            </w:pPr>
+            <w:r>
+              <w:rPr>
+                <w:rFonts w:ascii="Microsoft Sans Serif" w:cs="Microsoft Sans Serif"/>
+                <w:w w:val="95"/>
+                <w:rtl/>
+              </w:rPr>
+              <w:t>رﻗم</w:t>
+            </w:r>
+            <w:r>
+              <w:rPr>
+                <w:rFonts w:ascii="Microsoft Sans Serif" w:cs="Microsoft Sans Serif"/>
+                <w:spacing w:val="1"/>
+                <w:rtl/>
+              </w:rPr>
+              <w:t xml:space="preserve"> </w:t>
+            </w:r>
+            <w:r>
+              <w:rPr>
+                <w:rFonts w:ascii="Microsoft Sans Serif" w:cs="Microsoft Sans Serif"/>
+                <w:w w:val="95"/>
+                <w:rtl/>
+              </w:rPr>
+              <w:t>اﻟوﺣدة</w:t>
+            </w:r>
+            <w:r>
+              <w:rPr>
+                <w:rFonts w:ascii="Microsoft Sans Serif" w:cs="Microsoft Sans Serif"/>
+                <w:spacing w:val="2"/>
+                <w:rtl/>
+              </w:rPr>
+              <w:t xml:space="preserve"> </w:t>
+            </w:r>
+            <w:r>
+              <w:rPr>
+                <w:rFonts w:ascii="Microsoft Sans Serif" w:cs="Microsoft Sans Serif"/>
+                <w:w w:val="95"/>
+                <w:rtl/>
+              </w:rPr>
+              <w:t>اﻟﻌﻘﺎرﯾﺔ</w:t>
+            </w:r>
+          </w:p>
+        </w:tc>
+      </w:tr>
+      <w:tr>
+        <w:trPr>
+          <w:trHeight w:val="339"/>
+        </w:trPr>
+        <w:tc>
+          <w:tcPr>
+            <w:tcW w:w="1276" w:type="dxa"/>
+            <w:tcBorders>
+              <w:top w:val="single" w:color="FFFFFF" w:themeColor="background1" w:sz="24" w:space="0"/>
+              <w:left w:val="single" w:color="FFFFFF" w:themeColor="background1" w:sz="24" w:space="0"/>
+              <w:bottom w:val="single" w:color="FFFFFF" w:themeColor="background1" w:sz="24" w:space="0"/>
+              <w:right w:val="single" w:color="FFFFFF" w:themeColor="background1" w:sz="24" w:space="0"/>
+            </w:tcBorders>
+          </w:tcPr>
+          <w:p>
+            <w:proofErr w:type="spellStart"/>
+            <w:r>
+              <w:t>Fewa</w:t>
+            </w:r>
+            <w:proofErr w:type="spellEnd"/>
           </w:p>
         </w:tc>
         <w:tc>
@@ -2171,7 +2829,7 @@
             <w:r>
               <w:rPr>
                 <w:rFonts w:ascii="Microsoft Sans Serif" w:cs="Microsoft Sans Serif"/>
-                <w:w w:val="95"/>
+                <w:w w:val="96"/>
                 <w:rtl/>
               </w:rPr>
               <w:t>رﻗم</w:t>
@@ -2179,7 +2837,6 @@
             <w:r>
               <w:rPr>
                 <w:rFonts w:ascii="Microsoft Sans Serif" w:cs="Microsoft Sans Serif"/>
-                <w:spacing w:val="1"/>
                 <w:rtl/>
               </w:rPr>
               <w:t xml:space="preserve"> </w:t>
@@ -2187,15 +2844,15 @@
             <w:r>
               <w:rPr>
                 <w:rFonts w:ascii="Microsoft Sans Serif" w:cs="Microsoft Sans Serif"/>
-                <w:w w:val="95"/>
-                <w:rtl/>
-              </w:rPr>
-              <w:t>اﻟوﺣدة</w:t>
+                <w:w w:val="96"/>
+                <w:rtl/>
+              </w:rPr>
+              <w:t>ﺣﺳﺎب</w:t>
             </w:r>
             <w:r>
               <w:rPr>
                 <w:rFonts w:ascii="Microsoft Sans Serif" w:cs="Microsoft Sans Serif"/>
-                <w:spacing w:val="2"/>
+                <w:spacing w:val="4"/>
                 <w:rtl/>
               </w:rPr>
               <w:t xml:space="preserve"> </w:t>
@@ -2203,10 +2860,87 @@
             <w:r>
               <w:rPr>
                 <w:rFonts w:ascii="Microsoft Sans Serif" w:cs="Microsoft Sans Serif"/>
-                <w:w w:val="95"/>
-                <w:rtl/>
-              </w:rPr>
-              <w:t>اﻟﻌﻘﺎرﯾﺔ</w:t>
+                <w:w w:val="96"/>
+                <w:rtl/>
+              </w:rPr>
+              <w:t>اﻟﻛﮭرﺑﺎء</w:t>
+            </w:r>
+          </w:p>
+        </w:tc>
+      </w:tr>
+      <w:tr>
+        <w:trPr>
+          <w:trHeight w:val="1701"/>
+        </w:trPr>
+        <w:tc>
+          <w:tcPr>
+            <w:tcW w:w="1276" w:type="dxa"/>
+            <w:tcBorders>
+              <w:top w:val="single" w:color="FFFFFF" w:themeColor="background1" w:sz="24" w:space="0"/>
+              <w:left w:val="single" w:color="FFFFFF" w:themeColor="background1" w:sz="24" w:space="0"/>
+              <w:bottom w:val="single" w:color="FFFFFF" w:themeColor="background1" w:sz="24" w:space="0"/>
+              <w:right w:val="single" w:color="FFFFFF" w:themeColor="background1" w:sz="24" w:space="0"/>
+            </w:tcBorders>
+          </w:tcPr>
+          <w:p>
+            <w:r>
+              <w:t>Address</w:t>
+            </w:r>
+          </w:p>
+        </w:tc>
+        <w:sdt>
+          <w:sdtPr>
+            <w:alias w:val="#Nav: /TenancyContract/Property_Registration/Address"/>
+            <w:tag w:val="#Nav: UmmAlQuwainContract/50115"/>
+            <w:id w:val="-1166631576"/>
+            <w:placeholder>
+              <w:docPart w:val="DefaultPlaceholder_-1854013440"/>
+            </w:placeholder>
+            <w:dataBinding w:prefixMappings="xmlns:ns0='urn:microsoft-dynamics-nav/reports/UmmAlQuwainContract/50115/'" w:xpath="/ns0:NavWordReportXmlPart[1]/ns0:TenancyContract[1]/ns0:Property_Registration[1]/ns0:Address[1]" w:storeItemID="{DA66A6BB-3798-4A63-88A2-FBA3BC09A85B}"/>
+            <w:text/>
+          </w:sdtPr>
+          <w:sdtContent>
+            <w:tc>
+              <w:tcPr>
+                <w:tcW w:w="3686" w:type="dxa"/>
+                <w:gridSpan w:val="2"/>
+                <w:tcBorders>
+                  <w:top w:val="single" w:color="FFFFFF" w:themeColor="background1" w:sz="24" w:space="0"/>
+                  <w:left w:val="single" w:color="FFFFFF" w:themeColor="background1" w:sz="24" w:space="0"/>
+                  <w:bottom w:val="single" w:color="FFFFFF" w:themeColor="background1" w:sz="24" w:space="0"/>
+                  <w:right w:val="single" w:color="FFFFFF" w:themeColor="background1" w:sz="24" w:space="0"/>
+                </w:tcBorders>
+                <w:shd w:val="clear" w:color="auto" w:fill="BCDDF6"/>
+              </w:tcPr>
+              <w:p>
+                <w:r>
+                  <w:t>Address</w:t>
+                </w:r>
+              </w:p>
+            </w:tc>
+          </w:sdtContent>
+        </w:sdt>
+        <w:tc>
+          <w:tcPr>
+            <w:tcW w:w="1417" w:type="dxa"/>
+            <w:tcBorders>
+              <w:top w:val="single" w:color="FFFFFF" w:themeColor="background1" w:sz="24" w:space="0"/>
+              <w:left w:val="single" w:color="FFFFFF" w:themeColor="background1" w:sz="24" w:space="0"/>
+              <w:bottom w:val="single" w:color="FFFFFF" w:themeColor="background1" w:sz="24" w:space="0"/>
+              <w:right w:val="single" w:color="FFFFFF" w:themeColor="background1" w:sz="24" w:space="0"/>
+            </w:tcBorders>
+          </w:tcPr>
+          <w:p>
+            <w:pPr>
+              <w:jc w:val="right"/>
+            </w:pPr>
+            <w:r>
+              <w:rPr>
+                <w:rFonts w:ascii="Microsoft Sans Serif" w:cs="Microsoft Sans Serif"/>
+                <w:w w:val="96"/>
+                <w:rtl/>
+              </w:rPr>
+              <w:t>اﻟﻌﻧوان</w:t>
             </w:r>
           </w:p>
         </w:tc>
@@ -2227,169 +2961,20 @@
           </w:tcPr>
           <w:p>
             <w:r>
-              <w:t>Fewa</w:t>
-            </w:r>
-          </w:p>
-        </w:tc>
-        <w:tc>
-          <w:tcPr>
-            <w:tcW w:w="3686" w:type="dxa"/>
-            <w:gridSpan w:val="2"/>
-            <w:tcBorders>
-              <w:top w:val="single" w:color="FFFFFF" w:themeColor="background1" w:sz="24" w:space="0"/>
-              <w:left w:val="single" w:color="FFFFFF" w:themeColor="background1" w:sz="24" w:space="0"/>
-              <w:bottom w:val="single" w:color="FFFFFF" w:themeColor="background1" w:sz="24" w:space="0"/>
-              <w:right w:val="single" w:color="FFFFFF" w:themeColor="background1" w:sz="24" w:space="0"/>
-            </w:tcBorders>
-            <w:shd w:val="clear" w:color="auto" w:fill="BCDDF6"/>
-          </w:tcPr>
-          <w:p/>
-        </w:tc>
-        <w:tc>
-          <w:tcPr>
-            <w:tcW w:w="1417" w:type="dxa"/>
-            <w:tcBorders>
-              <w:top w:val="single" w:color="FFFFFF" w:themeColor="background1" w:sz="24" w:space="0"/>
-              <w:left w:val="single" w:color="FFFFFF" w:themeColor="background1" w:sz="24" w:space="0"/>
-              <w:bottom w:val="single" w:color="FFFFFF" w:themeColor="background1" w:sz="24" w:space="0"/>
-              <w:right w:val="single" w:color="FFFFFF" w:themeColor="background1" w:sz="24" w:space="0"/>
-            </w:tcBorders>
-          </w:tcPr>
-          <w:p>
-            <w:pPr>
-              <w:jc w:val="right"/>
-            </w:pPr>
-            <w:r>
-              <w:rPr>
-                <w:rFonts w:ascii="Microsoft Sans Serif" w:cs="Microsoft Sans Serif"/>
-                <w:w w:val="96"/>
-                <w:rtl/>
-              </w:rPr>
-              <w:t>رﻗم</w:t>
-            </w:r>
-            <w:r>
-              <w:rPr>
-                <w:rFonts w:ascii="Microsoft Sans Serif" w:cs="Microsoft Sans Serif"/>
-                <w:rtl/>
-              </w:rPr>
-              <w:t xml:space="preserve"> </w:t>
-            </w:r>
-            <w:r>
-              <w:rPr>
-                <w:rFonts w:ascii="Microsoft Sans Serif" w:cs="Microsoft Sans Serif"/>
-                <w:w w:val="96"/>
-                <w:rtl/>
-              </w:rPr>
-              <w:t>ﺣﺳﺎب</w:t>
-            </w:r>
-            <w:r>
-              <w:rPr>
-                <w:rFonts w:ascii="Microsoft Sans Serif" w:cs="Microsoft Sans Serif"/>
-                <w:spacing w:val="4"/>
-                <w:rtl/>
-              </w:rPr>
-              <w:t xml:space="preserve"> </w:t>
-            </w:r>
-            <w:r>
-              <w:rPr>
-                <w:rFonts w:ascii="Microsoft Sans Serif" w:cs="Microsoft Sans Serif"/>
-                <w:w w:val="96"/>
-                <w:rtl/>
-              </w:rPr>
-              <w:t>اﻟﻛﮭرﺑﺎء</w:t>
-            </w:r>
-          </w:p>
-        </w:tc>
-      </w:tr>
-      <w:tr>
-        <w:trPr>
-          <w:trHeight w:val="1701"/>
-        </w:trPr>
-        <w:tc>
-          <w:tcPr>
-            <w:tcW w:w="1276" w:type="dxa"/>
-            <w:tcBorders>
-              <w:top w:val="single" w:color="FFFFFF" w:themeColor="background1" w:sz="24" w:space="0"/>
-              <w:left w:val="single" w:color="FFFFFF" w:themeColor="background1" w:sz="24" w:space="0"/>
-              <w:bottom w:val="single" w:color="FFFFFF" w:themeColor="background1" w:sz="24" w:space="0"/>
-              <w:right w:val="single" w:color="FFFFFF" w:themeColor="background1" w:sz="24" w:space="0"/>
-            </w:tcBorders>
-          </w:tcPr>
-          <w:p>
-            <w:r>
-              <w:t>Address</w:t>
-            </w:r>
-          </w:p>
-        </w:tc>
-        <w:tc>
-          <w:tcPr>
-            <w:tcW w:w="3686" w:type="dxa"/>
-            <w:gridSpan w:val="2"/>
-            <w:tcBorders>
-              <w:top w:val="single" w:color="FFFFFF" w:themeColor="background1" w:sz="24" w:space="0"/>
-              <w:left w:val="single" w:color="FFFFFF" w:themeColor="background1" w:sz="24" w:space="0"/>
-              <w:bottom w:val="single" w:color="FFFFFF" w:themeColor="background1" w:sz="24" w:space="0"/>
-              <w:right w:val="single" w:color="FFFFFF" w:themeColor="background1" w:sz="24" w:space="0"/>
-            </w:tcBorders>
-            <w:shd w:val="clear" w:color="auto" w:fill="BCDDF6"/>
-          </w:tcPr>
-          <w:p/>
-        </w:tc>
-        <w:tc>
-          <w:tcPr>
-            <w:tcW w:w="1417" w:type="dxa"/>
-            <w:tcBorders>
-              <w:top w:val="single" w:color="FFFFFF" w:themeColor="background1" w:sz="24" w:space="0"/>
-              <w:left w:val="single" w:color="FFFFFF" w:themeColor="background1" w:sz="24" w:space="0"/>
-              <w:bottom w:val="single" w:color="FFFFFF" w:themeColor="background1" w:sz="24" w:space="0"/>
-              <w:right w:val="single" w:color="FFFFFF" w:themeColor="background1" w:sz="24" w:space="0"/>
-            </w:tcBorders>
-          </w:tcPr>
-          <w:p>
-            <w:pPr>
-              <w:jc w:val="right"/>
-            </w:pPr>
-            <w:r>
-              <w:rPr>
-                <w:rFonts w:ascii="Microsoft Sans Serif" w:cs="Microsoft Sans Serif"/>
-                <w:w w:val="96"/>
-                <w:rtl/>
-              </w:rPr>
-              <w:t>اﻟﻌﻧوان</w:t>
-            </w:r>
-          </w:p>
-        </w:tc>
-      </w:tr>
-      <w:tr>
-        <w:trPr>
-          <w:trHeight w:val="339"/>
-        </w:trPr>
-        <w:tc>
-          <w:tcPr>
-            <w:tcW w:w="1276" w:type="dxa"/>
-            <w:tcBorders>
-              <w:top w:val="single" w:color="FFFFFF" w:themeColor="background1" w:sz="24" w:space="0"/>
-              <w:left w:val="single" w:color="FFFFFF" w:themeColor="background1" w:sz="24" w:space="0"/>
-              <w:bottom w:val="single" w:color="FFFFFF" w:themeColor="background1" w:sz="24" w:space="0"/>
-              <w:right w:val="single" w:color="FFFFFF" w:themeColor="background1" w:sz="24" w:space="0"/>
-            </w:tcBorders>
-          </w:tcPr>
-          <w:p>
-            <w:r>
               <w:t>Property Type</w:t>
             </w:r>
           </w:p>
         </w:tc>
         <w:sdt>
           <w:sdtPr>
-            <w:id w:val="973174790"/>
+            <w:alias w:val="#Nav: /TenancyContract/Property_Type"/>
+            <w:tag w:val="#Nav: UmmAlQuwainContract/50115"/>
+            <w:id w:val="-777558761"/>
             <w:placeholder>
               <w:docPart w:val="DefaultPlaceholder_-1854013440"/>
             </w:placeholder>
             <w:dataBinding w:prefixMappings="xmlns:ns0='urn:microsoft-dynamics-nav/reports/UmmAlQuwainContract/50115/'" w:xpath="/ns0:NavWordReportXmlPart[1]/ns0:TenancyContract[1]/ns0:Property_Type[1]" w:storeItemID="{DA66A6BB-3798-4A63-88A2-FBA3BC09A85B}"/>
             <w:text/>
-            <w:alias w:val="#Nav: /TenancyContract/Property_Type"/>
-            <w:tag w:val="#Nav: UmmAlQuwainContract/50115"/>
           </w:sdtPr>
           <w:sdtContent>
             <w:tc>
@@ -2477,14 +3062,14 @@
         </w:tc>
         <w:sdt>
           <w:sdtPr>
-            <w:id w:val="-1491779764"/>
+            <w:alias w:val="#Nav: /TenancyContract/Unit_Name"/>
+            <w:tag w:val="#Nav: UmmAlQuwainContract/50115"/>
+            <w:id w:val="1658493539"/>
             <w:placeholder>
               <w:docPart w:val="DefaultPlaceholder_-1854013440"/>
             </w:placeholder>
             <w:dataBinding w:prefixMappings="xmlns:ns0='urn:microsoft-dynamics-nav/reports/UmmAlQuwainContract/50115/'" w:xpath="/ns0:NavWordReportXmlPart[1]/ns0:TenancyContract[1]/ns0:Unit_Name[1]" w:storeItemID="{DA66A6BB-3798-4A63-88A2-FBA3BC09A85B}"/>
             <w:text/>
-            <w:alias w:val="#Nav: /TenancyContract/Unit_Name"/>
-            <w:tag w:val="#Nav: UmmAlQuwainContract/50115"/>
           </w:sdtPr>
           <w:sdtContent>
             <w:tc>
@@ -2572,14 +3157,14 @@
         </w:tc>
         <w:sdt>
           <w:sdtPr>
-            <w:id w:val="-1136783623"/>
+            <w:alias w:val="#Nav: /TenancyContract/Property_Name"/>
+            <w:tag w:val="#Nav: UmmAlQuwainContract/50115"/>
+            <w:id w:val="-958341028"/>
             <w:placeholder>
               <w:docPart w:val="DefaultPlaceholder_-1854013440"/>
             </w:placeholder>
             <w:dataBinding w:prefixMappings="xmlns:ns0='urn:microsoft-dynamics-nav/reports/UmmAlQuwainContract/50115/'" w:xpath="/ns0:NavWordReportXmlPart[1]/ns0:TenancyContract[1]/ns0:Property_Name[1]" w:storeItemID="{DA66A6BB-3798-4A63-88A2-FBA3BC09A85B}"/>
             <w:text/>
-            <w:alias w:val="#Nav: /TenancyContract/Property_Name"/>
-            <w:tag w:val="#Nav: UmmAlQuwainContract/50115"/>
           </w:sdtPr>
           <w:sdtContent>
             <w:tc>
@@ -2664,20 +3249,40 @@
             </w:r>
           </w:p>
         </w:tc>
-        <w:tc>
-          <w:tcPr>
-            <w:tcW w:w="3686" w:type="dxa"/>
-            <w:gridSpan w:val="2"/>
-            <w:tcBorders>
-              <w:top w:val="single" w:color="FFFFFF" w:themeColor="background1" w:sz="24" w:space="0"/>
-              <w:left w:val="single" w:color="FFFFFF" w:themeColor="background1" w:sz="24" w:space="0"/>
-              <w:bottom w:val="single" w:color="FFFFFF" w:themeColor="background1" w:sz="24" w:space="0"/>
-              <w:right w:val="single" w:color="FFFFFF" w:themeColor="background1" w:sz="24" w:space="0"/>
-            </w:tcBorders>
-            <w:shd w:val="clear" w:color="auto" w:fill="BCDDF6"/>
-          </w:tcPr>
-          <w:p/>
-        </w:tc>
+        <w:sdt>
+          <w:sdtPr>
+            <w:alias w:val="#Nav: /TenancyContract/Item/Floor_Number"/>
+            <w:tag w:val="#Nav: UmmAlQuwainContract/50115"/>
+            <w:id w:val="-2117895058"/>
+            <w:placeholder>
+              <w:docPart w:val="DefaultPlaceholder_-1854013440"/>
+            </w:placeholder>
+            <w:dataBinding w:prefixMappings="xmlns:ns0='urn:microsoft-dynamics-nav/reports/UmmAlQuwainContract/50115/'" w:xpath="/ns0:NavWordReportXmlPart[1]/ns0:TenancyContract[1]/ns0:Item[1]/ns0:Floor_Number[1]" w:storeItemID="{DA66A6BB-3798-4A63-88A2-FBA3BC09A85B}"/>
+            <w:text/>
+          </w:sdtPr>
+          <w:sdtContent>
+            <w:tc>
+              <w:tcPr>
+                <w:tcW w:w="3686" w:type="dxa"/>
+                <w:gridSpan w:val="2"/>
+                <w:tcBorders>
+                  <w:top w:val="single" w:color="FFFFFF" w:themeColor="background1" w:sz="24" w:space="0"/>
+                  <w:left w:val="single" w:color="FFFFFF" w:themeColor="background1" w:sz="24" w:space="0"/>
+                  <w:bottom w:val="single" w:color="FFFFFF" w:themeColor="background1" w:sz="24" w:space="0"/>
+                  <w:right w:val="single" w:color="FFFFFF" w:themeColor="background1" w:sz="24" w:space="0"/>
+                </w:tcBorders>
+                <w:shd w:val="clear" w:color="auto" w:fill="BCDDF6"/>
+              </w:tcPr>
+              <w:p>
+                <w:proofErr w:type="spellStart"/>
+                <w:r>
+                  <w:t>Floor_Number</w:t>
+                </w:r>
+                <w:proofErr w:type="spellEnd"/>
+              </w:p>
+            </w:tc>
+          </w:sdtContent>
+        </w:sdt>
         <w:tc>
           <w:tcPr>
             <w:tcW w:w="1417" w:type="dxa"/>
@@ -2739,20 +3344,40 @@
             </w:r>
           </w:p>
         </w:tc>
-        <w:tc>
-          <w:tcPr>
-            <w:tcW w:w="3686" w:type="dxa"/>
-            <w:gridSpan w:val="2"/>
-            <w:tcBorders>
-              <w:top w:val="single" w:color="FFFFFF" w:themeColor="background1" w:sz="24" w:space="0"/>
-              <w:left w:val="single" w:color="FFFFFF" w:themeColor="background1" w:sz="24" w:space="0"/>
-              <w:bottom w:val="single" w:color="FFFFFF" w:themeColor="background1" w:sz="24" w:space="0"/>
-              <w:right w:val="single" w:color="FFFFFF" w:themeColor="background1" w:sz="24" w:space="0"/>
-            </w:tcBorders>
-            <w:shd w:val="clear" w:color="auto" w:fill="BCDDF6"/>
-          </w:tcPr>
-          <w:p/>
-        </w:tc>
+        <w:sdt>
+          <w:sdtPr>
+            <w:alias w:val="#Nav: /TenancyContract/Unit_Number"/>
+            <w:tag w:val="#Nav: UmmAlQuwainContract/50115"/>
+            <w:id w:val="1595511970"/>
+            <w:placeholder>
+              <w:docPart w:val="DefaultPlaceholder_-1854013440"/>
+            </w:placeholder>
+            <w:dataBinding w:prefixMappings="xmlns:ns0='urn:microsoft-dynamics-nav/reports/UmmAlQuwainContract/50115/'" w:xpath="/ns0:NavWordReportXmlPart[1]/ns0:TenancyContract[1]/ns0:Unit_Number[1]" w:storeItemID="{DA66A6BB-3798-4A63-88A2-FBA3BC09A85B}"/>
+            <w:text/>
+          </w:sdtPr>
+          <w:sdtContent>
+            <w:tc>
+              <w:tcPr>
+                <w:tcW w:w="3686" w:type="dxa"/>
+                <w:gridSpan w:val="2"/>
+                <w:tcBorders>
+                  <w:top w:val="single" w:color="FFFFFF" w:themeColor="background1" w:sz="24" w:space="0"/>
+                  <w:left w:val="single" w:color="FFFFFF" w:themeColor="background1" w:sz="24" w:space="0"/>
+                  <w:bottom w:val="single" w:color="FFFFFF" w:themeColor="background1" w:sz="24" w:space="0"/>
+                  <w:right w:val="single" w:color="FFFFFF" w:themeColor="background1" w:sz="24" w:space="0"/>
+                </w:tcBorders>
+                <w:shd w:val="clear" w:color="auto" w:fill="BCDDF6"/>
+              </w:tcPr>
+              <w:p>
+                <w:proofErr w:type="spellStart"/>
+                <w:r>
+                  <w:t>Unit_Number</w:t>
+                </w:r>
+                <w:proofErr w:type="spellEnd"/>
+              </w:p>
+            </w:tc>
+          </w:sdtContent>
+        </w:sdt>
         <w:tc>
           <w:tcPr>
             <w:tcW w:w="1417" w:type="dxa"/>
@@ -2880,7 +3505,7 @@
               </wp:anchor>
             </w:drawing>
           </mc:Choice>
-          <mc:Fallback>
+          <mc:Fallback xmlns:a="http://schemas.openxmlformats.org/drawingml/2006/main" xmlns:pic="http://schemas.openxmlformats.org/drawingml/2006/picture">
             <w:pict>
               <v:line id="Straight Connector 15" style="position:absolute;z-index:251666432;visibility:visible;mso-wrap-style:square;mso-wrap-distance-left:9pt;mso-wrap-distance-top:0;mso-wrap-distance-right:9pt;mso-wrap-distance-bottom:0;mso-position-horizontal:absolute;mso-position-horizontal-relative:text;mso-position-vertical:absolute;mso-position-vertical-relative:text" o:spid="_x0000_s1026" strokecolor="#4472c4 [3204]" strokeweight=".5pt" o:gfxdata="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" from="0,19.1pt" to="612.5pt,19.6pt" w14:anchorId="7D73463F">
                 <v:stroke joinstyle="miter"/>
@@ -3958,7 +4583,7 @@
               </wp:anchor>
             </w:drawing>
           </mc:Choice>
-          <mc:Fallback>
+          <mc:Fallback xmlns:a="http://schemas.openxmlformats.org/drawingml/2006/main" xmlns:pic="http://schemas.openxmlformats.org/drawingml/2006/picture">
             <w:pict>
               <v:line id="Straight Connector 74946966" style="position:absolute;z-index:251667456;visibility:visible;mso-wrap-style:square;mso-wrap-distance-left:9pt;mso-wrap-distance-top:0;mso-wrap-distance-right:9pt;mso-wrap-distance-bottom:0;mso-position-horizontal:absolute;mso-position-horizontal-relative:text;mso-position-vertical:absolute;mso-position-vertical-relative:text" o:spid="_x0000_s1026" strokecolor="#4472c4 [3204]" strokeweight=".5pt" o:gfxdata="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" from="0,171.7pt" to="612.5pt,172.2pt" w14:anchorId="51C7FC15">
                 <v:stroke joinstyle="miter"/>
@@ -4527,7 +5152,7 @@
                     </wp:anchor>
                   </w:drawing>
                 </mc:Choice>
-                <mc:Fallback>
+                <mc:Fallback xmlns:a="http://schemas.openxmlformats.org/drawingml/2006/main" xmlns:pic="http://schemas.openxmlformats.org/drawingml/2006/picture">
                   <w:pict>
                     <v:line id="Straight Connector 410425054" style="position:absolute;z-index:251668480;visibility:visible;mso-wrap-style:square;mso-wrap-distance-left:9pt;mso-wrap-distance-top:0;mso-wrap-distance-right:9pt;mso-wrap-distance-bottom:0;mso-position-horizontal:absolute;mso-position-horizontal-relative:text;mso-position-vertical:absolute;mso-position-vertical-relative:text" o:spid="_x0000_s1026" strokecolor="#4472c4 [3204]" strokeweight=".5pt" o:gfxdata="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" from="-8.75pt,30.95pt" to="603.75pt,31.45pt" w14:anchorId="543231CE">
                       <v:stroke joinstyle="miter"/>
@@ -4557,6 +5182,7 @@
                 <w:color w:val="0D0D0D" w:themeColor="text1" w:themeTint="F2"/>
               </w:rPr>
             </w:pPr>
+            <w:proofErr w:type="spellStart"/>
             <w:r>
               <w:rPr>
                 <w:bCs/>
@@ -4571,14 +5197,273 @@
                 <w:sz w:val="20"/>
                 <w:szCs w:val="20"/>
               </w:rPr>
-              <w:t xml:space="preserve">موجب </w:t>
-            </w:r>
-            <w:r>
-              <w:rPr>
-                <w:bCs/>
-                <w:color w:val="0D0D0D" w:themeColor="text1" w:themeTint="F2"/>
-              </w:rPr>
-              <w:t>هذا العقد يقر الطرف الثاني بأنه قد قام بمعاينة العقار المؤجر و أنه قد قبله بحالته الراهنة.</w:t>
+              <w:t>موجب</w:t>
+            </w:r>
+            <w:proofErr w:type="spellEnd"/>
+            <w:r>
+              <w:rPr>
+                <w:bCs/>
+                <w:color w:val="0D0D0D" w:themeColor="text1" w:themeTint="F2"/>
+                <w:sz w:val="20"/>
+                <w:szCs w:val="20"/>
+              </w:rPr>
+              <w:t xml:space="preserve"> </w:t>
+            </w:r>
+            <w:proofErr w:type="spellStart"/>
+            <w:r>
+              <w:rPr>
+                <w:bCs/>
+                <w:color w:val="0D0D0D" w:themeColor="text1" w:themeTint="F2"/>
+              </w:rPr>
+              <w:t>هذا</w:t>
+            </w:r>
+            <w:proofErr w:type="spellEnd"/>
+            <w:r>
+              <w:rPr>
+                <w:bCs/>
+                <w:color w:val="0D0D0D" w:themeColor="text1" w:themeTint="F2"/>
+              </w:rPr>
+              <w:t xml:space="preserve"> </w:t>
+            </w:r>
+            <w:proofErr w:type="spellStart"/>
+            <w:r>
+              <w:rPr>
+                <w:bCs/>
+                <w:color w:val="0D0D0D" w:themeColor="text1" w:themeTint="F2"/>
+              </w:rPr>
+              <w:t>العقد</w:t>
+            </w:r>
+            <w:proofErr w:type="spellEnd"/>
+            <w:r>
+              <w:rPr>
+                <w:bCs/>
+                <w:color w:val="0D0D0D" w:themeColor="text1" w:themeTint="F2"/>
+              </w:rPr>
+              <w:t xml:space="preserve"> </w:t>
+            </w:r>
+            <w:proofErr w:type="spellStart"/>
+            <w:r>
+              <w:rPr>
+                <w:bCs/>
+                <w:color w:val="0D0D0D" w:themeColor="text1" w:themeTint="F2"/>
+              </w:rPr>
+              <w:t>يقر</w:t>
+            </w:r>
+            <w:proofErr w:type="spellEnd"/>
+            <w:r>
+              <w:rPr>
+                <w:bCs/>
+                <w:color w:val="0D0D0D" w:themeColor="text1" w:themeTint="F2"/>
+              </w:rPr>
+              <w:t xml:space="preserve"> </w:t>
+            </w:r>
+            <w:proofErr w:type="spellStart"/>
+            <w:r>
+              <w:rPr>
+                <w:bCs/>
+                <w:color w:val="0D0D0D" w:themeColor="text1" w:themeTint="F2"/>
+              </w:rPr>
+              <w:t>الطرف</w:t>
+            </w:r>
+            <w:proofErr w:type="spellEnd"/>
+            <w:r>
+              <w:rPr>
+                <w:bCs/>
+                <w:color w:val="0D0D0D" w:themeColor="text1" w:themeTint="F2"/>
+              </w:rPr>
+              <w:t xml:space="preserve"> </w:t>
+            </w:r>
+            <w:proofErr w:type="spellStart"/>
+            <w:r>
+              <w:rPr>
+                <w:bCs/>
+                <w:color w:val="0D0D0D" w:themeColor="text1" w:themeTint="F2"/>
+              </w:rPr>
+              <w:t>الثاني</w:t>
+            </w:r>
+            <w:proofErr w:type="spellEnd"/>
+            <w:r>
+              <w:rPr>
+                <w:bCs/>
+                <w:color w:val="0D0D0D" w:themeColor="text1" w:themeTint="F2"/>
+              </w:rPr>
+              <w:t xml:space="preserve"> </w:t>
+            </w:r>
+            <w:proofErr w:type="spellStart"/>
+            <w:r>
+              <w:rPr>
+                <w:bCs/>
+                <w:color w:val="0D0D0D" w:themeColor="text1" w:themeTint="F2"/>
+              </w:rPr>
+              <w:t>بأنه</w:t>
+            </w:r>
+            <w:proofErr w:type="spellEnd"/>
+            <w:r>
+              <w:rPr>
+                <w:bCs/>
+                <w:color w:val="0D0D0D" w:themeColor="text1" w:themeTint="F2"/>
+              </w:rPr>
+              <w:t xml:space="preserve"> </w:t>
+            </w:r>
+            <w:proofErr w:type="spellStart"/>
+            <w:r>
+              <w:rPr>
+                <w:bCs/>
+                <w:color w:val="0D0D0D" w:themeColor="text1" w:themeTint="F2"/>
+              </w:rPr>
+              <w:t>قد</w:t>
+            </w:r>
+            <w:proofErr w:type="spellEnd"/>
+            <w:r>
+              <w:rPr>
+                <w:bCs/>
+                <w:color w:val="0D0D0D" w:themeColor="text1" w:themeTint="F2"/>
+              </w:rPr>
+              <w:t xml:space="preserve"> </w:t>
+            </w:r>
+            <w:proofErr w:type="spellStart"/>
+            <w:r>
+              <w:rPr>
+                <w:bCs/>
+                <w:color w:val="0D0D0D" w:themeColor="text1" w:themeTint="F2"/>
+              </w:rPr>
+              <w:t>قام</w:t>
+            </w:r>
+            <w:proofErr w:type="spellEnd"/>
+            <w:r>
+              <w:rPr>
+                <w:bCs/>
+                <w:color w:val="0D0D0D" w:themeColor="text1" w:themeTint="F2"/>
+              </w:rPr>
+              <w:t xml:space="preserve"> </w:t>
+            </w:r>
+            <w:proofErr w:type="spellStart"/>
+            <w:r>
+              <w:rPr>
+                <w:bCs/>
+                <w:color w:val="0D0D0D" w:themeColor="text1" w:themeTint="F2"/>
+              </w:rPr>
+              <w:t>بمعاينة</w:t>
+            </w:r>
+            <w:proofErr w:type="spellEnd"/>
+            <w:r>
+              <w:rPr>
+                <w:bCs/>
+                <w:color w:val="0D0D0D" w:themeColor="text1" w:themeTint="F2"/>
+              </w:rPr>
+              <w:t xml:space="preserve"> </w:t>
+            </w:r>
+            <w:proofErr w:type="spellStart"/>
+            <w:r>
+              <w:rPr>
+                <w:bCs/>
+                <w:color w:val="0D0D0D" w:themeColor="text1" w:themeTint="F2"/>
+              </w:rPr>
+              <w:t>العقار</w:t>
+            </w:r>
+            <w:proofErr w:type="spellEnd"/>
+            <w:r>
+              <w:rPr>
+                <w:bCs/>
+                <w:color w:val="0D0D0D" w:themeColor="text1" w:themeTint="F2"/>
+              </w:rPr>
+              <w:t xml:space="preserve"> </w:t>
+            </w:r>
+            <w:proofErr w:type="spellStart"/>
+            <w:r>
+              <w:rPr>
+                <w:bCs/>
+                <w:color w:val="0D0D0D" w:themeColor="text1" w:themeTint="F2"/>
+              </w:rPr>
+              <w:t>المؤجر</w:t>
+            </w:r>
+            <w:proofErr w:type="spellEnd"/>
+            <w:r>
+              <w:rPr>
+                <w:bCs/>
+                <w:color w:val="0D0D0D" w:themeColor="text1" w:themeTint="F2"/>
+              </w:rPr>
+              <w:t xml:space="preserve"> و </w:t>
+            </w:r>
+            <w:proofErr w:type="spellStart"/>
+            <w:r>
+              <w:rPr>
+                <w:bCs/>
+                <w:color w:val="0D0D0D" w:themeColor="text1" w:themeTint="F2"/>
+              </w:rPr>
+              <w:t>أنه</w:t>
+            </w:r>
+            <w:proofErr w:type="spellEnd"/>
+            <w:r>
+              <w:rPr>
+                <w:bCs/>
+                <w:color w:val="0D0D0D" w:themeColor="text1" w:themeTint="F2"/>
+              </w:rPr>
+              <w:t xml:space="preserve"> </w:t>
+            </w:r>
+            <w:proofErr w:type="spellStart"/>
+            <w:r>
+              <w:rPr>
+                <w:bCs/>
+                <w:color w:val="0D0D0D" w:themeColor="text1" w:themeTint="F2"/>
+              </w:rPr>
+              <w:t>قد</w:t>
+            </w:r>
+            <w:proofErr w:type="spellEnd"/>
+            <w:r>
+              <w:rPr>
+                <w:bCs/>
+                <w:color w:val="0D0D0D" w:themeColor="text1" w:themeTint="F2"/>
+              </w:rPr>
+              <w:t xml:space="preserve"> </w:t>
+            </w:r>
+            <w:proofErr w:type="spellStart"/>
+            <w:r>
+              <w:rPr>
+                <w:bCs/>
+                <w:color w:val="0D0D0D" w:themeColor="text1" w:themeTint="F2"/>
+              </w:rPr>
+              <w:t>قبله</w:t>
+            </w:r>
+            <w:proofErr w:type="spellEnd"/>
+            <w:r>
+              <w:rPr>
+                <w:bCs/>
+                <w:color w:val="0D0D0D" w:themeColor="text1" w:themeTint="F2"/>
+              </w:rPr>
+              <w:t xml:space="preserve"> </w:t>
+            </w:r>
+            <w:proofErr w:type="spellStart"/>
+            <w:r>
+              <w:rPr>
+                <w:bCs/>
+                <w:color w:val="0D0D0D" w:themeColor="text1" w:themeTint="F2"/>
+              </w:rPr>
+              <w:t>بحالته</w:t>
+            </w:r>
+            <w:proofErr w:type="spellEnd"/>
+            <w:r>
+              <w:rPr>
+                <w:bCs/>
+                <w:color w:val="0D0D0D" w:themeColor="text1" w:themeTint="F2"/>
+              </w:rPr>
+              <w:t xml:space="preserve"> </w:t>
+            </w:r>
+            <w:proofErr w:type="spellStart"/>
+            <w:r>
+              <w:rPr>
+                <w:bCs/>
+                <w:color w:val="0D0D0D" w:themeColor="text1" w:themeTint="F2"/>
+              </w:rPr>
+              <w:t>الراهنة</w:t>
+            </w:r>
+            <w:proofErr w:type="spellEnd"/>
+            <w:r>
+              <w:rPr>
+                <w:bCs/>
+                <w:color w:val="0D0D0D" w:themeColor="text1" w:themeTint="F2"/>
+              </w:rPr>
+              <w:t>.</w:t>
             </w:r>
             <w:r>
               <w:rPr>
@@ -4603,12 +5488,869 @@
               </w:rPr>
               <w:br/>
             </w:r>
-            <w:r>
-              <w:rPr>
-                <w:bCs/>
-                <w:color w:val="0D0D0D" w:themeColor="text1" w:themeTint="F2"/>
-              </w:rPr>
-              <w:t>لا يجوز للمستأجر إدخال أي تعديلات أو هدم أي جزء من العقار المؤجر أو التنازل عن الإيجار ، دون الحصول على موافقة مسبقة و خطية من المؤجر و يتعهد المستأجر بأنه لن يقوم بإنهاء هذا العقد قبل إنتهائه أو إنهائه لأي آية غاية في نفسه و في البند المؤجر إلا بعد الحصول على موافقة خطية مسبقة من المؤجر.②</w:t>
+            <w:proofErr w:type="spellStart"/>
+            <w:r>
+              <w:rPr>
+                <w:bCs/>
+                <w:color w:val="0D0D0D" w:themeColor="text1" w:themeTint="F2"/>
+              </w:rPr>
+              <w:t>لا</w:t>
+            </w:r>
+            <w:proofErr w:type="spellEnd"/>
+            <w:r>
+              <w:rPr>
+                <w:bCs/>
+                <w:color w:val="0D0D0D" w:themeColor="text1" w:themeTint="F2"/>
+              </w:rPr>
+              <w:t xml:space="preserve"> </w:t>
+            </w:r>
+            <w:proofErr w:type="spellStart"/>
+            <w:r>
+              <w:rPr>
+                <w:bCs/>
+                <w:color w:val="0D0D0D" w:themeColor="text1" w:themeTint="F2"/>
+              </w:rPr>
+              <w:t>يجوز</w:t>
+            </w:r>
+            <w:proofErr w:type="spellEnd"/>
+            <w:r>
+              <w:rPr>
+                <w:bCs/>
+                <w:color w:val="0D0D0D" w:themeColor="text1" w:themeTint="F2"/>
+              </w:rPr>
+              <w:t xml:space="preserve"> </w:t>
+            </w:r>
+            <w:proofErr w:type="spellStart"/>
+            <w:r>
+              <w:rPr>
+                <w:bCs/>
+                <w:color w:val="0D0D0D" w:themeColor="text1" w:themeTint="F2"/>
+              </w:rPr>
+              <w:t>للمستأجر</w:t>
+            </w:r>
+            <w:proofErr w:type="spellEnd"/>
+            <w:r>
+              <w:rPr>
+                <w:bCs/>
+                <w:color w:val="0D0D0D" w:themeColor="text1" w:themeTint="F2"/>
+              </w:rPr>
+              <w:t xml:space="preserve"> </w:t>
+            </w:r>
+            <w:proofErr w:type="spellStart"/>
+            <w:r>
+              <w:rPr>
+                <w:bCs/>
+                <w:color w:val="0D0D0D" w:themeColor="text1" w:themeTint="F2"/>
+              </w:rPr>
+              <w:t>إدخال</w:t>
+            </w:r>
+            <w:proofErr w:type="spellEnd"/>
+            <w:r>
+              <w:rPr>
+                <w:bCs/>
+                <w:color w:val="0D0D0D" w:themeColor="text1" w:themeTint="F2"/>
+              </w:rPr>
+              <w:t xml:space="preserve"> </w:t>
+            </w:r>
+            <w:proofErr w:type="spellStart"/>
+            <w:r>
+              <w:rPr>
+                <w:bCs/>
+                <w:color w:val="0D0D0D" w:themeColor="text1" w:themeTint="F2"/>
+              </w:rPr>
+              <w:t>أي</w:t>
+            </w:r>
+            <w:proofErr w:type="spellEnd"/>
+            <w:r>
+              <w:rPr>
+                <w:bCs/>
+                <w:color w:val="0D0D0D" w:themeColor="text1" w:themeTint="F2"/>
+              </w:rPr>
+              <w:t xml:space="preserve"> </w:t>
+            </w:r>
+            <w:proofErr w:type="spellStart"/>
+            <w:r>
+              <w:rPr>
+                <w:bCs/>
+                <w:color w:val="0D0D0D" w:themeColor="text1" w:themeTint="F2"/>
+              </w:rPr>
+              <w:t>تعديلات</w:t>
+            </w:r>
+            <w:proofErr w:type="spellEnd"/>
+            <w:r>
+              <w:rPr>
+                <w:bCs/>
+                <w:color w:val="0D0D0D" w:themeColor="text1" w:themeTint="F2"/>
+              </w:rPr>
+              <w:t xml:space="preserve"> </w:t>
+            </w:r>
+            <w:proofErr w:type="spellStart"/>
+            <w:r>
+              <w:rPr>
+                <w:bCs/>
+                <w:color w:val="0D0D0D" w:themeColor="text1" w:themeTint="F2"/>
+              </w:rPr>
+              <w:t>أو</w:t>
+            </w:r>
+            <w:proofErr w:type="spellEnd"/>
+            <w:r>
+              <w:rPr>
+                <w:bCs/>
+                <w:color w:val="0D0D0D" w:themeColor="text1" w:themeTint="F2"/>
+              </w:rPr>
+              <w:t xml:space="preserve"> </w:t>
+            </w:r>
+            <w:proofErr w:type="spellStart"/>
+            <w:r>
+              <w:rPr>
+                <w:bCs/>
+                <w:color w:val="0D0D0D" w:themeColor="text1" w:themeTint="F2"/>
+              </w:rPr>
+              <w:t>هدم</w:t>
+            </w:r>
+            <w:proofErr w:type="spellEnd"/>
+            <w:r>
+              <w:rPr>
+                <w:bCs/>
+                <w:color w:val="0D0D0D" w:themeColor="text1" w:themeTint="F2"/>
+              </w:rPr>
+              <w:t xml:space="preserve"> </w:t>
+            </w:r>
+            <w:proofErr w:type="spellStart"/>
+            <w:r>
+              <w:rPr>
+                <w:bCs/>
+                <w:color w:val="0D0D0D" w:themeColor="text1" w:themeTint="F2"/>
+              </w:rPr>
+              <w:t>أي</w:t>
+            </w:r>
+            <w:proofErr w:type="spellEnd"/>
+            <w:r>
+              <w:rPr>
+                <w:bCs/>
+                <w:color w:val="0D0D0D" w:themeColor="text1" w:themeTint="F2"/>
+              </w:rPr>
+              <w:t xml:space="preserve"> </w:t>
+            </w:r>
+            <w:proofErr w:type="spellStart"/>
+            <w:r>
+              <w:rPr>
+                <w:bCs/>
+                <w:color w:val="0D0D0D" w:themeColor="text1" w:themeTint="F2"/>
+              </w:rPr>
+              <w:t>جزء</w:t>
+            </w:r>
+            <w:proofErr w:type="spellEnd"/>
+            <w:r>
+              <w:rPr>
+                <w:bCs/>
+                <w:color w:val="0D0D0D" w:themeColor="text1" w:themeTint="F2"/>
+              </w:rPr>
+              <w:t xml:space="preserve"> </w:t>
+            </w:r>
+            <w:proofErr w:type="spellStart"/>
+            <w:r>
+              <w:rPr>
+                <w:bCs/>
+                <w:color w:val="0D0D0D" w:themeColor="text1" w:themeTint="F2"/>
+              </w:rPr>
+              <w:t>من</w:t>
+            </w:r>
+            <w:proofErr w:type="spellEnd"/>
+            <w:r>
+              <w:rPr>
+                <w:bCs/>
+                <w:color w:val="0D0D0D" w:themeColor="text1" w:themeTint="F2"/>
+              </w:rPr>
+              <w:t xml:space="preserve"> </w:t>
+            </w:r>
+            <w:proofErr w:type="spellStart"/>
+            <w:r>
+              <w:rPr>
+                <w:bCs/>
+                <w:color w:val="0D0D0D" w:themeColor="text1" w:themeTint="F2"/>
+              </w:rPr>
+              <w:t>العقار</w:t>
+            </w:r>
+            <w:proofErr w:type="spellEnd"/>
+            <w:r>
+              <w:rPr>
+                <w:bCs/>
+                <w:color w:val="0D0D0D" w:themeColor="text1" w:themeTint="F2"/>
+              </w:rPr>
+              <w:t xml:space="preserve"> </w:t>
+            </w:r>
+            <w:proofErr w:type="spellStart"/>
+            <w:r>
+              <w:rPr>
+                <w:bCs/>
+                <w:color w:val="0D0D0D" w:themeColor="text1" w:themeTint="F2"/>
+              </w:rPr>
+              <w:t>المؤجر</w:t>
+            </w:r>
+            <w:proofErr w:type="spellEnd"/>
+            <w:r>
+              <w:rPr>
+                <w:bCs/>
+                <w:color w:val="0D0D0D" w:themeColor="text1" w:themeTint="F2"/>
+              </w:rPr>
+              <w:t xml:space="preserve"> </w:t>
+            </w:r>
+            <w:proofErr w:type="spellStart"/>
+            <w:r>
+              <w:rPr>
+                <w:bCs/>
+                <w:color w:val="0D0D0D" w:themeColor="text1" w:themeTint="F2"/>
+              </w:rPr>
+              <w:t>أو</w:t>
+            </w:r>
+            <w:proofErr w:type="spellEnd"/>
+            <w:r>
+              <w:rPr>
+                <w:bCs/>
+                <w:color w:val="0D0D0D" w:themeColor="text1" w:themeTint="F2"/>
+              </w:rPr>
+              <w:t xml:space="preserve"> </w:t>
+            </w:r>
+            <w:proofErr w:type="spellStart"/>
+            <w:r>
+              <w:rPr>
+                <w:bCs/>
+                <w:color w:val="0D0D0D" w:themeColor="text1" w:themeTint="F2"/>
+              </w:rPr>
+              <w:t>التنازل</w:t>
+            </w:r>
+            <w:proofErr w:type="spellEnd"/>
+            <w:r>
+              <w:rPr>
+                <w:bCs/>
+                <w:color w:val="0D0D0D" w:themeColor="text1" w:themeTint="F2"/>
+              </w:rPr>
+              <w:t xml:space="preserve"> </w:t>
+            </w:r>
+            <w:proofErr w:type="spellStart"/>
+            <w:r>
+              <w:rPr>
+                <w:bCs/>
+                <w:color w:val="0D0D0D" w:themeColor="text1" w:themeTint="F2"/>
+              </w:rPr>
+              <w:t>عن</w:t>
+            </w:r>
+            <w:proofErr w:type="spellEnd"/>
+            <w:r>
+              <w:rPr>
+                <w:bCs/>
+                <w:color w:val="0D0D0D" w:themeColor="text1" w:themeTint="F2"/>
+              </w:rPr>
+              <w:t xml:space="preserve"> </w:t>
+            </w:r>
+            <w:proofErr w:type="spellStart"/>
+            <w:r>
+              <w:rPr>
+                <w:bCs/>
+                <w:color w:val="0D0D0D" w:themeColor="text1" w:themeTint="F2"/>
+              </w:rPr>
+              <w:t>الإيجار</w:t>
+            </w:r>
+            <w:proofErr w:type="spellEnd"/>
+            <w:r>
+              <w:rPr>
+                <w:bCs/>
+                <w:color w:val="0D0D0D" w:themeColor="text1" w:themeTint="F2"/>
+              </w:rPr>
+              <w:t xml:space="preserve"> ، </w:t>
+            </w:r>
+            <w:proofErr w:type="spellStart"/>
+            <w:r>
+              <w:rPr>
+                <w:bCs/>
+                <w:color w:val="0D0D0D" w:themeColor="text1" w:themeTint="F2"/>
+              </w:rPr>
+              <w:t>دون</w:t>
+            </w:r>
+            <w:proofErr w:type="spellEnd"/>
+            <w:r>
+              <w:rPr>
+                <w:bCs/>
+                <w:color w:val="0D0D0D" w:themeColor="text1" w:themeTint="F2"/>
+              </w:rPr>
+              <w:t xml:space="preserve"> </w:t>
+            </w:r>
+            <w:proofErr w:type="spellStart"/>
+            <w:r>
+              <w:rPr>
+                <w:bCs/>
+                <w:color w:val="0D0D0D" w:themeColor="text1" w:themeTint="F2"/>
+              </w:rPr>
+              <w:t>الحصول</w:t>
+            </w:r>
+            <w:proofErr w:type="spellEnd"/>
+            <w:r>
+              <w:rPr>
+                <w:bCs/>
+                <w:color w:val="0D0D0D" w:themeColor="text1" w:themeTint="F2"/>
+              </w:rPr>
+              <w:t xml:space="preserve"> </w:t>
+            </w:r>
+            <w:proofErr w:type="spellStart"/>
+            <w:r>
+              <w:rPr>
+                <w:bCs/>
+                <w:color w:val="0D0D0D" w:themeColor="text1" w:themeTint="F2"/>
+              </w:rPr>
+              <w:t>على</w:t>
+            </w:r>
+            <w:proofErr w:type="spellEnd"/>
+            <w:r>
+              <w:rPr>
+                <w:bCs/>
+                <w:color w:val="0D0D0D" w:themeColor="text1" w:themeTint="F2"/>
+              </w:rPr>
+              <w:t xml:space="preserve"> </w:t>
+            </w:r>
+            <w:proofErr w:type="spellStart"/>
+            <w:r>
+              <w:rPr>
+                <w:bCs/>
+                <w:color w:val="0D0D0D" w:themeColor="text1" w:themeTint="F2"/>
+              </w:rPr>
+              <w:t>موافقة</w:t>
+            </w:r>
+            <w:proofErr w:type="spellEnd"/>
+            <w:r>
+              <w:rPr>
+                <w:bCs/>
+                <w:color w:val="0D0D0D" w:themeColor="text1" w:themeTint="F2"/>
+              </w:rPr>
+              <w:t xml:space="preserve"> </w:t>
+            </w:r>
+            <w:proofErr w:type="spellStart"/>
+            <w:r>
+              <w:rPr>
+                <w:bCs/>
+                <w:color w:val="0D0D0D" w:themeColor="text1" w:themeTint="F2"/>
+              </w:rPr>
+              <w:t>مسبقة</w:t>
+            </w:r>
+            <w:proofErr w:type="spellEnd"/>
+            <w:r>
+              <w:rPr>
+                <w:bCs/>
+                <w:color w:val="0D0D0D" w:themeColor="text1" w:themeTint="F2"/>
+              </w:rPr>
+              <w:t xml:space="preserve"> و </w:t>
+            </w:r>
+            <w:proofErr w:type="spellStart"/>
+            <w:r>
+              <w:rPr>
+                <w:bCs/>
+                <w:color w:val="0D0D0D" w:themeColor="text1" w:themeTint="F2"/>
+              </w:rPr>
+              <w:t>خطية</w:t>
+            </w:r>
+            <w:proofErr w:type="spellEnd"/>
+            <w:r>
+              <w:rPr>
+                <w:bCs/>
+                <w:color w:val="0D0D0D" w:themeColor="text1" w:themeTint="F2"/>
+              </w:rPr>
+              <w:t xml:space="preserve"> </w:t>
+            </w:r>
+            <w:proofErr w:type="spellStart"/>
+            <w:r>
+              <w:rPr>
+                <w:bCs/>
+                <w:color w:val="0D0D0D" w:themeColor="text1" w:themeTint="F2"/>
+              </w:rPr>
+              <w:t>من</w:t>
+            </w:r>
+            <w:proofErr w:type="spellEnd"/>
+            <w:r>
+              <w:rPr>
+                <w:bCs/>
+                <w:color w:val="0D0D0D" w:themeColor="text1" w:themeTint="F2"/>
+              </w:rPr>
+              <w:t xml:space="preserve"> </w:t>
+            </w:r>
+            <w:proofErr w:type="spellStart"/>
+            <w:r>
+              <w:rPr>
+                <w:bCs/>
+                <w:color w:val="0D0D0D" w:themeColor="text1" w:themeTint="F2"/>
+              </w:rPr>
+              <w:t>المؤجر</w:t>
+            </w:r>
+            <w:proofErr w:type="spellEnd"/>
+            <w:r>
+              <w:rPr>
+                <w:bCs/>
+                <w:color w:val="0D0D0D" w:themeColor="text1" w:themeTint="F2"/>
+              </w:rPr>
+              <w:t xml:space="preserve"> و </w:t>
+            </w:r>
+            <w:proofErr w:type="spellStart"/>
+            <w:r>
+              <w:rPr>
+                <w:bCs/>
+                <w:color w:val="0D0D0D" w:themeColor="text1" w:themeTint="F2"/>
+              </w:rPr>
+              <w:t>يتعهد</w:t>
+            </w:r>
+            <w:proofErr w:type="spellEnd"/>
+            <w:r>
+              <w:rPr>
+                <w:bCs/>
+                <w:color w:val="0D0D0D" w:themeColor="text1" w:themeTint="F2"/>
+              </w:rPr>
+              <w:t xml:space="preserve"> </w:t>
+            </w:r>
+            <w:proofErr w:type="spellStart"/>
+            <w:r>
+              <w:rPr>
+                <w:bCs/>
+                <w:color w:val="0D0D0D" w:themeColor="text1" w:themeTint="F2"/>
+              </w:rPr>
+              <w:t>المستأجر</w:t>
+            </w:r>
+            <w:proofErr w:type="spellEnd"/>
+            <w:r>
+              <w:rPr>
+                <w:bCs/>
+                <w:color w:val="0D0D0D" w:themeColor="text1" w:themeTint="F2"/>
+              </w:rPr>
+              <w:t xml:space="preserve"> </w:t>
+            </w:r>
+            <w:proofErr w:type="spellStart"/>
+            <w:r>
+              <w:rPr>
+                <w:bCs/>
+                <w:color w:val="0D0D0D" w:themeColor="text1" w:themeTint="F2"/>
+              </w:rPr>
+              <w:t>بأنه</w:t>
+            </w:r>
+            <w:proofErr w:type="spellEnd"/>
+            <w:r>
+              <w:rPr>
+                <w:bCs/>
+                <w:color w:val="0D0D0D" w:themeColor="text1" w:themeTint="F2"/>
+              </w:rPr>
+              <w:t xml:space="preserve"> </w:t>
+            </w:r>
+            <w:proofErr w:type="spellStart"/>
+            <w:r>
+              <w:rPr>
+                <w:bCs/>
+                <w:color w:val="0D0D0D" w:themeColor="text1" w:themeTint="F2"/>
+              </w:rPr>
+              <w:t>لن</w:t>
+            </w:r>
+            <w:proofErr w:type="spellEnd"/>
+            <w:r>
+              <w:rPr>
+                <w:bCs/>
+                <w:color w:val="0D0D0D" w:themeColor="text1" w:themeTint="F2"/>
+              </w:rPr>
+              <w:t xml:space="preserve"> </w:t>
+            </w:r>
+            <w:proofErr w:type="spellStart"/>
+            <w:r>
+              <w:rPr>
+                <w:bCs/>
+                <w:color w:val="0D0D0D" w:themeColor="text1" w:themeTint="F2"/>
+              </w:rPr>
+              <w:t>يقوم</w:t>
+            </w:r>
+            <w:proofErr w:type="spellEnd"/>
+            <w:r>
+              <w:rPr>
+                <w:bCs/>
+                <w:color w:val="0D0D0D" w:themeColor="text1" w:themeTint="F2"/>
+              </w:rPr>
+              <w:t xml:space="preserve"> </w:t>
+            </w:r>
+            <w:proofErr w:type="spellStart"/>
+            <w:r>
+              <w:rPr>
+                <w:bCs/>
+                <w:color w:val="0D0D0D" w:themeColor="text1" w:themeTint="F2"/>
+              </w:rPr>
+              <w:t>بإنهاء</w:t>
+            </w:r>
+            <w:proofErr w:type="spellEnd"/>
+            <w:r>
+              <w:rPr>
+                <w:bCs/>
+                <w:color w:val="0D0D0D" w:themeColor="text1" w:themeTint="F2"/>
+              </w:rPr>
+              <w:t xml:space="preserve"> </w:t>
+            </w:r>
+            <w:proofErr w:type="spellStart"/>
+            <w:r>
+              <w:rPr>
+                <w:bCs/>
+                <w:color w:val="0D0D0D" w:themeColor="text1" w:themeTint="F2"/>
+              </w:rPr>
+              <w:t>هذا</w:t>
+            </w:r>
+            <w:proofErr w:type="spellEnd"/>
+            <w:r>
+              <w:rPr>
+                <w:bCs/>
+                <w:color w:val="0D0D0D" w:themeColor="text1" w:themeTint="F2"/>
+              </w:rPr>
+              <w:t xml:space="preserve"> </w:t>
+            </w:r>
+            <w:proofErr w:type="spellStart"/>
+            <w:r>
+              <w:rPr>
+                <w:bCs/>
+                <w:color w:val="0D0D0D" w:themeColor="text1" w:themeTint="F2"/>
+              </w:rPr>
+              <w:t>العقد</w:t>
+            </w:r>
+            <w:proofErr w:type="spellEnd"/>
+            <w:r>
+              <w:rPr>
+                <w:bCs/>
+                <w:color w:val="0D0D0D" w:themeColor="text1" w:themeTint="F2"/>
+              </w:rPr>
+              <w:t xml:space="preserve"> </w:t>
+            </w:r>
+            <w:proofErr w:type="spellStart"/>
+            <w:r>
+              <w:rPr>
+                <w:bCs/>
+                <w:color w:val="0D0D0D" w:themeColor="text1" w:themeTint="F2"/>
+              </w:rPr>
+              <w:t>قبل</w:t>
+            </w:r>
+            <w:proofErr w:type="spellEnd"/>
+            <w:r>
+              <w:rPr>
+                <w:bCs/>
+                <w:color w:val="0D0D0D" w:themeColor="text1" w:themeTint="F2"/>
+              </w:rPr>
+              <w:t xml:space="preserve"> </w:t>
+            </w:r>
+            <w:proofErr w:type="spellStart"/>
+            <w:r>
+              <w:rPr>
+                <w:bCs/>
+                <w:color w:val="0D0D0D" w:themeColor="text1" w:themeTint="F2"/>
+              </w:rPr>
+              <w:t>إنتهائه</w:t>
+            </w:r>
+            <w:proofErr w:type="spellEnd"/>
+            <w:r>
+              <w:rPr>
+                <w:bCs/>
+                <w:color w:val="0D0D0D" w:themeColor="text1" w:themeTint="F2"/>
+              </w:rPr>
+              <w:t xml:space="preserve"> </w:t>
+            </w:r>
+            <w:proofErr w:type="spellStart"/>
+            <w:r>
+              <w:rPr>
+                <w:bCs/>
+                <w:color w:val="0D0D0D" w:themeColor="text1" w:themeTint="F2"/>
+              </w:rPr>
+              <w:t>أو</w:t>
+            </w:r>
+            <w:proofErr w:type="spellEnd"/>
+            <w:r>
+              <w:rPr>
+                <w:bCs/>
+                <w:color w:val="0D0D0D" w:themeColor="text1" w:themeTint="F2"/>
+              </w:rPr>
+              <w:t xml:space="preserve"> </w:t>
+            </w:r>
+            <w:proofErr w:type="spellStart"/>
+            <w:r>
+              <w:rPr>
+                <w:bCs/>
+                <w:color w:val="0D0D0D" w:themeColor="text1" w:themeTint="F2"/>
+              </w:rPr>
+              <w:t>إنهائه</w:t>
+            </w:r>
+            <w:proofErr w:type="spellEnd"/>
+            <w:r>
+              <w:rPr>
+                <w:bCs/>
+                <w:color w:val="0D0D0D" w:themeColor="text1" w:themeTint="F2"/>
+              </w:rPr>
+              <w:t xml:space="preserve"> </w:t>
+            </w:r>
+            <w:proofErr w:type="spellStart"/>
+            <w:r>
+              <w:rPr>
+                <w:bCs/>
+                <w:color w:val="0D0D0D" w:themeColor="text1" w:themeTint="F2"/>
+              </w:rPr>
+              <w:t>لأي</w:t>
+            </w:r>
+            <w:proofErr w:type="spellEnd"/>
+            <w:r>
+              <w:rPr>
+                <w:bCs/>
+                <w:color w:val="0D0D0D" w:themeColor="text1" w:themeTint="F2"/>
+              </w:rPr>
+              <w:t xml:space="preserve"> </w:t>
+            </w:r>
+            <w:proofErr w:type="spellStart"/>
+            <w:r>
+              <w:rPr>
+                <w:bCs/>
+                <w:color w:val="0D0D0D" w:themeColor="text1" w:themeTint="F2"/>
+              </w:rPr>
+              <w:t>آية</w:t>
+            </w:r>
+            <w:proofErr w:type="spellEnd"/>
+            <w:r>
+              <w:rPr>
+                <w:bCs/>
+                <w:color w:val="0D0D0D" w:themeColor="text1" w:themeTint="F2"/>
+              </w:rPr>
+              <w:t xml:space="preserve"> </w:t>
+            </w:r>
+            <w:proofErr w:type="spellStart"/>
+            <w:r>
+              <w:rPr>
+                <w:bCs/>
+                <w:color w:val="0D0D0D" w:themeColor="text1" w:themeTint="F2"/>
+              </w:rPr>
+              <w:t>غاية</w:t>
+            </w:r>
+            <w:proofErr w:type="spellEnd"/>
+            <w:r>
+              <w:rPr>
+                <w:bCs/>
+                <w:color w:val="0D0D0D" w:themeColor="text1" w:themeTint="F2"/>
+              </w:rPr>
+              <w:t xml:space="preserve"> </w:t>
+            </w:r>
+            <w:proofErr w:type="spellStart"/>
+            <w:r>
+              <w:rPr>
+                <w:bCs/>
+                <w:color w:val="0D0D0D" w:themeColor="text1" w:themeTint="F2"/>
+              </w:rPr>
+              <w:t>في</w:t>
+            </w:r>
+            <w:proofErr w:type="spellEnd"/>
+            <w:r>
+              <w:rPr>
+                <w:bCs/>
+                <w:color w:val="0D0D0D" w:themeColor="text1" w:themeTint="F2"/>
+              </w:rPr>
+              <w:t xml:space="preserve"> </w:t>
+            </w:r>
+            <w:proofErr w:type="spellStart"/>
+            <w:r>
+              <w:rPr>
+                <w:bCs/>
+                <w:color w:val="0D0D0D" w:themeColor="text1" w:themeTint="F2"/>
+              </w:rPr>
+              <w:t>نفسه</w:t>
+            </w:r>
+            <w:proofErr w:type="spellEnd"/>
+            <w:r>
+              <w:rPr>
+                <w:bCs/>
+                <w:color w:val="0D0D0D" w:themeColor="text1" w:themeTint="F2"/>
+              </w:rPr>
+              <w:t xml:space="preserve"> و </w:t>
+            </w:r>
+            <w:proofErr w:type="spellStart"/>
+            <w:r>
+              <w:rPr>
+                <w:bCs/>
+                <w:color w:val="0D0D0D" w:themeColor="text1" w:themeTint="F2"/>
+              </w:rPr>
+              <w:t>في</w:t>
+            </w:r>
+            <w:proofErr w:type="spellEnd"/>
+            <w:r>
+              <w:rPr>
+                <w:bCs/>
+                <w:color w:val="0D0D0D" w:themeColor="text1" w:themeTint="F2"/>
+              </w:rPr>
+              <w:t xml:space="preserve"> </w:t>
+            </w:r>
+            <w:proofErr w:type="spellStart"/>
+            <w:r>
+              <w:rPr>
+                <w:bCs/>
+                <w:color w:val="0D0D0D" w:themeColor="text1" w:themeTint="F2"/>
+              </w:rPr>
+              <w:t>البند</w:t>
+            </w:r>
+            <w:proofErr w:type="spellEnd"/>
+            <w:r>
+              <w:rPr>
+                <w:bCs/>
+                <w:color w:val="0D0D0D" w:themeColor="text1" w:themeTint="F2"/>
+              </w:rPr>
+              <w:t xml:space="preserve"> </w:t>
+            </w:r>
+            <w:proofErr w:type="spellStart"/>
+            <w:r>
+              <w:rPr>
+                <w:bCs/>
+                <w:color w:val="0D0D0D" w:themeColor="text1" w:themeTint="F2"/>
+              </w:rPr>
+              <w:t>المؤجر</w:t>
+            </w:r>
+            <w:proofErr w:type="spellEnd"/>
+            <w:r>
+              <w:rPr>
+                <w:bCs/>
+                <w:color w:val="0D0D0D" w:themeColor="text1" w:themeTint="F2"/>
+              </w:rPr>
+              <w:t xml:space="preserve"> </w:t>
+            </w:r>
+            <w:proofErr w:type="spellStart"/>
+            <w:r>
+              <w:rPr>
+                <w:bCs/>
+                <w:color w:val="0D0D0D" w:themeColor="text1" w:themeTint="F2"/>
+              </w:rPr>
+              <w:t>إلا</w:t>
+            </w:r>
+            <w:proofErr w:type="spellEnd"/>
+            <w:r>
+              <w:rPr>
+                <w:bCs/>
+                <w:color w:val="0D0D0D" w:themeColor="text1" w:themeTint="F2"/>
+              </w:rPr>
+              <w:t xml:space="preserve"> </w:t>
+            </w:r>
+            <w:proofErr w:type="spellStart"/>
+            <w:r>
+              <w:rPr>
+                <w:bCs/>
+                <w:color w:val="0D0D0D" w:themeColor="text1" w:themeTint="F2"/>
+              </w:rPr>
+              <w:t>بعد</w:t>
+            </w:r>
+            <w:proofErr w:type="spellEnd"/>
+            <w:r>
+              <w:rPr>
+                <w:bCs/>
+                <w:color w:val="0D0D0D" w:themeColor="text1" w:themeTint="F2"/>
+              </w:rPr>
+              <w:t xml:space="preserve"> </w:t>
+            </w:r>
+            <w:proofErr w:type="spellStart"/>
+            <w:r>
+              <w:rPr>
+                <w:bCs/>
+                <w:color w:val="0D0D0D" w:themeColor="text1" w:themeTint="F2"/>
+              </w:rPr>
+              <w:t>الحصول</w:t>
+            </w:r>
+            <w:proofErr w:type="spellEnd"/>
+            <w:r>
+              <w:rPr>
+                <w:bCs/>
+                <w:color w:val="0D0D0D" w:themeColor="text1" w:themeTint="F2"/>
+              </w:rPr>
+              <w:t xml:space="preserve"> </w:t>
+            </w:r>
+            <w:proofErr w:type="spellStart"/>
+            <w:r>
+              <w:rPr>
+                <w:bCs/>
+                <w:color w:val="0D0D0D" w:themeColor="text1" w:themeTint="F2"/>
+              </w:rPr>
+              <w:t>على</w:t>
+            </w:r>
+            <w:proofErr w:type="spellEnd"/>
+            <w:r>
+              <w:rPr>
+                <w:bCs/>
+                <w:color w:val="0D0D0D" w:themeColor="text1" w:themeTint="F2"/>
+              </w:rPr>
+              <w:t xml:space="preserve"> </w:t>
+            </w:r>
+            <w:proofErr w:type="spellStart"/>
+            <w:r>
+              <w:rPr>
+                <w:bCs/>
+                <w:color w:val="0D0D0D" w:themeColor="text1" w:themeTint="F2"/>
+              </w:rPr>
+              <w:t>موافقة</w:t>
+            </w:r>
+            <w:proofErr w:type="spellEnd"/>
+            <w:r>
+              <w:rPr>
+                <w:bCs/>
+                <w:color w:val="0D0D0D" w:themeColor="text1" w:themeTint="F2"/>
+              </w:rPr>
+              <w:t xml:space="preserve"> </w:t>
+            </w:r>
+            <w:proofErr w:type="spellStart"/>
+            <w:r>
+              <w:rPr>
+                <w:bCs/>
+                <w:color w:val="0D0D0D" w:themeColor="text1" w:themeTint="F2"/>
+              </w:rPr>
+              <w:t>خطية</w:t>
+            </w:r>
+            <w:proofErr w:type="spellEnd"/>
+            <w:r>
+              <w:rPr>
+                <w:bCs/>
+                <w:color w:val="0D0D0D" w:themeColor="text1" w:themeTint="F2"/>
+              </w:rPr>
+              <w:t xml:space="preserve"> </w:t>
+            </w:r>
+            <w:proofErr w:type="spellStart"/>
+            <w:r>
+              <w:rPr>
+                <w:bCs/>
+                <w:color w:val="0D0D0D" w:themeColor="text1" w:themeTint="F2"/>
+              </w:rPr>
+              <w:t>مسبقة</w:t>
+            </w:r>
+            <w:proofErr w:type="spellEnd"/>
+            <w:r>
+              <w:rPr>
+                <w:bCs/>
+                <w:color w:val="0D0D0D" w:themeColor="text1" w:themeTint="F2"/>
+              </w:rPr>
+              <w:t xml:space="preserve"> </w:t>
+            </w:r>
+            <w:proofErr w:type="spellStart"/>
+            <w:r>
+              <w:rPr>
+                <w:bCs/>
+                <w:color w:val="0D0D0D" w:themeColor="text1" w:themeTint="F2"/>
+              </w:rPr>
+              <w:t>من</w:t>
+            </w:r>
+            <w:proofErr w:type="spellEnd"/>
+            <w:r>
+              <w:rPr>
+                <w:bCs/>
+                <w:color w:val="0D0D0D" w:themeColor="text1" w:themeTint="F2"/>
+              </w:rPr>
+              <w:t xml:space="preserve"> </w:t>
+            </w:r>
+            <w:proofErr w:type="spellStart"/>
+            <w:r>
+              <w:rPr>
+                <w:bCs/>
+                <w:color w:val="0D0D0D" w:themeColor="text1" w:themeTint="F2"/>
+              </w:rPr>
+              <w:t>المؤجر</w:t>
+            </w:r>
+            <w:proofErr w:type="spellEnd"/>
+            <w:r>
+              <w:rPr>
+                <w:bCs/>
+                <w:color w:val="0D0D0D" w:themeColor="text1" w:themeTint="F2"/>
+              </w:rPr>
+              <w:t>.②</w:t>
             </w:r>
             <w:r>
               <w:rPr>
@@ -4626,20 +6368,246 @@
               </w:rPr>
               <w:br/>
             </w:r>
-            <w:r>
-              <w:rPr>
-                <w:bCs/>
-                <w:color w:val="0D0D0D" w:themeColor="text1" w:themeTint="F2"/>
-              </w:rPr>
-              <w:t xml:space="preserve">يتعهد المستأجر بتسديد جميع رسوم و تكاليف استهلاكهم من الكهرباء و الماء و استعمال الهاتف / الفاكس / التكييف .. و </w:t>
-            </w:r>
+            <w:proofErr w:type="spellStart"/>
+            <w:r>
+              <w:rPr>
+                <w:bCs/>
+                <w:color w:val="0D0D0D" w:themeColor="text1" w:themeTint="F2"/>
+              </w:rPr>
+              <w:t>يتعهد</w:t>
+            </w:r>
+            <w:proofErr w:type="spellEnd"/>
+            <w:r>
+              <w:rPr>
+                <w:bCs/>
+                <w:color w:val="0D0D0D" w:themeColor="text1" w:themeTint="F2"/>
+              </w:rPr>
+              <w:t xml:space="preserve"> </w:t>
+            </w:r>
+            <w:proofErr w:type="spellStart"/>
+            <w:r>
+              <w:rPr>
+                <w:bCs/>
+                <w:color w:val="0D0D0D" w:themeColor="text1" w:themeTint="F2"/>
+              </w:rPr>
+              <w:t>المستأجر</w:t>
+            </w:r>
+            <w:proofErr w:type="spellEnd"/>
+            <w:r>
+              <w:rPr>
+                <w:bCs/>
+                <w:color w:val="0D0D0D" w:themeColor="text1" w:themeTint="F2"/>
+              </w:rPr>
+              <w:t xml:space="preserve"> </w:t>
+            </w:r>
+            <w:proofErr w:type="spellStart"/>
+            <w:r>
+              <w:rPr>
+                <w:bCs/>
+                <w:color w:val="0D0D0D" w:themeColor="text1" w:themeTint="F2"/>
+              </w:rPr>
+              <w:t>بتسديد</w:t>
+            </w:r>
+            <w:proofErr w:type="spellEnd"/>
+            <w:r>
+              <w:rPr>
+                <w:bCs/>
+                <w:color w:val="0D0D0D" w:themeColor="text1" w:themeTint="F2"/>
+              </w:rPr>
+              <w:t xml:space="preserve"> </w:t>
+            </w:r>
+            <w:proofErr w:type="spellStart"/>
+            <w:r>
+              <w:rPr>
+                <w:bCs/>
+                <w:color w:val="0D0D0D" w:themeColor="text1" w:themeTint="F2"/>
+              </w:rPr>
+              <w:t>جميع</w:t>
+            </w:r>
+            <w:proofErr w:type="spellEnd"/>
+            <w:r>
+              <w:rPr>
+                <w:bCs/>
+                <w:color w:val="0D0D0D" w:themeColor="text1" w:themeTint="F2"/>
+              </w:rPr>
+              <w:t xml:space="preserve"> </w:t>
+            </w:r>
+            <w:proofErr w:type="spellStart"/>
+            <w:r>
+              <w:rPr>
+                <w:bCs/>
+                <w:color w:val="0D0D0D" w:themeColor="text1" w:themeTint="F2"/>
+              </w:rPr>
+              <w:t>رسوم</w:t>
+            </w:r>
+            <w:proofErr w:type="spellEnd"/>
+            <w:r>
+              <w:rPr>
+                <w:bCs/>
+                <w:color w:val="0D0D0D" w:themeColor="text1" w:themeTint="F2"/>
+              </w:rPr>
+              <w:t xml:space="preserve"> و </w:t>
+            </w:r>
+            <w:proofErr w:type="spellStart"/>
+            <w:r>
+              <w:rPr>
+                <w:bCs/>
+                <w:color w:val="0D0D0D" w:themeColor="text1" w:themeTint="F2"/>
+              </w:rPr>
+              <w:t>تكاليف</w:t>
+            </w:r>
+            <w:proofErr w:type="spellEnd"/>
+            <w:r>
+              <w:rPr>
+                <w:bCs/>
+                <w:color w:val="0D0D0D" w:themeColor="text1" w:themeTint="F2"/>
+              </w:rPr>
+              <w:t xml:space="preserve"> </w:t>
+            </w:r>
+            <w:proofErr w:type="spellStart"/>
+            <w:r>
+              <w:rPr>
+                <w:bCs/>
+                <w:color w:val="0D0D0D" w:themeColor="text1" w:themeTint="F2"/>
+              </w:rPr>
+              <w:t>استهلاكهم</w:t>
+            </w:r>
+            <w:proofErr w:type="spellEnd"/>
+            <w:r>
+              <w:rPr>
+                <w:bCs/>
+                <w:color w:val="0D0D0D" w:themeColor="text1" w:themeTint="F2"/>
+              </w:rPr>
+              <w:t xml:space="preserve"> </w:t>
+            </w:r>
+            <w:proofErr w:type="spellStart"/>
+            <w:r>
+              <w:rPr>
+                <w:bCs/>
+                <w:color w:val="0D0D0D" w:themeColor="text1" w:themeTint="F2"/>
+              </w:rPr>
+              <w:t>من</w:t>
+            </w:r>
+            <w:proofErr w:type="spellEnd"/>
+            <w:r>
+              <w:rPr>
+                <w:bCs/>
+                <w:color w:val="0D0D0D" w:themeColor="text1" w:themeTint="F2"/>
+              </w:rPr>
+              <w:t xml:space="preserve"> </w:t>
+            </w:r>
+            <w:proofErr w:type="spellStart"/>
+            <w:r>
+              <w:rPr>
+                <w:bCs/>
+                <w:color w:val="0D0D0D" w:themeColor="text1" w:themeTint="F2"/>
+              </w:rPr>
+              <w:t>الكهرباء</w:t>
+            </w:r>
+            <w:proofErr w:type="spellEnd"/>
+            <w:r>
+              <w:rPr>
+                <w:bCs/>
+                <w:color w:val="0D0D0D" w:themeColor="text1" w:themeTint="F2"/>
+              </w:rPr>
+              <w:t xml:space="preserve"> و </w:t>
+            </w:r>
+            <w:proofErr w:type="spellStart"/>
+            <w:r>
+              <w:rPr>
+                <w:bCs/>
+                <w:color w:val="0D0D0D" w:themeColor="text1" w:themeTint="F2"/>
+              </w:rPr>
+              <w:t>الماء</w:t>
+            </w:r>
+            <w:proofErr w:type="spellEnd"/>
+            <w:r>
+              <w:rPr>
+                <w:bCs/>
+                <w:color w:val="0D0D0D" w:themeColor="text1" w:themeTint="F2"/>
+              </w:rPr>
+              <w:t xml:space="preserve"> و </w:t>
+            </w:r>
+            <w:proofErr w:type="spellStart"/>
+            <w:r>
+              <w:rPr>
+                <w:bCs/>
+                <w:color w:val="0D0D0D" w:themeColor="text1" w:themeTint="F2"/>
+              </w:rPr>
+              <w:t>استعمال</w:t>
+            </w:r>
+            <w:proofErr w:type="spellEnd"/>
+            <w:r>
+              <w:rPr>
+                <w:bCs/>
+                <w:color w:val="0D0D0D" w:themeColor="text1" w:themeTint="F2"/>
+              </w:rPr>
+              <w:t xml:space="preserve"> </w:t>
+            </w:r>
+            <w:proofErr w:type="spellStart"/>
+            <w:r>
+              <w:rPr>
+                <w:bCs/>
+                <w:color w:val="0D0D0D" w:themeColor="text1" w:themeTint="F2"/>
+              </w:rPr>
+              <w:t>الهاتف</w:t>
+            </w:r>
+            <w:proofErr w:type="spellEnd"/>
+            <w:r>
+              <w:rPr>
+                <w:bCs/>
+                <w:color w:val="0D0D0D" w:themeColor="text1" w:themeTint="F2"/>
+              </w:rPr>
+              <w:t xml:space="preserve"> / </w:t>
+            </w:r>
+            <w:proofErr w:type="spellStart"/>
+            <w:r>
+              <w:rPr>
+                <w:bCs/>
+                <w:color w:val="0D0D0D" w:themeColor="text1" w:themeTint="F2"/>
+              </w:rPr>
+              <w:t>الفاكس</w:t>
+            </w:r>
+            <w:proofErr w:type="spellEnd"/>
+            <w:r>
+              <w:rPr>
+                <w:bCs/>
+                <w:color w:val="0D0D0D" w:themeColor="text1" w:themeTint="F2"/>
+              </w:rPr>
+              <w:t xml:space="preserve"> / </w:t>
+            </w:r>
+            <w:proofErr w:type="spellStart"/>
+            <w:r>
+              <w:rPr>
+                <w:bCs/>
+                <w:color w:val="0D0D0D" w:themeColor="text1" w:themeTint="F2"/>
+              </w:rPr>
+              <w:t>التكييف</w:t>
+            </w:r>
+            <w:proofErr w:type="spellEnd"/>
+            <w:r>
+              <w:rPr>
+                <w:bCs/>
+                <w:color w:val="0D0D0D" w:themeColor="text1" w:themeTint="F2"/>
+              </w:rPr>
+              <w:t xml:space="preserve"> .. و </w:t>
+            </w:r>
+            <w:proofErr w:type="spellStart"/>
             <w:proofErr w:type="gramStart"/>
             <w:r>
               <w:rPr>
                 <w:bCs/>
                 <w:color w:val="0D0D0D" w:themeColor="text1" w:themeTint="F2"/>
               </w:rPr>
-              <w:t>غيره.③</w:t>
+              <w:t>غيره</w:t>
+            </w:r>
+            <w:proofErr w:type="spellEnd"/>
+            <w:r>
+              <w:rPr>
+                <w:bCs/>
+                <w:color w:val="0D0D0D" w:themeColor="text1" w:themeTint="F2"/>
+              </w:rPr>
+              <w:t>.③</w:t>
             </w:r>
             <w:proofErr w:type="gramEnd"/>
             <w:r>
@@ -4660,12 +6628,549 @@
               </w:rPr>
               <w:br/>
             </w:r>
-            <w:r>
-              <w:rPr>
-                <w:bCs/>
-                <w:color w:val="0D0D0D" w:themeColor="text1" w:themeTint="F2"/>
-              </w:rPr>
-              <w:t>في حالة نشوء أي مسألة لم يتم النص عليها صراحة ضمن الشروط الخاصة في هذا العقد أو ضمن أحكام قانون الإيجارات تنطبق بشأنها أحكام النصوص العامة في قانون المعاملات المدنية الساري المفعول في الدولة.④</w:t>
+            <w:proofErr w:type="spellStart"/>
+            <w:r>
+              <w:rPr>
+                <w:bCs/>
+                <w:color w:val="0D0D0D" w:themeColor="text1" w:themeTint="F2"/>
+              </w:rPr>
+              <w:t>في</w:t>
+            </w:r>
+            <w:proofErr w:type="spellEnd"/>
+            <w:r>
+              <w:rPr>
+                <w:bCs/>
+                <w:color w:val="0D0D0D" w:themeColor="text1" w:themeTint="F2"/>
+              </w:rPr>
+              <w:t xml:space="preserve"> </w:t>
+            </w:r>
+            <w:proofErr w:type="spellStart"/>
+            <w:r>
+              <w:rPr>
+                <w:bCs/>
+                <w:color w:val="0D0D0D" w:themeColor="text1" w:themeTint="F2"/>
+              </w:rPr>
+              <w:t>حالة</w:t>
+            </w:r>
+            <w:proofErr w:type="spellEnd"/>
+            <w:r>
+              <w:rPr>
+                <w:bCs/>
+                <w:color w:val="0D0D0D" w:themeColor="text1" w:themeTint="F2"/>
+              </w:rPr>
+              <w:t xml:space="preserve"> </w:t>
+            </w:r>
+            <w:proofErr w:type="spellStart"/>
+            <w:r>
+              <w:rPr>
+                <w:bCs/>
+                <w:color w:val="0D0D0D" w:themeColor="text1" w:themeTint="F2"/>
+              </w:rPr>
+              <w:t>نشوء</w:t>
+            </w:r>
+            <w:proofErr w:type="spellEnd"/>
+            <w:r>
+              <w:rPr>
+                <w:bCs/>
+                <w:color w:val="0D0D0D" w:themeColor="text1" w:themeTint="F2"/>
+              </w:rPr>
+              <w:t xml:space="preserve"> </w:t>
+            </w:r>
+            <w:proofErr w:type="spellStart"/>
+            <w:r>
+              <w:rPr>
+                <w:bCs/>
+                <w:color w:val="0D0D0D" w:themeColor="text1" w:themeTint="F2"/>
+              </w:rPr>
+              <w:t>أي</w:t>
+            </w:r>
+            <w:proofErr w:type="spellEnd"/>
+            <w:r>
+              <w:rPr>
+                <w:bCs/>
+                <w:color w:val="0D0D0D" w:themeColor="text1" w:themeTint="F2"/>
+              </w:rPr>
+              <w:t xml:space="preserve"> </w:t>
+            </w:r>
+            <w:proofErr w:type="spellStart"/>
+            <w:r>
+              <w:rPr>
+                <w:bCs/>
+                <w:color w:val="0D0D0D" w:themeColor="text1" w:themeTint="F2"/>
+              </w:rPr>
+              <w:t>مسألة</w:t>
+            </w:r>
+            <w:proofErr w:type="spellEnd"/>
+            <w:r>
+              <w:rPr>
+                <w:bCs/>
+                <w:color w:val="0D0D0D" w:themeColor="text1" w:themeTint="F2"/>
+              </w:rPr>
+              <w:t xml:space="preserve"> </w:t>
+            </w:r>
+            <w:proofErr w:type="spellStart"/>
+            <w:r>
+              <w:rPr>
+                <w:bCs/>
+                <w:color w:val="0D0D0D" w:themeColor="text1" w:themeTint="F2"/>
+              </w:rPr>
+              <w:t>لم</w:t>
+            </w:r>
+            <w:proofErr w:type="spellEnd"/>
+            <w:r>
+              <w:rPr>
+                <w:bCs/>
+                <w:color w:val="0D0D0D" w:themeColor="text1" w:themeTint="F2"/>
+              </w:rPr>
+              <w:t xml:space="preserve"> </w:t>
+            </w:r>
+            <w:proofErr w:type="spellStart"/>
+            <w:r>
+              <w:rPr>
+                <w:bCs/>
+                <w:color w:val="0D0D0D" w:themeColor="text1" w:themeTint="F2"/>
+              </w:rPr>
+              <w:t>يتم</w:t>
+            </w:r>
+            <w:proofErr w:type="spellEnd"/>
+            <w:r>
+              <w:rPr>
+                <w:bCs/>
+                <w:color w:val="0D0D0D" w:themeColor="text1" w:themeTint="F2"/>
+              </w:rPr>
+              <w:t xml:space="preserve"> </w:t>
+            </w:r>
+            <w:proofErr w:type="spellStart"/>
+            <w:r>
+              <w:rPr>
+                <w:bCs/>
+                <w:color w:val="0D0D0D" w:themeColor="text1" w:themeTint="F2"/>
+              </w:rPr>
+              <w:t>النص</w:t>
+            </w:r>
+            <w:proofErr w:type="spellEnd"/>
+            <w:r>
+              <w:rPr>
+                <w:bCs/>
+                <w:color w:val="0D0D0D" w:themeColor="text1" w:themeTint="F2"/>
+              </w:rPr>
+              <w:t xml:space="preserve"> </w:t>
+            </w:r>
+            <w:proofErr w:type="spellStart"/>
+            <w:r>
+              <w:rPr>
+                <w:bCs/>
+                <w:color w:val="0D0D0D" w:themeColor="text1" w:themeTint="F2"/>
+              </w:rPr>
+              <w:t>عليها</w:t>
+            </w:r>
+            <w:proofErr w:type="spellEnd"/>
+            <w:r>
+              <w:rPr>
+                <w:bCs/>
+                <w:color w:val="0D0D0D" w:themeColor="text1" w:themeTint="F2"/>
+              </w:rPr>
+              <w:t xml:space="preserve"> </w:t>
+            </w:r>
+            <w:proofErr w:type="spellStart"/>
+            <w:r>
+              <w:rPr>
+                <w:bCs/>
+                <w:color w:val="0D0D0D" w:themeColor="text1" w:themeTint="F2"/>
+              </w:rPr>
+              <w:t>صراحة</w:t>
+            </w:r>
+            <w:proofErr w:type="spellEnd"/>
+            <w:r>
+              <w:rPr>
+                <w:bCs/>
+                <w:color w:val="0D0D0D" w:themeColor="text1" w:themeTint="F2"/>
+              </w:rPr>
+              <w:t xml:space="preserve"> </w:t>
+            </w:r>
+            <w:proofErr w:type="spellStart"/>
+            <w:r>
+              <w:rPr>
+                <w:bCs/>
+                <w:color w:val="0D0D0D" w:themeColor="text1" w:themeTint="F2"/>
+              </w:rPr>
+              <w:t>ضمن</w:t>
+            </w:r>
+            <w:proofErr w:type="spellEnd"/>
+            <w:r>
+              <w:rPr>
+                <w:bCs/>
+                <w:color w:val="0D0D0D" w:themeColor="text1" w:themeTint="F2"/>
+              </w:rPr>
+              <w:t xml:space="preserve"> </w:t>
+            </w:r>
+            <w:proofErr w:type="spellStart"/>
+            <w:r>
+              <w:rPr>
+                <w:bCs/>
+                <w:color w:val="0D0D0D" w:themeColor="text1" w:themeTint="F2"/>
+              </w:rPr>
+              <w:t>الشروط</w:t>
+            </w:r>
+            <w:proofErr w:type="spellEnd"/>
+            <w:r>
+              <w:rPr>
+                <w:bCs/>
+                <w:color w:val="0D0D0D" w:themeColor="text1" w:themeTint="F2"/>
+              </w:rPr>
+              <w:t xml:space="preserve"> </w:t>
+            </w:r>
+            <w:proofErr w:type="spellStart"/>
+            <w:r>
+              <w:rPr>
+                <w:bCs/>
+                <w:color w:val="0D0D0D" w:themeColor="text1" w:themeTint="F2"/>
+              </w:rPr>
+              <w:t>الخاصة</w:t>
+            </w:r>
+            <w:proofErr w:type="spellEnd"/>
+            <w:r>
+              <w:rPr>
+                <w:bCs/>
+                <w:color w:val="0D0D0D" w:themeColor="text1" w:themeTint="F2"/>
+              </w:rPr>
+              <w:t xml:space="preserve"> </w:t>
+            </w:r>
+            <w:proofErr w:type="spellStart"/>
+            <w:r>
+              <w:rPr>
+                <w:bCs/>
+                <w:color w:val="0D0D0D" w:themeColor="text1" w:themeTint="F2"/>
+              </w:rPr>
+              <w:t>في</w:t>
+            </w:r>
+            <w:proofErr w:type="spellEnd"/>
+            <w:r>
+              <w:rPr>
+                <w:bCs/>
+                <w:color w:val="0D0D0D" w:themeColor="text1" w:themeTint="F2"/>
+              </w:rPr>
+              <w:t xml:space="preserve"> </w:t>
+            </w:r>
+            <w:proofErr w:type="spellStart"/>
+            <w:r>
+              <w:rPr>
+                <w:bCs/>
+                <w:color w:val="0D0D0D" w:themeColor="text1" w:themeTint="F2"/>
+              </w:rPr>
+              <w:t>هذا</w:t>
+            </w:r>
+            <w:proofErr w:type="spellEnd"/>
+            <w:r>
+              <w:rPr>
+                <w:bCs/>
+                <w:color w:val="0D0D0D" w:themeColor="text1" w:themeTint="F2"/>
+              </w:rPr>
+              <w:t xml:space="preserve"> </w:t>
+            </w:r>
+            <w:proofErr w:type="spellStart"/>
+            <w:r>
+              <w:rPr>
+                <w:bCs/>
+                <w:color w:val="0D0D0D" w:themeColor="text1" w:themeTint="F2"/>
+              </w:rPr>
+              <w:t>العقد</w:t>
+            </w:r>
+            <w:proofErr w:type="spellEnd"/>
+            <w:r>
+              <w:rPr>
+                <w:bCs/>
+                <w:color w:val="0D0D0D" w:themeColor="text1" w:themeTint="F2"/>
+              </w:rPr>
+              <w:t xml:space="preserve"> </w:t>
+            </w:r>
+            <w:proofErr w:type="spellStart"/>
+            <w:r>
+              <w:rPr>
+                <w:bCs/>
+                <w:color w:val="0D0D0D" w:themeColor="text1" w:themeTint="F2"/>
+              </w:rPr>
+              <w:t>أو</w:t>
+            </w:r>
+            <w:proofErr w:type="spellEnd"/>
+            <w:r>
+              <w:rPr>
+                <w:bCs/>
+                <w:color w:val="0D0D0D" w:themeColor="text1" w:themeTint="F2"/>
+              </w:rPr>
+              <w:t xml:space="preserve"> </w:t>
+            </w:r>
+            <w:proofErr w:type="spellStart"/>
+            <w:r>
+              <w:rPr>
+                <w:bCs/>
+                <w:color w:val="0D0D0D" w:themeColor="text1" w:themeTint="F2"/>
+              </w:rPr>
+              <w:t>ضمن</w:t>
+            </w:r>
+            <w:proofErr w:type="spellEnd"/>
+            <w:r>
+              <w:rPr>
+                <w:bCs/>
+                <w:color w:val="0D0D0D" w:themeColor="text1" w:themeTint="F2"/>
+              </w:rPr>
+              <w:t xml:space="preserve"> </w:t>
+            </w:r>
+            <w:proofErr w:type="spellStart"/>
+            <w:r>
+              <w:rPr>
+                <w:bCs/>
+                <w:color w:val="0D0D0D" w:themeColor="text1" w:themeTint="F2"/>
+              </w:rPr>
+              <w:t>أحكام</w:t>
+            </w:r>
+            <w:proofErr w:type="spellEnd"/>
+            <w:r>
+              <w:rPr>
+                <w:bCs/>
+                <w:color w:val="0D0D0D" w:themeColor="text1" w:themeTint="F2"/>
+              </w:rPr>
+              <w:t xml:space="preserve"> </w:t>
+            </w:r>
+            <w:proofErr w:type="spellStart"/>
+            <w:r>
+              <w:rPr>
+                <w:bCs/>
+                <w:color w:val="0D0D0D" w:themeColor="text1" w:themeTint="F2"/>
+              </w:rPr>
+              <w:t>قانون</w:t>
+            </w:r>
+            <w:proofErr w:type="spellEnd"/>
+            <w:r>
+              <w:rPr>
+                <w:bCs/>
+                <w:color w:val="0D0D0D" w:themeColor="text1" w:themeTint="F2"/>
+              </w:rPr>
+              <w:t xml:space="preserve"> </w:t>
+            </w:r>
+            <w:proofErr w:type="spellStart"/>
+            <w:r>
+              <w:rPr>
+                <w:bCs/>
+                <w:color w:val="0D0D0D" w:themeColor="text1" w:themeTint="F2"/>
+              </w:rPr>
+              <w:t>الإيجارات</w:t>
+            </w:r>
+            <w:proofErr w:type="spellEnd"/>
+            <w:r>
+              <w:rPr>
+                <w:bCs/>
+                <w:color w:val="0D0D0D" w:themeColor="text1" w:themeTint="F2"/>
+              </w:rPr>
+              <w:t xml:space="preserve"> </w:t>
+            </w:r>
+            <w:proofErr w:type="spellStart"/>
+            <w:r>
+              <w:rPr>
+                <w:bCs/>
+                <w:color w:val="0D0D0D" w:themeColor="text1" w:themeTint="F2"/>
+              </w:rPr>
+              <w:t>تنطبق</w:t>
+            </w:r>
+            <w:proofErr w:type="spellEnd"/>
+            <w:r>
+              <w:rPr>
+                <w:bCs/>
+                <w:color w:val="0D0D0D" w:themeColor="text1" w:themeTint="F2"/>
+              </w:rPr>
+              <w:t xml:space="preserve"> </w:t>
+            </w:r>
+            <w:proofErr w:type="spellStart"/>
+            <w:r>
+              <w:rPr>
+                <w:bCs/>
+                <w:color w:val="0D0D0D" w:themeColor="text1" w:themeTint="F2"/>
+              </w:rPr>
+              <w:t>بشأنها</w:t>
+            </w:r>
+            <w:proofErr w:type="spellEnd"/>
+            <w:r>
+              <w:rPr>
+                <w:bCs/>
+                <w:color w:val="0D0D0D" w:themeColor="text1" w:themeTint="F2"/>
+              </w:rPr>
+              <w:t xml:space="preserve"> </w:t>
+            </w:r>
+            <w:proofErr w:type="spellStart"/>
+            <w:r>
+              <w:rPr>
+                <w:bCs/>
+                <w:color w:val="0D0D0D" w:themeColor="text1" w:themeTint="F2"/>
+              </w:rPr>
+              <w:t>أحكام</w:t>
+            </w:r>
+            <w:proofErr w:type="spellEnd"/>
+            <w:r>
+              <w:rPr>
+                <w:bCs/>
+                <w:color w:val="0D0D0D" w:themeColor="text1" w:themeTint="F2"/>
+              </w:rPr>
+              <w:t xml:space="preserve"> </w:t>
+            </w:r>
+            <w:proofErr w:type="spellStart"/>
+            <w:r>
+              <w:rPr>
+                <w:bCs/>
+                <w:color w:val="0D0D0D" w:themeColor="text1" w:themeTint="F2"/>
+              </w:rPr>
+              <w:t>النصوص</w:t>
+            </w:r>
+            <w:proofErr w:type="spellEnd"/>
+            <w:r>
+              <w:rPr>
+                <w:bCs/>
+                <w:color w:val="0D0D0D" w:themeColor="text1" w:themeTint="F2"/>
+              </w:rPr>
+              <w:t xml:space="preserve"> </w:t>
+            </w:r>
+            <w:proofErr w:type="spellStart"/>
+            <w:r>
+              <w:rPr>
+                <w:bCs/>
+                <w:color w:val="0D0D0D" w:themeColor="text1" w:themeTint="F2"/>
+              </w:rPr>
+              <w:t>العامة</w:t>
+            </w:r>
+            <w:proofErr w:type="spellEnd"/>
+            <w:r>
+              <w:rPr>
+                <w:bCs/>
+                <w:color w:val="0D0D0D" w:themeColor="text1" w:themeTint="F2"/>
+              </w:rPr>
+              <w:t xml:space="preserve"> </w:t>
+            </w:r>
+            <w:proofErr w:type="spellStart"/>
+            <w:r>
+              <w:rPr>
+                <w:bCs/>
+                <w:color w:val="0D0D0D" w:themeColor="text1" w:themeTint="F2"/>
+              </w:rPr>
+              <w:t>في</w:t>
+            </w:r>
+            <w:proofErr w:type="spellEnd"/>
+            <w:r>
+              <w:rPr>
+                <w:bCs/>
+                <w:color w:val="0D0D0D" w:themeColor="text1" w:themeTint="F2"/>
+              </w:rPr>
+              <w:t xml:space="preserve"> </w:t>
+            </w:r>
+            <w:proofErr w:type="spellStart"/>
+            <w:r>
+              <w:rPr>
+                <w:bCs/>
+                <w:color w:val="0D0D0D" w:themeColor="text1" w:themeTint="F2"/>
+              </w:rPr>
+              <w:t>قانون</w:t>
+            </w:r>
+            <w:proofErr w:type="spellEnd"/>
+            <w:r>
+              <w:rPr>
+                <w:bCs/>
+                <w:color w:val="0D0D0D" w:themeColor="text1" w:themeTint="F2"/>
+              </w:rPr>
+              <w:t xml:space="preserve"> </w:t>
+            </w:r>
+            <w:proofErr w:type="spellStart"/>
+            <w:r>
+              <w:rPr>
+                <w:bCs/>
+                <w:color w:val="0D0D0D" w:themeColor="text1" w:themeTint="F2"/>
+              </w:rPr>
+              <w:t>المعاملات</w:t>
+            </w:r>
+            <w:proofErr w:type="spellEnd"/>
+            <w:r>
+              <w:rPr>
+                <w:bCs/>
+                <w:color w:val="0D0D0D" w:themeColor="text1" w:themeTint="F2"/>
+              </w:rPr>
+              <w:t xml:space="preserve"> </w:t>
+            </w:r>
+            <w:proofErr w:type="spellStart"/>
+            <w:r>
+              <w:rPr>
+                <w:bCs/>
+                <w:color w:val="0D0D0D" w:themeColor="text1" w:themeTint="F2"/>
+              </w:rPr>
+              <w:t>المدنية</w:t>
+            </w:r>
+            <w:proofErr w:type="spellEnd"/>
+            <w:r>
+              <w:rPr>
+                <w:bCs/>
+                <w:color w:val="0D0D0D" w:themeColor="text1" w:themeTint="F2"/>
+              </w:rPr>
+              <w:t xml:space="preserve"> </w:t>
+            </w:r>
+            <w:proofErr w:type="spellStart"/>
+            <w:r>
+              <w:rPr>
+                <w:bCs/>
+                <w:color w:val="0D0D0D" w:themeColor="text1" w:themeTint="F2"/>
+              </w:rPr>
+              <w:t>الساري</w:t>
+            </w:r>
+            <w:proofErr w:type="spellEnd"/>
+            <w:r>
+              <w:rPr>
+                <w:bCs/>
+                <w:color w:val="0D0D0D" w:themeColor="text1" w:themeTint="F2"/>
+              </w:rPr>
+              <w:t xml:space="preserve"> </w:t>
+            </w:r>
+            <w:proofErr w:type="spellStart"/>
+            <w:r>
+              <w:rPr>
+                <w:bCs/>
+                <w:color w:val="0D0D0D" w:themeColor="text1" w:themeTint="F2"/>
+              </w:rPr>
+              <w:t>المفعول</w:t>
+            </w:r>
+            <w:proofErr w:type="spellEnd"/>
+            <w:r>
+              <w:rPr>
+                <w:bCs/>
+                <w:color w:val="0D0D0D" w:themeColor="text1" w:themeTint="F2"/>
+              </w:rPr>
+              <w:t xml:space="preserve"> </w:t>
+            </w:r>
+            <w:proofErr w:type="spellStart"/>
+            <w:r>
+              <w:rPr>
+                <w:bCs/>
+                <w:color w:val="0D0D0D" w:themeColor="text1" w:themeTint="F2"/>
+              </w:rPr>
+              <w:t>في</w:t>
+            </w:r>
+            <w:proofErr w:type="spellEnd"/>
+            <w:r>
+              <w:rPr>
+                <w:bCs/>
+                <w:color w:val="0D0D0D" w:themeColor="text1" w:themeTint="F2"/>
+              </w:rPr>
+              <w:t xml:space="preserve"> </w:t>
+            </w:r>
+            <w:proofErr w:type="spellStart"/>
+            <w:r>
+              <w:rPr>
+                <w:bCs/>
+                <w:color w:val="0D0D0D" w:themeColor="text1" w:themeTint="F2"/>
+              </w:rPr>
+              <w:t>الدولة</w:t>
+            </w:r>
+            <w:proofErr w:type="spellEnd"/>
+            <w:r>
+              <w:rPr>
+                <w:bCs/>
+                <w:color w:val="0D0D0D" w:themeColor="text1" w:themeTint="F2"/>
+              </w:rPr>
+              <w:t>.④</w:t>
             </w:r>
             <w:r>
               <w:rPr>
@@ -4685,12 +7190,261 @@
               </w:rPr>
               <w:br/>
             </w:r>
-            <w:r>
-              <w:rPr>
-                <w:bCs/>
-                <w:color w:val="0D0D0D" w:themeColor="text1" w:themeTint="F2"/>
-              </w:rPr>
-              <w:t>يلتزم المؤجر و المستأجر بكافة القوانين والقرارات الصادرة بشأنها و هم الملزمة للأطراف و الأحكام المسموح بها للسكن فقط.⑤</w:t>
+            <w:proofErr w:type="spellStart"/>
+            <w:r>
+              <w:rPr>
+                <w:bCs/>
+                <w:color w:val="0D0D0D" w:themeColor="text1" w:themeTint="F2"/>
+              </w:rPr>
+              <w:t>يلتزم</w:t>
+            </w:r>
+            <w:proofErr w:type="spellEnd"/>
+            <w:r>
+              <w:rPr>
+                <w:bCs/>
+                <w:color w:val="0D0D0D" w:themeColor="text1" w:themeTint="F2"/>
+              </w:rPr>
+              <w:t xml:space="preserve"> </w:t>
+            </w:r>
+            <w:proofErr w:type="spellStart"/>
+            <w:r>
+              <w:rPr>
+                <w:bCs/>
+                <w:color w:val="0D0D0D" w:themeColor="text1" w:themeTint="F2"/>
+              </w:rPr>
+              <w:t>المؤجر</w:t>
+            </w:r>
+            <w:proofErr w:type="spellEnd"/>
+            <w:r>
+              <w:rPr>
+                <w:bCs/>
+                <w:color w:val="0D0D0D" w:themeColor="text1" w:themeTint="F2"/>
+              </w:rPr>
+              <w:t xml:space="preserve"> و </w:t>
+            </w:r>
+            <w:proofErr w:type="spellStart"/>
+            <w:r>
+              <w:rPr>
+                <w:bCs/>
+                <w:color w:val="0D0D0D" w:themeColor="text1" w:themeTint="F2"/>
+              </w:rPr>
+              <w:t>المستأجر</w:t>
+            </w:r>
+            <w:proofErr w:type="spellEnd"/>
+            <w:r>
+              <w:rPr>
+                <w:bCs/>
+                <w:color w:val="0D0D0D" w:themeColor="text1" w:themeTint="F2"/>
+              </w:rPr>
+              <w:t xml:space="preserve"> </w:t>
+            </w:r>
+            <w:proofErr w:type="spellStart"/>
+            <w:r>
+              <w:rPr>
+                <w:bCs/>
+                <w:color w:val="0D0D0D" w:themeColor="text1" w:themeTint="F2"/>
+              </w:rPr>
+              <w:t>بكافة</w:t>
+            </w:r>
+            <w:proofErr w:type="spellEnd"/>
+            <w:r>
+              <w:rPr>
+                <w:bCs/>
+                <w:color w:val="0D0D0D" w:themeColor="text1" w:themeTint="F2"/>
+              </w:rPr>
+              <w:t xml:space="preserve"> </w:t>
+            </w:r>
+            <w:proofErr w:type="spellStart"/>
+            <w:r>
+              <w:rPr>
+                <w:bCs/>
+                <w:color w:val="0D0D0D" w:themeColor="text1" w:themeTint="F2"/>
+              </w:rPr>
+              <w:t>القوانين</w:t>
+            </w:r>
+            <w:proofErr w:type="spellEnd"/>
+            <w:r>
+              <w:rPr>
+                <w:bCs/>
+                <w:color w:val="0D0D0D" w:themeColor="text1" w:themeTint="F2"/>
+              </w:rPr>
+              <w:t xml:space="preserve"> </w:t>
+            </w:r>
+            <w:proofErr w:type="spellStart"/>
+            <w:r>
+              <w:rPr>
+                <w:bCs/>
+                <w:color w:val="0D0D0D" w:themeColor="text1" w:themeTint="F2"/>
+              </w:rPr>
+              <w:t>والقرارات</w:t>
+            </w:r>
+            <w:proofErr w:type="spellEnd"/>
+            <w:r>
+              <w:rPr>
+                <w:bCs/>
+                <w:color w:val="0D0D0D" w:themeColor="text1" w:themeTint="F2"/>
+              </w:rPr>
+              <w:t xml:space="preserve"> </w:t>
+            </w:r>
+            <w:proofErr w:type="spellStart"/>
+            <w:r>
+              <w:rPr>
+                <w:bCs/>
+                <w:color w:val="0D0D0D" w:themeColor="text1" w:themeTint="F2"/>
+              </w:rPr>
+              <w:t>الصادرة</w:t>
+            </w:r>
+            <w:proofErr w:type="spellEnd"/>
+            <w:r>
+              <w:rPr>
+                <w:bCs/>
+                <w:color w:val="0D0D0D" w:themeColor="text1" w:themeTint="F2"/>
+              </w:rPr>
+              <w:t xml:space="preserve"> </w:t>
+            </w:r>
+            <w:proofErr w:type="spellStart"/>
+            <w:r>
+              <w:rPr>
+                <w:bCs/>
+                <w:color w:val="0D0D0D" w:themeColor="text1" w:themeTint="F2"/>
+              </w:rPr>
+              <w:t>بشأنها</w:t>
+            </w:r>
+            <w:proofErr w:type="spellEnd"/>
+            <w:r>
+              <w:rPr>
+                <w:bCs/>
+                <w:color w:val="0D0D0D" w:themeColor="text1" w:themeTint="F2"/>
+              </w:rPr>
+              <w:t xml:space="preserve"> و </w:t>
+            </w:r>
+            <w:proofErr w:type="spellStart"/>
+            <w:r>
+              <w:rPr>
+                <w:bCs/>
+                <w:color w:val="0D0D0D" w:themeColor="text1" w:themeTint="F2"/>
+              </w:rPr>
+              <w:t>هم</w:t>
+            </w:r>
+            <w:proofErr w:type="spellEnd"/>
+            <w:r>
+              <w:rPr>
+                <w:bCs/>
+                <w:color w:val="0D0D0D" w:themeColor="text1" w:themeTint="F2"/>
+              </w:rPr>
+              <w:t xml:space="preserve"> </w:t>
+            </w:r>
+            <w:proofErr w:type="spellStart"/>
+            <w:r>
+              <w:rPr>
+                <w:bCs/>
+                <w:color w:val="0D0D0D" w:themeColor="text1" w:themeTint="F2"/>
+              </w:rPr>
+              <w:t>الملزمة</w:t>
+            </w:r>
+            <w:proofErr w:type="spellEnd"/>
+            <w:r>
+              <w:rPr>
+                <w:bCs/>
+                <w:color w:val="0D0D0D" w:themeColor="text1" w:themeTint="F2"/>
+              </w:rPr>
+              <w:t xml:space="preserve"> </w:t>
+            </w:r>
+            <w:proofErr w:type="spellStart"/>
+            <w:r>
+              <w:rPr>
+                <w:bCs/>
+                <w:color w:val="0D0D0D" w:themeColor="text1" w:themeTint="F2"/>
+              </w:rPr>
+              <w:t>للأطراف</w:t>
+            </w:r>
+            <w:proofErr w:type="spellEnd"/>
+            <w:r>
+              <w:rPr>
+                <w:bCs/>
+                <w:color w:val="0D0D0D" w:themeColor="text1" w:themeTint="F2"/>
+              </w:rPr>
+              <w:t xml:space="preserve"> و </w:t>
+            </w:r>
+            <w:proofErr w:type="spellStart"/>
+            <w:r>
+              <w:rPr>
+                <w:bCs/>
+                <w:color w:val="0D0D0D" w:themeColor="text1" w:themeTint="F2"/>
+              </w:rPr>
+              <w:t>الأحكام</w:t>
+            </w:r>
+            <w:proofErr w:type="spellEnd"/>
+            <w:r>
+              <w:rPr>
+                <w:bCs/>
+                <w:color w:val="0D0D0D" w:themeColor="text1" w:themeTint="F2"/>
+              </w:rPr>
+              <w:t xml:space="preserve"> </w:t>
+            </w:r>
+            <w:proofErr w:type="spellStart"/>
+            <w:r>
+              <w:rPr>
+                <w:bCs/>
+                <w:color w:val="0D0D0D" w:themeColor="text1" w:themeTint="F2"/>
+              </w:rPr>
+              <w:t>المسموح</w:t>
+            </w:r>
+            <w:proofErr w:type="spellEnd"/>
+            <w:r>
+              <w:rPr>
+                <w:bCs/>
+                <w:color w:val="0D0D0D" w:themeColor="text1" w:themeTint="F2"/>
+              </w:rPr>
+              <w:t xml:space="preserve"> </w:t>
+            </w:r>
+            <w:proofErr w:type="spellStart"/>
+            <w:r>
+              <w:rPr>
+                <w:bCs/>
+                <w:color w:val="0D0D0D" w:themeColor="text1" w:themeTint="F2"/>
+              </w:rPr>
+              <w:t>بها</w:t>
+            </w:r>
+            <w:proofErr w:type="spellEnd"/>
+            <w:r>
+              <w:rPr>
+                <w:bCs/>
+                <w:color w:val="0D0D0D" w:themeColor="text1" w:themeTint="F2"/>
+              </w:rPr>
+              <w:t xml:space="preserve"> </w:t>
+            </w:r>
+            <w:proofErr w:type="spellStart"/>
+            <w:r>
+              <w:rPr>
+                <w:bCs/>
+                <w:color w:val="0D0D0D" w:themeColor="text1" w:themeTint="F2"/>
+              </w:rPr>
+              <w:t>للسكن</w:t>
+            </w:r>
+            <w:proofErr w:type="spellEnd"/>
+            <w:r>
+              <w:rPr>
+                <w:bCs/>
+                <w:color w:val="0D0D0D" w:themeColor="text1" w:themeTint="F2"/>
+              </w:rPr>
+              <w:t xml:space="preserve"> </w:t>
+            </w:r>
+            <w:proofErr w:type="spellStart"/>
+            <w:r>
+              <w:rPr>
+                <w:bCs/>
+                <w:color w:val="0D0D0D" w:themeColor="text1" w:themeTint="F2"/>
+              </w:rPr>
+              <w:t>فقط</w:t>
+            </w:r>
+            <w:proofErr w:type="spellEnd"/>
+            <w:r>
+              <w:rPr>
+                <w:bCs/>
+                <w:color w:val="0D0D0D" w:themeColor="text1" w:themeTint="F2"/>
+              </w:rPr>
+              <w:t>.⑤</w:t>
             </w:r>
             <w:r>
               <w:rPr>
@@ -4710,12 +7464,517 @@
               </w:rPr>
               <w:br/>
             </w:r>
-            <w:r>
-              <w:rPr>
-                <w:bCs/>
-                <w:color w:val="0D0D0D" w:themeColor="text1" w:themeTint="F2"/>
-              </w:rPr>
-              <w:t>أي إخطار بتجديد العقد أو عدم الرغبة في تجديده أو طلب زيادة البدل أو انتقاصه لابد و أن يتم قبل ثلاثة أشهر من تاريخ انتهاء عقد الإيجار القائم و الا اعتبر كأن لم يكن.⑥</w:t>
+            <w:proofErr w:type="spellStart"/>
+            <w:r>
+              <w:rPr>
+                <w:bCs/>
+                <w:color w:val="0D0D0D" w:themeColor="text1" w:themeTint="F2"/>
+              </w:rPr>
+              <w:t>أي</w:t>
+            </w:r>
+            <w:proofErr w:type="spellEnd"/>
+            <w:r>
+              <w:rPr>
+                <w:bCs/>
+                <w:color w:val="0D0D0D" w:themeColor="text1" w:themeTint="F2"/>
+              </w:rPr>
+              <w:t xml:space="preserve"> </w:t>
+            </w:r>
+            <w:proofErr w:type="spellStart"/>
+            <w:r>
+              <w:rPr>
+                <w:bCs/>
+                <w:color w:val="0D0D0D" w:themeColor="text1" w:themeTint="F2"/>
+              </w:rPr>
+              <w:t>إخطار</w:t>
+            </w:r>
+            <w:proofErr w:type="spellEnd"/>
+            <w:r>
+              <w:rPr>
+                <w:bCs/>
+                <w:color w:val="0D0D0D" w:themeColor="text1" w:themeTint="F2"/>
+              </w:rPr>
+              <w:t xml:space="preserve"> </w:t>
+            </w:r>
+            <w:proofErr w:type="spellStart"/>
+            <w:r>
+              <w:rPr>
+                <w:bCs/>
+                <w:color w:val="0D0D0D" w:themeColor="text1" w:themeTint="F2"/>
+              </w:rPr>
+              <w:t>بتجديد</w:t>
+            </w:r>
+            <w:proofErr w:type="spellEnd"/>
+            <w:r>
+              <w:rPr>
+                <w:bCs/>
+                <w:color w:val="0D0D0D" w:themeColor="text1" w:themeTint="F2"/>
+              </w:rPr>
+              <w:t xml:space="preserve"> </w:t>
+            </w:r>
+            <w:proofErr w:type="spellStart"/>
+            <w:r>
+              <w:rPr>
+                <w:bCs/>
+                <w:color w:val="0D0D0D" w:themeColor="text1" w:themeTint="F2"/>
+              </w:rPr>
+              <w:t>العقد</w:t>
+            </w:r>
+            <w:proofErr w:type="spellEnd"/>
+            <w:r>
+              <w:rPr>
+                <w:bCs/>
+                <w:color w:val="0D0D0D" w:themeColor="text1" w:themeTint="F2"/>
+              </w:rPr>
+              <w:t xml:space="preserve"> </w:t>
+            </w:r>
+            <w:proofErr w:type="spellStart"/>
+            <w:r>
+              <w:rPr>
+                <w:bCs/>
+                <w:color w:val="0D0D0D" w:themeColor="text1" w:themeTint="F2"/>
+              </w:rPr>
+              <w:t>أو</w:t>
+            </w:r>
+            <w:proofErr w:type="spellEnd"/>
+            <w:r>
+              <w:rPr>
+                <w:bCs/>
+                <w:color w:val="0D0D0D" w:themeColor="text1" w:themeTint="F2"/>
+              </w:rPr>
+              <w:t xml:space="preserve"> </w:t>
+            </w:r>
+            <w:proofErr w:type="spellStart"/>
+            <w:r>
+              <w:rPr>
+                <w:bCs/>
+                <w:color w:val="0D0D0D" w:themeColor="text1" w:themeTint="F2"/>
+              </w:rPr>
+              <w:t>عدم</w:t>
+            </w:r>
+            <w:proofErr w:type="spellEnd"/>
+            <w:r>
+              <w:rPr>
+                <w:bCs/>
+                <w:color w:val="0D0D0D" w:themeColor="text1" w:themeTint="F2"/>
+              </w:rPr>
+              <w:t xml:space="preserve"> </w:t>
+            </w:r>
+            <w:proofErr w:type="spellStart"/>
+            <w:r>
+              <w:rPr>
+                <w:bCs/>
+                <w:color w:val="0D0D0D" w:themeColor="text1" w:themeTint="F2"/>
+              </w:rPr>
+              <w:t>الرغبة</w:t>
+            </w:r>
+            <w:proofErr w:type="spellEnd"/>
+            <w:r>
+              <w:rPr>
+                <w:bCs/>
+                <w:color w:val="0D0D0D" w:themeColor="text1" w:themeTint="F2"/>
+              </w:rPr>
+              <w:t xml:space="preserve"> </w:t>
+            </w:r>
+            <w:proofErr w:type="spellStart"/>
+            <w:r>
+              <w:rPr>
+                <w:bCs/>
+                <w:color w:val="0D0D0D" w:themeColor="text1" w:themeTint="F2"/>
+              </w:rPr>
+              <w:t>في</w:t>
+            </w:r>
+            <w:proofErr w:type="spellEnd"/>
+            <w:r>
+              <w:rPr>
+                <w:bCs/>
+                <w:color w:val="0D0D0D" w:themeColor="text1" w:themeTint="F2"/>
+              </w:rPr>
+              <w:t xml:space="preserve"> </w:t>
+            </w:r>
+            <w:proofErr w:type="spellStart"/>
+            <w:r>
+              <w:rPr>
+                <w:bCs/>
+                <w:color w:val="0D0D0D" w:themeColor="text1" w:themeTint="F2"/>
+              </w:rPr>
+              <w:t>تجديده</w:t>
+            </w:r>
+            <w:proofErr w:type="spellEnd"/>
+            <w:r>
+              <w:rPr>
+                <w:bCs/>
+                <w:color w:val="0D0D0D" w:themeColor="text1" w:themeTint="F2"/>
+              </w:rPr>
+              <w:t xml:space="preserve"> </w:t>
+            </w:r>
+            <w:proofErr w:type="spellStart"/>
+            <w:r>
+              <w:rPr>
+                <w:bCs/>
+                <w:color w:val="0D0D0D" w:themeColor="text1" w:themeTint="F2"/>
+              </w:rPr>
+              <w:t>أو</w:t>
+            </w:r>
+            <w:proofErr w:type="spellEnd"/>
+            <w:r>
+              <w:rPr>
+                <w:bCs/>
+                <w:color w:val="0D0D0D" w:themeColor="text1" w:themeTint="F2"/>
+              </w:rPr>
+              <w:t xml:space="preserve"> </w:t>
+            </w:r>
+            <w:proofErr w:type="spellStart"/>
+            <w:r>
+              <w:rPr>
+                <w:bCs/>
+                <w:color w:val="0D0D0D" w:themeColor="text1" w:themeTint="F2"/>
+              </w:rPr>
+              <w:t>طلب</w:t>
+            </w:r>
+            <w:proofErr w:type="spellEnd"/>
+            <w:r>
+              <w:rPr>
+                <w:bCs/>
+                <w:color w:val="0D0D0D" w:themeColor="text1" w:themeTint="F2"/>
+              </w:rPr>
+              <w:t xml:space="preserve"> </w:t>
+            </w:r>
+            <w:proofErr w:type="spellStart"/>
+            <w:r>
+              <w:rPr>
+                <w:bCs/>
+                <w:color w:val="0D0D0D" w:themeColor="text1" w:themeTint="F2"/>
+              </w:rPr>
+              <w:t>زيادة</w:t>
+            </w:r>
+            <w:proofErr w:type="spellEnd"/>
+            <w:r>
+              <w:rPr>
+                <w:bCs/>
+                <w:color w:val="0D0D0D" w:themeColor="text1" w:themeTint="F2"/>
+              </w:rPr>
+              <w:t xml:space="preserve"> </w:t>
+            </w:r>
+            <w:proofErr w:type="spellStart"/>
+            <w:r>
+              <w:rPr>
+                <w:bCs/>
+                <w:color w:val="0D0D0D" w:themeColor="text1" w:themeTint="F2"/>
+              </w:rPr>
+              <w:t>البدل</w:t>
+            </w:r>
+            <w:proofErr w:type="spellEnd"/>
+            <w:r>
+              <w:rPr>
+                <w:bCs/>
+                <w:color w:val="0D0D0D" w:themeColor="text1" w:themeTint="F2"/>
+              </w:rPr>
+              <w:t xml:space="preserve"> </w:t>
+            </w:r>
+            <w:proofErr w:type="spellStart"/>
+            <w:r>
+              <w:rPr>
+                <w:bCs/>
+                <w:color w:val="0D0D0D" w:themeColor="text1" w:themeTint="F2"/>
+              </w:rPr>
+              <w:t>أو</w:t>
+            </w:r>
+            <w:proofErr w:type="spellEnd"/>
+            <w:r>
+              <w:rPr>
+                <w:bCs/>
+                <w:color w:val="0D0D0D" w:themeColor="text1" w:themeTint="F2"/>
+              </w:rPr>
+              <w:t xml:space="preserve"> </w:t>
+            </w:r>
+            <w:proofErr w:type="spellStart"/>
+            <w:r>
+              <w:rPr>
+                <w:bCs/>
+                <w:color w:val="0D0D0D" w:themeColor="text1" w:themeTint="F2"/>
+              </w:rPr>
+              <w:t>انتقاصه</w:t>
+            </w:r>
+            <w:proofErr w:type="spellEnd"/>
+            <w:r>
+              <w:rPr>
+                <w:bCs/>
+                <w:color w:val="0D0D0D" w:themeColor="text1" w:themeTint="F2"/>
+              </w:rPr>
+              <w:t xml:space="preserve"> </w:t>
+            </w:r>
+            <w:proofErr w:type="spellStart"/>
+            <w:r>
+              <w:rPr>
+                <w:bCs/>
+                <w:color w:val="0D0D0D" w:themeColor="text1" w:themeTint="F2"/>
+              </w:rPr>
+              <w:t>لابد</w:t>
+            </w:r>
+            <w:proofErr w:type="spellEnd"/>
+            <w:r>
+              <w:rPr>
+                <w:bCs/>
+                <w:color w:val="0D0D0D" w:themeColor="text1" w:themeTint="F2"/>
+              </w:rPr>
+              <w:t xml:space="preserve"> و </w:t>
+            </w:r>
+            <w:proofErr w:type="spellStart"/>
+            <w:r>
+              <w:rPr>
+                <w:bCs/>
+                <w:color w:val="0D0D0D" w:themeColor="text1" w:themeTint="F2"/>
+              </w:rPr>
+              <w:t>أن</w:t>
+            </w:r>
+            <w:proofErr w:type="spellEnd"/>
+            <w:r>
+              <w:rPr>
+                <w:bCs/>
+                <w:color w:val="0D0D0D" w:themeColor="text1" w:themeTint="F2"/>
+              </w:rPr>
+              <w:t xml:space="preserve"> </w:t>
+            </w:r>
+            <w:proofErr w:type="spellStart"/>
+            <w:r>
+              <w:rPr>
+                <w:bCs/>
+                <w:color w:val="0D0D0D" w:themeColor="text1" w:themeTint="F2"/>
+              </w:rPr>
+              <w:t>يتم</w:t>
+            </w:r>
+            <w:proofErr w:type="spellEnd"/>
+            <w:r>
+              <w:rPr>
+                <w:bCs/>
+                <w:color w:val="0D0D0D" w:themeColor="text1" w:themeTint="F2"/>
+              </w:rPr>
+              <w:t xml:space="preserve"> </w:t>
+            </w:r>
+            <w:proofErr w:type="spellStart"/>
+            <w:r>
+              <w:rPr>
+                <w:bCs/>
+                <w:color w:val="0D0D0D" w:themeColor="text1" w:themeTint="F2"/>
+              </w:rPr>
+              <w:t>قبل</w:t>
+            </w:r>
+            <w:proofErr w:type="spellEnd"/>
+            <w:r>
+              <w:rPr>
+                <w:bCs/>
+                <w:color w:val="0D0D0D" w:themeColor="text1" w:themeTint="F2"/>
+              </w:rPr>
+              <w:t xml:space="preserve"> </w:t>
+            </w:r>
+            <w:proofErr w:type="spellStart"/>
+            <w:r>
+              <w:rPr>
+                <w:bCs/>
+                <w:color w:val="0D0D0D" w:themeColor="text1" w:themeTint="F2"/>
+              </w:rPr>
+              <w:t>ثلاثة</w:t>
+            </w:r>
+            <w:proofErr w:type="spellEnd"/>
+            <w:r>
+              <w:rPr>
+                <w:bCs/>
+                <w:color w:val="0D0D0D" w:themeColor="text1" w:themeTint="F2"/>
+              </w:rPr>
+              <w:t xml:space="preserve"> </w:t>
+            </w:r>
+            <w:proofErr w:type="spellStart"/>
+            <w:r>
+              <w:rPr>
+                <w:bCs/>
+                <w:color w:val="0D0D0D" w:themeColor="text1" w:themeTint="F2"/>
+              </w:rPr>
+              <w:t>أشهر</w:t>
+            </w:r>
+            <w:proofErr w:type="spellEnd"/>
+            <w:r>
+              <w:rPr>
+                <w:bCs/>
+                <w:color w:val="0D0D0D" w:themeColor="text1" w:themeTint="F2"/>
+              </w:rPr>
+              <w:t xml:space="preserve"> </w:t>
+            </w:r>
+            <w:proofErr w:type="spellStart"/>
+            <w:r>
+              <w:rPr>
+                <w:bCs/>
+                <w:color w:val="0D0D0D" w:themeColor="text1" w:themeTint="F2"/>
+              </w:rPr>
+              <w:t>من</w:t>
+            </w:r>
+            <w:proofErr w:type="spellEnd"/>
+            <w:r>
+              <w:rPr>
+                <w:bCs/>
+                <w:color w:val="0D0D0D" w:themeColor="text1" w:themeTint="F2"/>
+              </w:rPr>
+              <w:t xml:space="preserve"> </w:t>
+            </w:r>
+            <w:proofErr w:type="spellStart"/>
+            <w:r>
+              <w:rPr>
+                <w:bCs/>
+                <w:color w:val="0D0D0D" w:themeColor="text1" w:themeTint="F2"/>
+              </w:rPr>
+              <w:t>تاريخ</w:t>
+            </w:r>
+            <w:proofErr w:type="spellEnd"/>
+            <w:r>
+              <w:rPr>
+                <w:bCs/>
+                <w:color w:val="0D0D0D" w:themeColor="text1" w:themeTint="F2"/>
+              </w:rPr>
+              <w:t xml:space="preserve"> </w:t>
+            </w:r>
+            <w:proofErr w:type="spellStart"/>
+            <w:r>
+              <w:rPr>
+                <w:bCs/>
+                <w:color w:val="0D0D0D" w:themeColor="text1" w:themeTint="F2"/>
+              </w:rPr>
+              <w:t>انتهاء</w:t>
+            </w:r>
+            <w:proofErr w:type="spellEnd"/>
+            <w:r>
+              <w:rPr>
+                <w:bCs/>
+                <w:color w:val="0D0D0D" w:themeColor="text1" w:themeTint="F2"/>
+              </w:rPr>
+              <w:t xml:space="preserve"> </w:t>
+            </w:r>
+            <w:proofErr w:type="spellStart"/>
+            <w:r>
+              <w:rPr>
+                <w:bCs/>
+                <w:color w:val="0D0D0D" w:themeColor="text1" w:themeTint="F2"/>
+              </w:rPr>
+              <w:t>عقد</w:t>
+            </w:r>
+            <w:proofErr w:type="spellEnd"/>
+            <w:r>
+              <w:rPr>
+                <w:bCs/>
+                <w:color w:val="0D0D0D" w:themeColor="text1" w:themeTint="F2"/>
+              </w:rPr>
+              <w:t xml:space="preserve"> </w:t>
+            </w:r>
+            <w:proofErr w:type="spellStart"/>
+            <w:r>
+              <w:rPr>
+                <w:bCs/>
+                <w:color w:val="0D0D0D" w:themeColor="text1" w:themeTint="F2"/>
+              </w:rPr>
+              <w:t>الإيجار</w:t>
+            </w:r>
+            <w:proofErr w:type="spellEnd"/>
+            <w:r>
+              <w:rPr>
+                <w:bCs/>
+                <w:color w:val="0D0D0D" w:themeColor="text1" w:themeTint="F2"/>
+              </w:rPr>
+              <w:t xml:space="preserve"> </w:t>
+            </w:r>
+            <w:proofErr w:type="spellStart"/>
+            <w:r>
+              <w:rPr>
+                <w:bCs/>
+                <w:color w:val="0D0D0D" w:themeColor="text1" w:themeTint="F2"/>
+              </w:rPr>
+              <w:t>القائم</w:t>
+            </w:r>
+            <w:proofErr w:type="spellEnd"/>
+            <w:r>
+              <w:rPr>
+                <w:bCs/>
+                <w:color w:val="0D0D0D" w:themeColor="text1" w:themeTint="F2"/>
+              </w:rPr>
+              <w:t xml:space="preserve"> و </w:t>
+            </w:r>
+            <w:proofErr w:type="spellStart"/>
+            <w:r>
+              <w:rPr>
+                <w:bCs/>
+                <w:color w:val="0D0D0D" w:themeColor="text1" w:themeTint="F2"/>
+              </w:rPr>
+              <w:t>الا</w:t>
+            </w:r>
+            <w:proofErr w:type="spellEnd"/>
+            <w:r>
+              <w:rPr>
+                <w:bCs/>
+                <w:color w:val="0D0D0D" w:themeColor="text1" w:themeTint="F2"/>
+              </w:rPr>
+              <w:t xml:space="preserve"> </w:t>
+            </w:r>
+            <w:proofErr w:type="spellStart"/>
+            <w:r>
+              <w:rPr>
+                <w:bCs/>
+                <w:color w:val="0D0D0D" w:themeColor="text1" w:themeTint="F2"/>
+              </w:rPr>
+              <w:t>اعتبر</w:t>
+            </w:r>
+            <w:proofErr w:type="spellEnd"/>
+            <w:r>
+              <w:rPr>
+                <w:bCs/>
+                <w:color w:val="0D0D0D" w:themeColor="text1" w:themeTint="F2"/>
+              </w:rPr>
+              <w:t xml:space="preserve"> </w:t>
+            </w:r>
+            <w:proofErr w:type="spellStart"/>
+            <w:r>
+              <w:rPr>
+                <w:bCs/>
+                <w:color w:val="0D0D0D" w:themeColor="text1" w:themeTint="F2"/>
+              </w:rPr>
+              <w:t>كأن</w:t>
+            </w:r>
+            <w:proofErr w:type="spellEnd"/>
+            <w:r>
+              <w:rPr>
+                <w:bCs/>
+                <w:color w:val="0D0D0D" w:themeColor="text1" w:themeTint="F2"/>
+              </w:rPr>
+              <w:t xml:space="preserve"> </w:t>
+            </w:r>
+            <w:proofErr w:type="spellStart"/>
+            <w:r>
+              <w:rPr>
+                <w:bCs/>
+                <w:color w:val="0D0D0D" w:themeColor="text1" w:themeTint="F2"/>
+              </w:rPr>
+              <w:t>لم</w:t>
+            </w:r>
+            <w:proofErr w:type="spellEnd"/>
+            <w:r>
+              <w:rPr>
+                <w:bCs/>
+                <w:color w:val="0D0D0D" w:themeColor="text1" w:themeTint="F2"/>
+              </w:rPr>
+              <w:t xml:space="preserve"> </w:t>
+            </w:r>
+            <w:proofErr w:type="spellStart"/>
+            <w:r>
+              <w:rPr>
+                <w:bCs/>
+                <w:color w:val="0D0D0D" w:themeColor="text1" w:themeTint="F2"/>
+              </w:rPr>
+              <w:t>يكن</w:t>
+            </w:r>
+            <w:proofErr w:type="spellEnd"/>
+            <w:r>
+              <w:rPr>
+                <w:bCs/>
+                <w:color w:val="0D0D0D" w:themeColor="text1" w:themeTint="F2"/>
+              </w:rPr>
+              <w:t>.⑥</w:t>
             </w:r>
           </w:p>
           <w:p>
@@ -5948,7 +9207,7 @@
               </wp:inline>
             </w:drawing>
           </mc:Choice>
-          <mc:Fallback>
+          <mc:Fallback xmlns:a="http://schemas.openxmlformats.org/drawingml/2006/main" xmlns:pic="http://schemas.openxmlformats.org/drawingml/2006/picture">
             <w:pict>
               <v:group id="Group 549723481" style="width:559.2pt;height:295.8pt;mso-position-horizontal-relative:char;mso-position-vertical-relative:line" coordsize="66662,43078" o:spid="_x0000_s1026" o:gfxdata="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" w14:anchorId="795C753E">
                 <v:shapetype id="_x0000_t75" coordsize="21600,21600" filled="f" stroked="f" o:spt="75" o:preferrelative="t" path="m@4@5l@4@11@9@11@9@5xe">
@@ -6861,7 +10120,7 @@
         <w:behaviors>
           <w:behavior w:val="content"/>
         </w:behaviors>
-        <w:guid w:val="{83B01FCA-2116-4379-B885-CF6C240E764B}"/>
+        <w:guid w:val="{168FE960-C53D-4032-AC68-A88B811C5F13}"/>
       </w:docPartPr>
       <w:docPartBody>
         <w:p>
@@ -6939,10 +10198,15 @@
     <w:compatSetting w:name="useWord2013TrackBottomHyphenation" w:uri="http://schemas.microsoft.com/office/word" w:val="0"/>
   </w:compat>
   <w:rsids>
-    <w:rsidRoot w:val="00600C10"/>
-    <w:rsid w:val="00600C10"/>
-    <w:rsid w:val="00817705"/>
-    <w:rsid w:val="00D63EB7"/>
+    <w:rsidRoot w:val="002A1D64"/>
+    <w:rsid w:val="002A1D64"/>
+    <w:rsid w:val="0030031A"/>
+    <w:rsid w:val="00546FED"/>
+    <w:rsid w:val="00837859"/>
+    <w:rsid w:val="00884DD9"/>
+    <w:rsid w:val="009107B9"/>
+    <w:rsid w:val="00C16924"/>
+    <w:rsid w:val="00F225CD"/>
   </w:rsids>
   <m:mathPr>
     <m:mathFont m:val="Cambria Math"/>
@@ -7398,7 +10662,7 @@
     <w:basedOn w:val="DefaultParagraphFont"/>
     <w:uiPriority w:val="99"/>
     <w:semiHidden/>
-    <w:rsid w:val="00600C10"/>
+    <w:rsid w:val="002A1D64"/>
     <w:rPr>
       <w:color w:val="666666"/>
     </w:rPr>
@@ -7716,7 +10980,7 @@
  
      < T e n a n c y C o n t r a c t >   
-         < B a s e _ U n i t _ o f _ M e a s u r e > B a s e _ U n i t _ o f _ M e a s u r e < / B a s e _ U n i t _ o f _ M e a s u r e > +         < B _ U _ o _ M > B _ U _ o _ M < / B _ U _ o _ M >   
          < C o n t a c t _ N u m b e r > C o n t a c t _ N u m b e r < / C o n t a c t _ N u m b e r >   
@@ -7724,11 +10988,15 @@
  
          < C o n t r a c t _ S t a r t _ D a t e > C o n t r a c t _ S t a r t _ D a t e < / C o n t r a c t _ S t a r t _ D a t e >   
+         < C o n t r a c t _ T e n o r > C o n t r a c t _ T e n o r < / C o n t r a c t _ T e n o r > + 
          < C u s t o m e r _ N a m e > C u s t o m e r _ N a m e < / C u s t o m e r _ N a m e >   
          < E m a i l _ A d d r e s s > E m a i l _ A d d r e s s < / E m a i l _ A d d r e s s >   
          < E m i r a t e s _ I D > E m i r a t e s _ I D < / E m i r a t e s _ I D > + 
+         < L e s s o r _ s _ A d d r e s s > L e s s o r _ s _ A d d r e s s < / L e s s o r _ s _ A d d r e s s >   
          < L e s s o r _ s _ E m a i l > L e s s o r _ s _ E m a i l < / L e s s o r _ s _ E m a i l >   
@@ -7736,9 +11004,13 @@
  
          < L e s s o r _ s _ N a m e > L e s s o r _ s _ N a m e < / L e s s o r _ s _ N a m e >   
+         < L e s s o r _ s _ N a t i o n a l i t y > L e s s o r _ s _ N a t i o n a l i t y < / L e s s o r _ s _ N a t i o n a l i t y > + 
          < L e s s o r _ s _ P h o n e > L e s s o r _ s _ P h o n e < / L e s s o r _ s _ P h o n e >   
          < O w n e r _ s _ N a m e > O w n e r _ s _ N a m e < / O w n e r _ s _ N a m e > + 
+         < P r o p e r t y _ C l a s s i f i c a t i o n > P r o p e r t y _ C l a s s i f i c a t i o n < / P r o p e r t y _ C l a s s i f i c a t i o n >   
          < P r o p e r t y _ N a m e > P r o p e r t y _ N a m e < / P r o p e r t y _ N a m e >   
@@ -7746,9 +11018,29 @@
  
          < P r o p e r t y _ T y p e > P r o p e r t y _ T y p e < / P r o p e r t y _ T y p e >   
+         < R e n t _ A m o u n t > R e n t _ A m o u n t < / R e n t _ A m o u n t > + 
          < U n i t _ N a m e > U n i t _ N a m e < / U n i t _ N a m e >   
          < U n i t _ N u m b e r > U n i t _ N u m b e r < / U n i t _ N u m b e r > + 
+         < C u s t o m e r > + 
+             < N a t i o n a l i t y > N a t i o n a l i t y < / N a t i o n a l i t y > + 
+         < / C u s t o m e r > + 
+         < I t e m > + 
+             < F l o o r _ N u m b e r > F l o o r _ N u m b e r < / F l o o r _ N u m b e r > + 
+         < / I t e m > + 
+         < P r o p e r t y _ R e g i s t r a t i o n > + 
+             < A d d r e s s > A d d r e s s < / A d d r e s s > + 
+         < / P r o p e r t y _ R e g i s t r a t i o n >   
      < / T e n a n c y C o n t r a c t >   

</xml_diff>

<commit_message>
Created ew reports and added some changes in files
</commit_message>
<xml_diff>
--- a/UmmAlQuwainContract.docx
+++ b/UmmAlQuwainContract.docx
@@ -2324,7 +2324,11 @@
             </w:tcBorders>
             <w:shd w:val="clear" w:color="auto" w:fill="BCDDF6"/>
           </w:tcPr>
-          <w:p/>
+          <w:p>
+            <w:r>
+              <w:t>-</w:t>
+            </w:r>
+          </w:p>
         </w:tc>
         <w:tc>
           <w:tcPr>
@@ -2417,14 +2421,14 @@
             </w:r>
             <w:sdt>
               <w:sdtPr>
+                <w:alias w:val="#Nav: /TenancyContract/B_U_o_M"/>
+                <w:tag w:val="#Nav: UmmAlQuwainContract/50115"/>
                 <w:id w:val="1168525753"/>
                 <w:placeholder>
                   <w:docPart w:val="DefaultPlaceholder_-1854013440"/>
                 </w:placeholder>
                 <w:dataBinding w:prefixMappings="xmlns:ns0='urn:microsoft-dynamics-nav/reports/UmmAlQuwainContract/50115/'" w:xpath="/ns0:NavWordReportXmlPart[1]/ns0:TenancyContract[1]/ns0:B_U_o_M[1]" w:storeItemID="{DA66A6BB-3798-4A63-88A2-FBA3BC09A85B}"/>
                 <w:text/>
-                <w:alias w:val="#Nav: /TenancyContract/B_U_o_M"/>
-                <w:tag w:val="#Nav: UmmAlQuwainContract/50115"/>
               </w:sdtPr>
               <w:sdtContent>
                 <w:proofErr w:type="spellStart"/>
@@ -2626,20 +2630,38 @@
             </w:r>
           </w:p>
         </w:tc>
-        <w:tc>
-          <w:tcPr>
-            <w:tcW w:w="3686" w:type="dxa"/>
-            <w:gridSpan w:val="2"/>
-            <w:tcBorders>
-              <w:top w:val="single" w:color="FFFFFF" w:themeColor="background1" w:sz="24" w:space="0"/>
-              <w:left w:val="single" w:color="FFFFFF" w:themeColor="background1" w:sz="24" w:space="0"/>
-              <w:bottom w:val="single" w:color="FFFFFF" w:themeColor="background1" w:sz="24" w:space="0"/>
-              <w:right w:val="single" w:color="FFFFFF" w:themeColor="background1" w:sz="24" w:space="0"/>
-            </w:tcBorders>
-            <w:shd w:val="clear" w:color="auto" w:fill="BCDDF6"/>
-          </w:tcPr>
-          <w:p/>
-        </w:tc>
+        <w:sdt>
+          <w:sdtPr>
+            <w:id w:val="1027682472"/>
+            <w:placeholder>
+              <w:docPart w:val="DefaultPlaceholder_-1854013440"/>
+            </w:placeholder>
+            <w:dataBinding w:prefixMappings="xmlns:ns0='urn:microsoft-dynamics-nav/reports/UmmAlQuwainContract/50115/'" w:xpath="/ns0:NavWordReportXmlPart[1]/ns0:TenancyContract[1]/ns0:Community[1]" w:storeItemID="{DA66A6BB-3798-4A63-88A2-FBA3BC09A85B}"/>
+            <w:text/>
+            <w:alias w:val="#Nav: /TenancyContract/Community"/>
+            <w:tag w:val="#Nav: UmmAlQuwainContract/50115"/>
+          </w:sdtPr>
+          <w:sdtContent>
+            <w:tc>
+              <w:tcPr>
+                <w:tcW w:w="3686" w:type="dxa"/>
+                <w:gridSpan w:val="2"/>
+                <w:tcBorders>
+                  <w:top w:val="single" w:color="FFFFFF" w:themeColor="background1" w:sz="24" w:space="0"/>
+                  <w:left w:val="single" w:color="FFFFFF" w:themeColor="background1" w:sz="24" w:space="0"/>
+                  <w:bottom w:val="single" w:color="FFFFFF" w:themeColor="background1" w:sz="24" w:space="0"/>
+                  <w:right w:val="single" w:color="FFFFFF" w:themeColor="background1" w:sz="24" w:space="0"/>
+                </w:tcBorders>
+                <w:shd w:val="clear" w:color="auto" w:fill="BCDDF6"/>
+              </w:tcPr>
+              <w:p>
+                <w:r>
+                  <w:t>Community</w:t>
+                </w:r>
+              </w:p>
+            </w:tc>
+          </w:sdtContent>
+        </w:sdt>
         <w:tc>
           <w:tcPr>
             <w:tcW w:w="1417" w:type="dxa"/>
@@ -2798,20 +2820,40 @@
             <w:proofErr w:type="spellEnd"/>
           </w:p>
         </w:tc>
-        <w:tc>
-          <w:tcPr>
-            <w:tcW w:w="3686" w:type="dxa"/>
-            <w:gridSpan w:val="2"/>
-            <w:tcBorders>
-              <w:top w:val="single" w:color="FFFFFF" w:themeColor="background1" w:sz="24" w:space="0"/>
-              <w:left w:val="single" w:color="FFFFFF" w:themeColor="background1" w:sz="24" w:space="0"/>
-              <w:bottom w:val="single" w:color="FFFFFF" w:themeColor="background1" w:sz="24" w:space="0"/>
-              <w:right w:val="single" w:color="FFFFFF" w:themeColor="background1" w:sz="24" w:space="0"/>
-            </w:tcBorders>
-            <w:shd w:val="clear" w:color="auto" w:fill="BCDDF6"/>
-          </w:tcPr>
-          <w:p/>
-        </w:tc>
+        <w:sdt>
+          <w:sdtPr>
+            <w:id w:val="1438336730"/>
+            <w:placeholder>
+              <w:docPart w:val="DefaultPlaceholder_-1854013440"/>
+            </w:placeholder>
+            <w:dataBinding w:prefixMappings="xmlns:ns0='urn:microsoft-dynamics-nav/reports/UmmAlQuwainContract/50115/'" w:xpath="/ns0:NavWordReportXmlPart[1]/ns0:TenancyContract[1]/ns0:DEWA_Number[1]" w:storeItemID="{DA66A6BB-3798-4A63-88A2-FBA3BC09A85B}"/>
+            <w:text/>
+            <w:alias w:val="#Nav: /TenancyContract/DEWA_Number"/>
+            <w:tag w:val="#Nav: UmmAlQuwainContract/50115"/>
+          </w:sdtPr>
+          <w:sdtContent>
+            <w:tc>
+              <w:tcPr>
+                <w:tcW w:w="3686" w:type="dxa"/>
+                <w:gridSpan w:val="2"/>
+                <w:tcBorders>
+                  <w:top w:val="single" w:color="FFFFFF" w:themeColor="background1" w:sz="24" w:space="0"/>
+                  <w:left w:val="single" w:color="FFFFFF" w:themeColor="background1" w:sz="24" w:space="0"/>
+                  <w:bottom w:val="single" w:color="FFFFFF" w:themeColor="background1" w:sz="24" w:space="0"/>
+                  <w:right w:val="single" w:color="FFFFFF" w:themeColor="background1" w:sz="24" w:space="0"/>
+                </w:tcBorders>
+                <w:shd w:val="clear" w:color="auto" w:fill="BCDDF6"/>
+              </w:tcPr>
+              <w:p>
+                <w:proofErr w:type="spellStart"/>
+                <w:r>
+                  <w:t>DEWA_Number</w:t>
+                </w:r>
+                <w:proofErr w:type="spellEnd"/>
+              </w:p>
+            </w:tc>
+          </w:sdtContent>
+        </w:sdt>
         <w:tc>
           <w:tcPr>
             <w:tcW w:w="1417" w:type="dxa"/>
@@ -3505,7 +3547,7 @@
               </wp:anchor>
             </w:drawing>
           </mc:Choice>
-          <mc:Fallback xmlns:a="http://schemas.openxmlformats.org/drawingml/2006/main" xmlns:pic="http://schemas.openxmlformats.org/drawingml/2006/picture">
+          <mc:Fallback xmlns:pic="http://schemas.openxmlformats.org/drawingml/2006/picture" xmlns:a="http://schemas.openxmlformats.org/drawingml/2006/main">
             <w:pict>
               <v:line id="Straight Connector 15" style="position:absolute;z-index:251666432;visibility:visible;mso-wrap-style:square;mso-wrap-distance-left:9pt;mso-wrap-distance-top:0;mso-wrap-distance-right:9pt;mso-wrap-distance-bottom:0;mso-position-horizontal:absolute;mso-position-horizontal-relative:text;mso-position-vertical:absolute;mso-position-vertical-relative:text" o:spid="_x0000_s1026" strokecolor="#4472c4 [3204]" strokeweight=".5pt" o:gfxdata="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" from="0,19.1pt" to="612.5pt,19.6pt" w14:anchorId="7D73463F">
                 <v:stroke joinstyle="miter"/>
@@ -4583,7 +4625,7 @@
               </wp:anchor>
             </w:drawing>
           </mc:Choice>
-          <mc:Fallback xmlns:a="http://schemas.openxmlformats.org/drawingml/2006/main" xmlns:pic="http://schemas.openxmlformats.org/drawingml/2006/picture">
+          <mc:Fallback xmlns:pic="http://schemas.openxmlformats.org/drawingml/2006/picture" xmlns:a="http://schemas.openxmlformats.org/drawingml/2006/main">
             <w:pict>
               <v:line id="Straight Connector 74946966" style="position:absolute;z-index:251667456;visibility:visible;mso-wrap-style:square;mso-wrap-distance-left:9pt;mso-wrap-distance-top:0;mso-wrap-distance-right:9pt;mso-wrap-distance-bottom:0;mso-position-horizontal:absolute;mso-position-horizontal-relative:text;mso-position-vertical:absolute;mso-position-vertical-relative:text" o:spid="_x0000_s1026" strokecolor="#4472c4 [3204]" strokeweight=".5pt" o:gfxdata="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" from="0,171.7pt" to="612.5pt,172.2pt" w14:anchorId="51C7FC15">
                 <v:stroke joinstyle="miter"/>
@@ -5152,7 +5194,7 @@
                     </wp:anchor>
                   </w:drawing>
                 </mc:Choice>
-                <mc:Fallback xmlns:a="http://schemas.openxmlformats.org/drawingml/2006/main" xmlns:pic="http://schemas.openxmlformats.org/drawingml/2006/picture">
+                <mc:Fallback xmlns:pic="http://schemas.openxmlformats.org/drawingml/2006/picture" xmlns:a="http://schemas.openxmlformats.org/drawingml/2006/main">
                   <w:pict>
                     <v:line id="Straight Connector 410425054" style="position:absolute;z-index:251668480;visibility:visible;mso-wrap-style:square;mso-wrap-distance-left:9pt;mso-wrap-distance-top:0;mso-wrap-distance-right:9pt;mso-wrap-distance-bottom:0;mso-position-horizontal:absolute;mso-position-horizontal-relative:text;mso-position-vertical:absolute;mso-position-vertical-relative:text" o:spid="_x0000_s1026" strokecolor="#4472c4 [3204]" strokeweight=".5pt" o:gfxdata="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" from="-8.75pt,30.95pt" to="603.75pt,31.45pt" w14:anchorId="543231CE">
                       <v:stroke joinstyle="miter"/>
@@ -9207,7 +9249,7 @@
               </wp:inline>
             </w:drawing>
           </mc:Choice>
-          <mc:Fallback xmlns:a="http://schemas.openxmlformats.org/drawingml/2006/main" xmlns:pic="http://schemas.openxmlformats.org/drawingml/2006/picture">
+          <mc:Fallback xmlns:pic="http://schemas.openxmlformats.org/drawingml/2006/picture" xmlns:a="http://schemas.openxmlformats.org/drawingml/2006/main">
             <w:pict>
               <v:group id="Group 549723481" style="width:559.2pt;height:295.8pt;mso-position-horizontal-relative:char;mso-position-vertical-relative:line" coordsize="66662,43078" o:spid="_x0000_s1026" o:gfxdata="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" w14:anchorId="795C753E">
                 <v:shapetype id="_x0000_t75" coordsize="21600,21600" filled="f" stroked="f" o:spt="75" o:preferrelative="t" path="m@4@5l@4@11@9@11@9@5xe">
@@ -10206,7 +10248,9 @@
     <w:rsid w:val="00884DD9"/>
     <w:rsid w:val="009107B9"/>
     <w:rsid w:val="00C16924"/>
+    <w:rsid w:val="00D5133B"/>
     <w:rsid w:val="00F225CD"/>
+    <w:rsid w:val="00F23C00"/>
   </w:rsids>
   <m:mathPr>
     <m:mathFont m:val="Cambria Math"/>
@@ -10972,15 +11016,13 @@
 </a:theme>
 </file>
 
-<file path=customXml/item1.xml><?xml version="1.0" encoding="utf-8"?>
-<b:Sources xmlns:b="http://schemas.openxmlformats.org/officeDocument/2006/bibliography" xmlns="http://schemas.openxmlformats.org/officeDocument/2006/bibliography" SelectedStyle="\APASixthEditionOfficeOnline.xsl" StyleName="APA" Version="6"/>
-</file>
-
-<file path=customXml/item2.xml>��< ? x m l   v e r s i o n = " 1 . 0 "   e n c o d i n g = " u t f - 1 6 " ? > < N a v W o r d R e p o r t X m l P a r t   x m l n s = " u r n : m i c r o s o f t - d y n a m i c s - n a v / r e p o r t s / U m m A l Q u w a i n C o n t r a c t / 5 0 1 1 5 / " > +<file path=customXml/item1.xml>��< ? x m l   v e r s i o n = " 1 . 0 "   e n c o d i n g = " u t f - 1 6 " ? > < N a v W o r d R e p o r t X m l P a r t   x m l n s = " u r n : m i c r o s o f t - d y n a m i c s - n a v / r e p o r t s / U m m A l Q u w a i n C o n t r a c t / 5 0 1 1 5 / " >   
      < T e n a n c y C o n t r a c t >   
          < B _ U _ o _ M > B _ U _ o _ M < / B _ U _ o _ M > + 
+         < C o m m u n i t y > C o m m u n i t y < / C o m m u n i t y >   
          < C o n t a c t _ N u m b e r > C o n t a c t _ N u m b e r < / C o n t a c t _ N u m b e r >   
@@ -10991,6 +11033,8 @@
          < C o n t r a c t _ T e n o r > C o n t r a c t _ T e n o r < / C o n t r a c t _ T e n o r >   
          < C u s t o m e r _ N a m e > C u s t o m e r _ N a m e < / C u s t o m e r _ N a m e > + 
+         < D E W A _ N u m b e r > D E W A _ N u m b e r < / D E W A _ N u m b e r >   
          < E m a i l _ A d d r e s s > E m a i l _ A d d r e s s < / E m a i l _ A d d r e s s >   
@@ -11047,18 +11091,22 @@
  < / N a v W o r d R e p o r t X m l P a r t > 
 </file>
 
+<file path=customXml/item2.xml><?xml version="1.0" encoding="utf-8"?>
+<b:Sources xmlns:b="http://schemas.openxmlformats.org/officeDocument/2006/bibliography" xmlns="http://schemas.openxmlformats.org/officeDocument/2006/bibliography" SelectedStyle="\APASixthEditionOfficeOnline.xsl" StyleName="APA" Version="6"/>
+</file>
+
 <file path=customXml/itemProps1.xml><?xml version="1.0" encoding="utf-8"?>
+<ds:datastoreItem xmlns:ds="http://schemas.openxmlformats.org/officeDocument/2006/customXml" ds:itemID="{DA66A6BB-3798-4A63-88A2-FBA3BC09A85B}">
+  <ds:schemaRefs>
+    <ds:schemaRef ds:uri="urn:microsoft-dynamics-nav/reports/UmmAlQuwainContract/50115/"/>
+  </ds:schemaRefs>
+</ds:datastoreItem>
+</file>
+
+<file path=customXml/itemProps2.xml><?xml version="1.0" encoding="utf-8"?>
 <ds:datastoreItem xmlns:ds="http://schemas.openxmlformats.org/officeDocument/2006/customXml" ds:itemID="{C27AA06E-7140-4450-8686-34675E73F112}">
   <ds:schemaRefs>
     <ds:schemaRef ds:uri="http://schemas.openxmlformats.org/officeDocument/2006/bibliography"/>
   </ds:schemaRefs>
 </ds:datastoreItem>
-</file>
-
-<file path=customXml/itemProps2.xml><?xml version="1.0" encoding="utf-8"?>
-<ds:datastoreItem xmlns:ds="http://schemas.openxmlformats.org/officeDocument/2006/customXml" ds:itemID="{DA66A6BB-3798-4A63-88A2-FBA3BC09A85B}">
-  <ds:schemaRefs>
-    <ds:schemaRef ds:uri="urn:microsoft-dynamics-nav/reports/UmmAlQuwainContract/50115/"/>
-  </ds:schemaRefs>
-</ds:datastoreItem>
 </file>
</xml_diff>